<commit_message>
docs: rewrite the report in plainer Czech and document the new tap
The Czech text carried a dozen near-identical disclaimers and uniform
four-sentence paragraphs, both of which read as machine writing. Scope is
now stated once in the introduction and the prose varies in rhythm.

The simulation chapter covers the two output taps, the measured audible
difference and the live response measurement, with the measurement plot
added as a second figure. The report is 14 pages of body text with 19
numbered sources.

Co-Authored-By: Claude Opus 5 (1M context) <noreply@anthropic.com>
</commit_message>
<xml_diff>
--- a/docs/Zapoctovy_projekt_RC_obvody_v_hudbe.docx
+++ b/docs/Zapoctovy_projekt_RC_obvody_v_hudbe.docx
@@ -691,7 +691,7 @@
       <w:r>
         <w:fldChar w:fldCharType="separate"/>
       </w:r>
-      <w:hyperlink w:anchor="_Toc240101256" w:history="1">
+      <w:hyperlink w:anchor="_Toc240119871" w:history="1">
         <w:r>
           <w:rPr>
             <w:rStyle w:val="Hyperlink"/>
@@ -718,7 +718,7 @@
             <w:noProof/>
             <w:webHidden/>
           </w:rPr>
-          <w:instrText xml:space="preserve"> PAGEREF _Toc240101256 \h </w:instrText>
+          <w:instrText xml:space="preserve"> PAGEREF _Toc240119871 \h </w:instrText>
         </w:r>
         <w:r>
           <w:rPr>
@@ -763,7 +763,7 @@
           <w:lang w:eastAsia="cs-CZ"/>
         </w:rPr>
       </w:pPr>
-      <w:hyperlink w:anchor="_Toc240101257" w:history="1">
+      <w:hyperlink w:anchor="_Toc240119872" w:history="1">
         <w:r>
           <w:rPr>
             <w:rStyle w:val="Hyperlink"/>
@@ -807,7 +807,7 @@
             <w:noProof/>
             <w:webHidden/>
           </w:rPr>
-          <w:instrText xml:space="preserve"> PAGEREF _Toc240101257 \h </w:instrText>
+          <w:instrText xml:space="preserve"> PAGEREF _Toc240119872 \h </w:instrText>
         </w:r>
         <w:r>
           <w:rPr>
@@ -852,7 +852,7 @@
           <w:lang w:eastAsia="cs-CZ"/>
         </w:rPr>
       </w:pPr>
-      <w:hyperlink w:anchor="_Toc240101258" w:history="1">
+      <w:hyperlink w:anchor="_Toc240119873" w:history="1">
         <w:r>
           <w:rPr>
             <w:rStyle w:val="Hyperlink"/>
@@ -896,7 +896,7 @@
             <w:noProof/>
             <w:webHidden/>
           </w:rPr>
-          <w:instrText xml:space="preserve"> PAGEREF _Toc240101258 \h </w:instrText>
+          <w:instrText xml:space="preserve"> PAGEREF _Toc240119873 \h </w:instrText>
         </w:r>
         <w:r>
           <w:rPr>
@@ -941,7 +941,7 @@
           <w:lang w:eastAsia="cs-CZ"/>
         </w:rPr>
       </w:pPr>
-      <w:hyperlink w:anchor="_Toc240101259" w:history="1">
+      <w:hyperlink w:anchor="_Toc240119874" w:history="1">
         <w:r>
           <w:rPr>
             <w:rStyle w:val="Hyperlink"/>
@@ -985,7 +985,7 @@
             <w:noProof/>
             <w:webHidden/>
           </w:rPr>
-          <w:instrText xml:space="preserve"> PAGEREF _Toc240101259 \h </w:instrText>
+          <w:instrText xml:space="preserve"> PAGEREF _Toc240119874 \h </w:instrText>
         </w:r>
         <w:r>
           <w:rPr>
@@ -1030,7 +1030,7 @@
           <w:lang w:eastAsia="cs-CZ"/>
         </w:rPr>
       </w:pPr>
-      <w:hyperlink w:anchor="_Toc240101260" w:history="1">
+      <w:hyperlink w:anchor="_Toc240119875" w:history="1">
         <w:r>
           <w:rPr>
             <w:rStyle w:val="Hyperlink"/>
@@ -1074,7 +1074,7 @@
             <w:noProof/>
             <w:webHidden/>
           </w:rPr>
-          <w:instrText xml:space="preserve"> PAGEREF _Toc240101260 \h </w:instrText>
+          <w:instrText xml:space="preserve"> PAGEREF _Toc240119875 \h </w:instrText>
         </w:r>
         <w:r>
           <w:rPr>
@@ -1119,7 +1119,7 @@
           <w:lang w:eastAsia="cs-CZ"/>
         </w:rPr>
       </w:pPr>
-      <w:hyperlink w:anchor="_Toc240101261" w:history="1">
+      <w:hyperlink w:anchor="_Toc240119876" w:history="1">
         <w:r>
           <w:rPr>
             <w:rStyle w:val="Hyperlink"/>
@@ -1142,7 +1142,7 @@
             <w:rStyle w:val="Hyperlink"/>
             <w:noProof/>
           </w:rPr>
-          <w:t>Úkoly 1 a 2 Napětí na rezistoru a kondenzátoru</w:t>
+          <w:t>Úkoly 1 a 2: napětí na rezistoru a kondenzátoru</w:t>
         </w:r>
         <w:r>
           <w:rPr>
@@ -1163,7 +1163,7 @@
             <w:noProof/>
             <w:webHidden/>
           </w:rPr>
-          <w:instrText xml:space="preserve"> PAGEREF _Toc240101261 \h </w:instrText>
+          <w:instrText xml:space="preserve"> PAGEREF _Toc240119876 \h </w:instrText>
         </w:r>
         <w:r>
           <w:rPr>
@@ -1208,7 +1208,7 @@
           <w:lang w:eastAsia="cs-CZ"/>
         </w:rPr>
       </w:pPr>
-      <w:hyperlink w:anchor="_Toc240101262" w:history="1">
+      <w:hyperlink w:anchor="_Toc240119877" w:history="1">
         <w:r>
           <w:rPr>
             <w:rStyle w:val="Hyperlink"/>
@@ -1231,7 +1231,7 @@
             <w:rStyle w:val="Hyperlink"/>
             <w:noProof/>
           </w:rPr>
-          <w:t>Úkol 3 Energie přeměněná na teplo</w:t>
+          <w:t>Úkol 3: energie přeměněná na teplo</w:t>
         </w:r>
         <w:r>
           <w:rPr>
@@ -1252,7 +1252,7 @@
             <w:noProof/>
             <w:webHidden/>
           </w:rPr>
-          <w:instrText xml:space="preserve"> PAGEREF _Toc240101262 \h </w:instrText>
+          <w:instrText xml:space="preserve"> PAGEREF _Toc240119877 \h </w:instrText>
         </w:r>
         <w:r>
           <w:rPr>
@@ -1297,7 +1297,7 @@
           <w:lang w:eastAsia="cs-CZ"/>
         </w:rPr>
       </w:pPr>
-      <w:hyperlink w:anchor="_Toc240101263" w:history="1">
+      <w:hyperlink w:anchor="_Toc240119878" w:history="1">
         <w:r>
           <w:rPr>
             <w:rStyle w:val="Hyperlink"/>
@@ -1341,7 +1341,7 @@
             <w:noProof/>
             <w:webHidden/>
           </w:rPr>
-          <w:instrText xml:space="preserve"> PAGEREF _Toc240101263 \h </w:instrText>
+          <w:instrText xml:space="preserve"> PAGEREF _Toc240119878 \h </w:instrText>
         </w:r>
         <w:r>
           <w:rPr>
@@ -1386,7 +1386,7 @@
           <w:lang w:eastAsia="cs-CZ"/>
         </w:rPr>
       </w:pPr>
-      <w:hyperlink w:anchor="_Toc240101264" w:history="1">
+      <w:hyperlink w:anchor="_Toc240119879" w:history="1">
         <w:r>
           <w:rPr>
             <w:rStyle w:val="Hyperlink"/>
@@ -1430,7 +1430,7 @@
             <w:noProof/>
             <w:webHidden/>
           </w:rPr>
-          <w:instrText xml:space="preserve"> PAGEREF _Toc240101264 \h </w:instrText>
+          <w:instrText xml:space="preserve"> PAGEREF _Toc240119879 \h </w:instrText>
         </w:r>
         <w:r>
           <w:rPr>
@@ -1475,7 +1475,7 @@
           <w:lang w:eastAsia="cs-CZ"/>
         </w:rPr>
       </w:pPr>
-      <w:hyperlink w:anchor="_Toc240101265" w:history="1">
+      <w:hyperlink w:anchor="_Toc240119880" w:history="1">
         <w:r>
           <w:rPr>
             <w:rStyle w:val="Hyperlink"/>
@@ -1519,7 +1519,7 @@
             <w:noProof/>
             <w:webHidden/>
           </w:rPr>
-          <w:instrText xml:space="preserve"> PAGEREF _Toc240101265 \h </w:instrText>
+          <w:instrText xml:space="preserve"> PAGEREF _Toc240119880 \h </w:instrText>
         </w:r>
         <w:r>
           <w:rPr>
@@ -1564,7 +1564,7 @@
           <w:lang w:eastAsia="cs-CZ"/>
         </w:rPr>
       </w:pPr>
-      <w:hyperlink w:anchor="_Toc240101266" w:history="1">
+      <w:hyperlink w:anchor="_Toc240119881" w:history="1">
         <w:r>
           <w:rPr>
             <w:rStyle w:val="Hyperlink"/>
@@ -1608,7 +1608,7 @@
             <w:noProof/>
             <w:webHidden/>
           </w:rPr>
-          <w:instrText xml:space="preserve"> PAGEREF _Toc240101266 \h </w:instrText>
+          <w:instrText xml:space="preserve"> PAGEREF _Toc240119881 \h </w:instrText>
         </w:r>
         <w:r>
           <w:rPr>
@@ -1653,7 +1653,7 @@
           <w:lang w:eastAsia="cs-CZ"/>
         </w:rPr>
       </w:pPr>
-      <w:hyperlink w:anchor="_Toc240101267" w:history="1">
+      <w:hyperlink w:anchor="_Toc240119882" w:history="1">
         <w:r>
           <w:rPr>
             <w:rStyle w:val="Hyperlink"/>
@@ -1697,7 +1697,7 @@
             <w:noProof/>
             <w:webHidden/>
           </w:rPr>
-          <w:instrText xml:space="preserve"> PAGEREF _Toc240101267 \h </w:instrText>
+          <w:instrText xml:space="preserve"> PAGEREF _Toc240119882 \h </w:instrText>
         </w:r>
         <w:r>
           <w:rPr>
@@ -1739,7 +1739,7 @@
           <w:lang w:eastAsia="cs-CZ"/>
         </w:rPr>
       </w:pPr>
-      <w:hyperlink w:anchor="_Toc240101268" w:history="1">
+      <w:hyperlink w:anchor="_Toc240119883" w:history="1">
         <w:r>
           <w:rPr>
             <w:rStyle w:val="Hyperlink"/>
@@ -1766,76 +1766,7 @@
             <w:noProof/>
             <w:webHidden/>
           </w:rPr>
-          <w:instrText xml:space="preserve"> PAGEREF _Toc240101268 \h </w:instrText>
-        </w:r>
-        <w:r>
-          <w:rPr>
-            <w:noProof/>
-            <w:webHidden/>
-          </w:rPr>
-        </w:r>
-        <w:r>
-          <w:rPr>
-            <w:noProof/>
-            <w:webHidden/>
-          </w:rPr>
-          <w:fldChar w:fldCharType="separate"/>
-        </w:r>
-        <w:r>
-          <w:rPr>
-            <w:noProof/>
-            <w:webHidden/>
-          </w:rPr>
-          <w:t>15</w:t>
-        </w:r>
-        <w:r>
-          <w:rPr>
-            <w:noProof/>
-            <w:webHidden/>
-          </w:rPr>
-          <w:fldChar w:fldCharType="end"/>
-        </w:r>
-      </w:hyperlink>
-    </w:p>
-    <w:p>
-      <w:pPr>
-        <w:pStyle w:val="TOC1"/>
-        <w:rPr>
-          <w:rFonts w:asciiTheme="minorHAnsi" w:eastAsiaTheme="minorEastAsia" w:hAnsiTheme="minorHAnsi"/>
-          <w:b w:val="0"/>
-          <w:noProof/>
-          <w:szCs w:val="24"/>
-          <w:lang w:eastAsia="cs-CZ"/>
-        </w:rPr>
-      </w:pPr>
-      <w:hyperlink w:anchor="_Toc240101269" w:history="1">
-        <w:r>
-          <w:rPr>
-            <w:rStyle w:val="Hyperlink"/>
-            <w:noProof/>
-          </w:rPr>
-          <w:t>Použití nástrojů umělé inteligence</w:t>
-        </w:r>
-        <w:r>
-          <w:rPr>
-            <w:noProof/>
-            <w:webHidden/>
-          </w:rPr>
-          <w:tab/>
-        </w:r>
-        <w:r>
-          <w:rPr>
-            <w:noProof/>
-            <w:webHidden/>
-          </w:rPr>
-          <w:fldChar w:fldCharType="begin"/>
-        </w:r>
-        <w:r>
-          <w:rPr>
-            <w:noProof/>
-            <w:webHidden/>
-          </w:rPr>
-          <w:instrText xml:space="preserve"> PAGEREF _Toc240101269 \h </w:instrText>
+          <w:instrText xml:space="preserve"> PAGEREF _Toc240119883 \h </w:instrText>
         </w:r>
         <w:r>
           <w:rPr>
@@ -1877,13 +1808,13 @@
           <w:lang w:eastAsia="cs-CZ"/>
         </w:rPr>
       </w:pPr>
-      <w:hyperlink w:anchor="_Toc240101270" w:history="1">
+      <w:hyperlink w:anchor="_Toc240119884" w:history="1">
         <w:r>
           <w:rPr>
             <w:rStyle w:val="Hyperlink"/>
             <w:noProof/>
           </w:rPr>
-          <w:t>Seznam použité literatury</w:t>
+          <w:t>Použití nástrojů umělé inteligence</w:t>
         </w:r>
         <w:r>
           <w:rPr>
@@ -1904,7 +1835,7 @@
             <w:noProof/>
             <w:webHidden/>
           </w:rPr>
-          <w:instrText xml:space="preserve"> PAGEREF _Toc240101270 \h </w:instrText>
+          <w:instrText xml:space="preserve"> PAGEREF _Toc240119884 \h </w:instrText>
         </w:r>
         <w:r>
           <w:rPr>
@@ -1937,6 +1868,75 @@
     </w:p>
     <w:p>
       <w:pPr>
+        <w:pStyle w:val="TOC1"/>
+        <w:rPr>
+          <w:rFonts w:asciiTheme="minorHAnsi" w:eastAsiaTheme="minorEastAsia" w:hAnsiTheme="minorHAnsi"/>
+          <w:b w:val="0"/>
+          <w:noProof/>
+          <w:szCs w:val="24"/>
+          <w:lang w:eastAsia="cs-CZ"/>
+        </w:rPr>
+      </w:pPr>
+      <w:hyperlink w:anchor="_Toc240119885" w:history="1">
+        <w:r>
+          <w:rPr>
+            <w:rStyle w:val="Hyperlink"/>
+            <w:noProof/>
+          </w:rPr>
+          <w:t>Seznam použité literatury</w:t>
+        </w:r>
+        <w:r>
+          <w:rPr>
+            <w:noProof/>
+            <w:webHidden/>
+          </w:rPr>
+          <w:tab/>
+        </w:r>
+        <w:r>
+          <w:rPr>
+            <w:noProof/>
+            <w:webHidden/>
+          </w:rPr>
+          <w:fldChar w:fldCharType="begin"/>
+        </w:r>
+        <w:r>
+          <w:rPr>
+            <w:noProof/>
+            <w:webHidden/>
+          </w:rPr>
+          <w:instrText xml:space="preserve"> PAGEREF _Toc240119885 \h </w:instrText>
+        </w:r>
+        <w:r>
+          <w:rPr>
+            <w:noProof/>
+            <w:webHidden/>
+          </w:rPr>
+        </w:r>
+        <w:r>
+          <w:rPr>
+            <w:noProof/>
+            <w:webHidden/>
+          </w:rPr>
+          <w:fldChar w:fldCharType="separate"/>
+        </w:r>
+        <w:r>
+          <w:rPr>
+            <w:noProof/>
+            <w:webHidden/>
+          </w:rPr>
+          <w:t>18</w:t>
+        </w:r>
+        <w:r>
+          <w:rPr>
+            <w:noProof/>
+            <w:webHidden/>
+          </w:rPr>
+          <w:fldChar w:fldCharType="end"/>
+        </w:r>
+      </w:hyperlink>
+    </w:p>
+    <w:p>
+      <w:pPr>
         <w:pStyle w:val="Prvnodstavecprce"/>
       </w:pPr>
       <w:r>
@@ -1982,7 +1982,7 @@
       <w:pPr>
         <w:pStyle w:val="Nadpisyseznamy"/>
       </w:pPr>
-      <w:bookmarkStart w:id="0" w:name="_Toc240101256"/>
+      <w:bookmarkStart w:id="0" w:name="_Toc240119871"/>
       <w:r>
         <w:lastRenderedPageBreak/>
         <w:t>Úvod</w:t>
@@ -1994,7 +1994,7 @@
         <w:pStyle w:val="Prvnodstavecprce"/>
       </w:pPr>
       <w:r>
-        <w:t>Tento zápočtový projekt řeší nabíjení a vybíjení kondenzátoru v RC obvodu a jeho použití jako jednoduchého filtru. Vychází ze zadání projektu č. 8 v předmětu AK3EJ Elektromagnetické jevy v informatice. Povinná část zahrnuje vztahy pro napětí na rezistoru a kondenzátoru, napětí kondenzátoru v čase jedné časové konstanty a energii přeměněnou na teplo do stejného okamžiku. [1]</w:t>
+        <w:t>Tento zápočtový projekt řeší nabíjení a vybíjení kondenzátoru v RC obvodu a jeho použití jako jednoduchého filtru. Vychází ze zadání projektu č. 8 v předmětu AK3EJ Elektromagnetické jevy v informatice. Povinné jsou tři výsledky: vztahy pro napětí na rezistoru a kondenzátoru, napětí kondenzátoru v čase jedné časové konstanty a energie přeměněná na teplo do stejného okamžiku. [1]</w:t>
       </w:r>
     </w:p>
     <w:p>
@@ -2002,7 +2002,7 @@
         <w:pStyle w:val="Dalodstavceprce"/>
       </w:pPr>
       <w:r>
-        <w:t>Téma propojuji s hudbou, protože hraji na kytaru, baskytaru a bicí. U nástrojů a efektů mě zajímá, co se při úpravě barvy zvuku mění v obvodu. Kondenzátor s rezistorem nabízí konkrétní příklad: stejné součástky určují časový průběh napětí i přenos jednotlivých kmitočtů.</w:t>
+        <w:t>Téma propojuji s hudbou, protože hraji na kytaru, baskytaru a bicí. Na nástrojích i efektech mě zajímá, co se vlastně v obvodu děje, když se mění barva zvuku. Rezistor s kondenzátorem je na to dobrý příklad. Tytéž dvě součástky určují časový průběh napětí i to, jak obvod propustí jednotlivé kmitočty.</w:t>
       </w:r>
     </w:p>
     <w:p>
@@ -2010,7 +2010,7 @@
         <w:pStyle w:val="Dalodstavceprce"/>
       </w:pPr>
       <w:r>
-        <w:t>Vedle výpočtů jsem pro tuto práci vytvořil interaktivní simulaci. Pomáhá mi porovnat rovnice s grafy a s účinkem filtru na známý hudební materiál. Zobrazuje přechodové děje a model vazebního kondenzátoru mezi zesilovacími stupni. Část se zvukem umožňuje přepínat původní a filtrovanou kytarovou ukázku a měnit parametry během přehrávání. [2]</w:t>
+        <w:t>Vedle výpočtů jsem k práci napsal interaktivní simulaci. Díky ní si můžu rovnice porovnat s grafy a rovnou slyšet, co filtr udělá se známým hudebním materiálem. Ukazuje přechodové děje i model vazebního kondenzátoru mezi zesilovacími stupni. Ve zvukové části přepínám mezi původní a filtrovanou kytarovou ukázkou a měním parametry za chodu. [2]</w:t>
       </w:r>
     </w:p>
     <w:p>
@@ -2018,14 +2018,14 @@
         <w:pStyle w:val="Dalodstavceprce"/>
       </w:pPr>
       <w:r>
-        <w:t>Výpočty vycházejí z ideálních součástek. Číselné hodnoty zvolené nad rámec zadání jsou označeny jako modelové. Výsledky simulace a automatických testů jsou výpočetní ověření; nepředstavuji je jako laboratorní měření skutečného kondenzátoru, pedálu nebo nástroje.</w:t>
+        <w:t>Všechny výpočty stojí na ideálních součástkách a čísla zvolená nad rámec zadání označuji jako modelová. Simulace a automatické testy ověřují výpočet, ne chování konkrétního pedálu nebo nástroje. Měření na reálném obvodu jsem neprováděl.</w:t>
       </w:r>
     </w:p>
     <w:p>
       <w:pPr>
         <w:pStyle w:val="Heading1"/>
       </w:pPr>
-      <w:bookmarkStart w:id="1" w:name="_Toc240101257"/>
+      <w:bookmarkStart w:id="1" w:name="_Toc240119872"/>
       <w:r>
         <w:lastRenderedPageBreak/>
         <w:t>Kondenzátor a energie elektrického pole</w:t>
@@ -2037,7 +2037,7 @@
         <w:pStyle w:val="Prvnodstavecprce"/>
       </w:pPr>
       <w:r>
-        <w:t>Kondenzátor tvoří dvě vodivé elektrody oddělené izolantem. Při nabíjení se na jedné elektrodě hromadí kladný náboj a na druhé záporný náboj stejné velikosti. Mezi elektrodami vzniká elektrické pole. Kapacita C vyjadřuje, jak velký náboj q připadá na jednotku napětí u</w:t>
+        <w:t>Kondenzátor tvoří dvě vodivé elektrody oddělené izolantem. Při nabíjení se na jedné hromadí kladný náboj a na druhé stejně velký záporný náboj. Mezi elektrodami vzniká elektrické pole. Kapacita C říká, kolik náboje q připadne na jeden volt napětí u</w:t>
       </w:r>
       <w:r>
         <w:rPr>
@@ -2046,7 +2046,7 @@
         <w:t>C</w:t>
       </w:r>
       <w:r>
-        <w:t>. Pro lineární kondenzátor platí q = Cu</w:t>
+        <w:t>. U lineárního kondenzátoru je tento poměr stálý, takže platí q = Cu</w:t>
       </w:r>
       <w:r>
         <w:rPr>
@@ -2055,7 +2055,7 @@
         <w:t>C</w:t>
       </w:r>
       <w:r>
-        <w:t>. Jednotkou kapacity je farad, tedy coulomb na volt. [3, kap. 5.1–5.2]</w:t>
+        <w:t>. Jednotkou je farad, tedy coulomb na volt. [3, kap. 5.1–5.2]</w:t>
       </w:r>
     </w:p>
     <w:p>
@@ -2251,7 +2251,7 @@
         <w:pStyle w:val="Prvnodstavecprce"/>
       </w:pPr>
       <w:r>
-        <w:t>U deskového kondenzátoru označuje S plochu jedné elektrody, d vzdálenost elektrod, ε₀ permitivitu vakua a ε</w:t>
+        <w:t>U deskového kondenzátoru je S plocha jedné elektrody, d jejich vzdálenost, ε₀ permitivita vakua a ε</w:t>
       </w:r>
       <w:r>
         <w:rPr>
@@ -2260,7 +2260,7 @@
         <w:t>r</w:t>
       </w:r>
       <w:r>
-        <w:t xml:space="preserve"> relativní permitivitu dielektrika. Vztah pro kapacitu předpokládá homogenní materiál a zanedbává okraje desek. Při větší ploše nebo menší vzdálenosti elektrod je kapacita větší. Elektrická intenzita E se udává ve V/m a popisuje sílu působící na jednotkový kladný náboj.</w:t>
+        <w:t xml:space="preserve"> relativní permitivita dielektrika. Vzorec počítá s homogenním materiálem a zanedbává okraje desek. Větší plocha nebo menší mezera znamená větší kapacitu. Intenzita E má jednotku V/m a udává sílu působící na jednotkový kladný náboj.</w:t>
       </w:r>
     </w:p>
     <w:p>
@@ -2276,7 +2276,7 @@
         <w:pStyle w:val="Prvnodstavecprce"/>
       </w:pPr>
       <w:r>
-        <w:t>Přesunutí malého náboje dq mezi elektrodami vyžaduje práci dW = u</w:t>
+        <w:t>Přenesení malého náboje dq mezi elektrodami vyžaduje práci dW = u</w:t>
       </w:r>
       <w:r>
         <w:rPr>
@@ -2285,7 +2285,7 @@
         <w:t>C</w:t>
       </w:r>
       <w:r>
-        <w:t xml:space="preserve"> dq. Napětí během nabíjení roste, takže nelze celou práci spočítat jako konečné napětí násobené konečným nábojem. Je nutné integrovat průběžnou hodnotu q/C. Výsledkem je energie elektrického pole: [3, kap. 5.4]</w:t>
+        <w:t xml:space="preserve"> dq. Napětí přitom roste, takže celkovou práci nespočítáme jako konečné napětí krát konečný náboj. Integrujeme okamžitou hodnotu q/C a získáme energii elektrického pole. [3, kap. 5.4]</w:t>
       </w:r>
     </w:p>
     <w:p>
@@ -2680,7 +2680,7 @@
         <w:t>e</w:t>
       </w:r>
       <w:r>
-        <w:t xml:space="preserve"> je objemová hustota energie v J/m³. Při zdvojnásobení napětí na stejném kondenzátoru vzroste energie čtyřikrát. Ideální kondenzátor může uloženou energii vrátit do obvodu. Rezistor ji mění na teplo, které se tímto způsobem zpět na elektrickou energii nepřemění.</w:t>
+        <w:t xml:space="preserve"> je objemová hustota energie v J/m³. Při dvojnásobném napětí vzroste energie čtyřikrát. Kondenzátor může uloženou energii vrátit do obvodu. Na rezistoru se mění na teplo, které se v tomto RC obvodu zpět na elektrickou energii nepřemění.</w:t>
       </w:r>
     </w:p>
     <w:p>
@@ -2696,7 +2696,7 @@
         <w:pStyle w:val="Prvnodstavecprce"/>
       </w:pPr>
       <w:r>
-        <w:t>Dielektrikum určuje kapacitu i dovolené elektrické namáhání. Překročení jeho elektrické pevnosti může vyvolat průraz. Proto při výběru součástky nestačí znát kapacitu, ale také jmenovité napětí, polaritu a toleranci. Fóliové kondenzátory bývají nepolarizované; elektrolytické typy zpravidla vyžadují určenou polaritu. [3, kap. 5.5; 4, s. 1–2]</w:t>
+        <w:t>Dielektrikum určuje kapacitu i to, jaké namáhání součástka snese. Při překročení jeho elektrické pevnosti nastane průraz. Kondenzátor se proto nevybírá jen podle kapacity. Stejně důležité je jmenovité napětí, tolerance a u elektrolytických typů i polarita. Fóliové kondenzátory bývají nepolarizované. [3, kap. 5.5; 4, s. 1–2]</w:t>
       </w:r>
     </w:p>
     <w:p>
@@ -2704,14 +2704,14 @@
         <w:pStyle w:val="Dalodstavceprce"/>
       </w:pPr>
       <w:r>
-        <w:t>Skutečný kondenzátor má ztráty, svod a parazitní indukčnost. V dalších výpočtech je zanedbávám a používám ideální C spolu s explicitním rezistorem R. Takový model umožňuje oddělit samotný RC děj od dalších vlastností součástky. Jeho přesnost se vždy posuzuje podle pracovního kmitočtu, napětí a požadované chyby.</w:t>
+        <w:t>Skutečná součástka má navíc ztráty, svod a parazitní indukčnost. Ve výpočtech je zanedbávám a pracuji s ideálním C a samostatným rezistorem R. Model tím zůstane přehledný a ukáže čistý RC děj. Jak dobře odpovídá realitě, záleží na pracovním kmitočtu, napětí a na tom, jakou chybu si můžeme dovolit.</w:t>
       </w:r>
     </w:p>
     <w:p>
       <w:pPr>
         <w:pStyle w:val="Heading1"/>
       </w:pPr>
-      <w:bookmarkStart w:id="2" w:name="_Toc240101258"/>
+      <w:bookmarkStart w:id="2" w:name="_Toc240119873"/>
       <w:r>
         <w:lastRenderedPageBreak/>
         <w:t>Nabíjení a vybíjení RC obvodu</w:t>
@@ -2723,7 +2723,7 @@
         <w:pStyle w:val="Prvnodstavecprce"/>
       </w:pPr>
       <w:r>
-        <w:t>Uvažujme ideální zdroj stálého napětí U, rezistor R &gt; 0 a kondenzátor C &gt; 0 v sérii. Zdroj připojíme v čase t = 0 k vybitému kondenzátoru. Proud i je kladný při nabíjení kladné elektrody. Napětí u</w:t>
+        <w:t>Sériově spojíme ideální zdroj stálého napětí U, rezistor R &gt; 0 a vybitý kondenzátor C &gt; 0. V čase t = 0 obvod sepneme. Proud i bereme jako kladný ve směru nabíjení kladné elektrody. Napětí u</w:t>
       </w:r>
       <w:r>
         <w:rPr>
@@ -2732,7 +2732,7 @@
         <w:t>R</w:t>
       </w:r>
       <w:r>
-        <w:t xml:space="preserve"> je úbytek ve směru i, napětí u</w:t>
+        <w:t xml:space="preserve"> je úbytek v tomto směru, u</w:t>
       </w:r>
       <w:r>
         <w:rPr>
@@ -2756,7 +2756,7 @@
           <w:noProof/>
         </w:rPr>
         <w:drawing>
-          <wp:inline distT="0" distB="0" distL="0" distR="0" wp14:anchorId="14C9797B" wp14:editId="10462A0B">
+          <wp:inline distT="0" distB="0" distL="0" distR="0" wp14:anchorId="4EEBA301" wp14:editId="40D938ED">
             <wp:extent cx="4140000" cy="1101826"/>
             <wp:effectExtent l="0" t="0" r="0" b="0"/>
             <wp:docPr id="1326772253" name="Picture 1326772253"/>
@@ -2841,7 +2841,7 @@
         <w:t>R</w:t>
       </w:r>
       <w:r>
-        <w:t xml:space="preserve"> = Ri. Definice proudu i = dq/dt a vztah q = Cu</w:t>
+        <w:t xml:space="preserve"> = Ri. Definice proudu i = dq/dt spolu se vztahem q = Cu</w:t>
       </w:r>
       <w:r>
         <w:rPr>
@@ -2850,7 +2850,7 @@
         <w:t>C</w:t>
       </w:r>
       <w:r>
-        <w:t xml:space="preserve"> vedou k i = C du</w:t>
+        <w:t xml:space="preserve"> vede na i = C du</w:t>
       </w:r>
       <w:r>
         <w:rPr>
@@ -2859,7 +2859,7 @@
         <w:t>C</w:t>
       </w:r>
       <w:r>
-        <w:t>/dt. Dosazením získáme rovnici prvního řádu:</w:t>
+        <w:t>/dt. Dosazením vznikne rovnice prvního řádu:</w:t>
       </w:r>
     </w:p>
     <w:p>
@@ -3021,7 +3021,7 @@
         <w:pStyle w:val="Prvnodstavecprce"/>
       </w:pPr>
       <w:r>
-        <w:t>Proměnné oddělíme jako du</w:t>
+        <w:t>Proměnné oddělíme na tvar du</w:t>
       </w:r>
       <w:r>
         <w:rPr>
@@ -3039,7 +3039,7 @@
         <w:t>C</w:t>
       </w:r>
       <w:r>
-        <w:t>) = dt/(RC). Integrací mezi počátečním a okamžitým stavem vznikne bezrozměrný logaritmus ln[U/(U − u</w:t>
+        <w:t>) = dt/(RC). Integrujeme od počátečního stavu k okamžitému, takže meze nahradí integrační konstantu, a vyjde ln[U/(U − u</w:t>
       </w:r>
       <w:r>
         <w:rPr>
@@ -3048,7 +3048,7 @@
         <w:t>C</w:t>
       </w:r>
       <w:r>
-        <w:t>)] = t/(RC). Po úpravě dostáváme: [5, kap. 7.6.1]</w:t>
+        <w:t>)] = t/(RC). Odlogaritmováním dostaneme průběhy napětí i proudu: [5, kap. 7.6.1]</w:t>
       </w:r>
     </w:p>
     <w:p>
@@ -3424,25 +3424,7 @@
         <w:pStyle w:val="Prvnodstavecprce"/>
       </w:pPr>
       <w:r>
-        <w:t>Na začátku je u</w:t>
-      </w:r>
-      <w:r>
-        <w:rPr>
-          <w:vertAlign w:val="subscript"/>
-        </w:rPr>
-        <w:t>C</w:t>
-      </w:r>
-      <w:r>
-        <w:t xml:space="preserve"> = 0 a i = U/R. Jak kondenzátor získává náboj, jeho napětí roste a proud klesá. Pro t → ∞ se u</w:t>
-      </w:r>
-      <w:r>
-        <w:rPr>
-          <w:vertAlign w:val="subscript"/>
-        </w:rPr>
-        <w:t>C</w:t>
-      </w:r>
-      <w:r>
-        <w:t xml:space="preserve"> blíží U a proud nule. Při konečném proudu se napětí kondenzátoru mění spojitě; jeho skok by vyžadoval proudový impulz.</w:t>
+        <w:t>Hned po sepnutí je napětí vybitého kondenzátoru nulové, celé napětí zdroje leží na rezistoru a teče proud U/R. Jak se kondenzátor nabíjí, jeho napětí roste a proud klesá k nule. Skok napětí na kondenzátoru možný není, vyžádal by si nekonečný proudový impulz.</w:t>
       </w:r>
     </w:p>
     <w:p>
@@ -3458,7 +3440,7 @@
         <w:pStyle w:val="Prvnodstavecprce"/>
       </w:pPr>
       <w:r>
-        <w:t>Při vybíjení nahradíme zdroj zkratem a zachováme orientace veličin. Pravá strana diferenciální rovnice je nulová. Pro počáteční napětí U₀ platí: [5, kap. 7.6.2]</w:t>
+        <w:t>Při vybíjení nahradíme zdroj zkratem a orientace veličin necháme beze změny. Pravá strana rovnice se vynuluje. Pro počáteční napětí U₀ platí: [5, kap. 7.6.2]</w:t>
       </w:r>
     </w:p>
     <w:p>
@@ -3762,7 +3744,7 @@
         <w:t>C</w:t>
       </w:r>
       <w:r>
-        <w:t>. Záporný proud označuje obrácený směr, nikoli chybu ve výpočtu. Oba děje sjednocuje vztah u</w:t>
+        <w:t>. Znaménko mínus jen říká, že proud teče opačně než při nabíjení. Oba děje popisuje jediný vztah u</w:t>
       </w:r>
       <w:r>
         <w:rPr>
@@ -3823,7 +3805,7 @@
       <w:pPr>
         <w:pStyle w:val="Heading1"/>
       </w:pPr>
-      <w:bookmarkStart w:id="3" w:name="_Toc240101259"/>
+      <w:bookmarkStart w:id="3" w:name="_Toc240119874"/>
       <w:r>
         <w:lastRenderedPageBreak/>
         <w:t>Časová konstanta a doba náběhu</w:t>
@@ -3835,7 +3817,7 @@
         <w:pStyle w:val="Prvnodstavecprce"/>
       </w:pPr>
       <w:r>
-        <w:t>Časová konstanta τ = RC má jednotku sekunda, protože Ω·F = (V/A)·(A·s/V) = s. Po jedné časové konstantě zbývá e⁻¹ ≈ 36,8 % původního rozdílu mezi okamžitým a konečným napětím. Při nabíjení z nuly proto kondenzátor dosáhne přibližně 63,2 % napětí zdroje. [5, kap. 7.6; 4, s. 2–4]</w:t>
+        <w:t>Časová konstanta τ = RC má jednotku sekunda, protože Ω·F = (V/A)·(A·s/V) = s. Po jedné časové konstantě zbývá e⁻¹ ≈ 36,8 % původního rozdílu mezi okamžitým a konečným napětím. Kondenzátor nabíjený z nuly proto dosáhne přibližně 63,2 % napětí zdroje. [5, kap. 7.6; 4, s. 2–4]</w:t>
       </w:r>
     </w:p>
     <w:p>
@@ -3850,7 +3832,7 @@
           <w:noProof/>
         </w:rPr>
         <w:drawing>
-          <wp:inline distT="0" distB="0" distL="0" distR="0" wp14:anchorId="6EC7B0F9" wp14:editId="7DDD3D82">
+          <wp:inline distT="0" distB="0" distL="0" distR="0" wp14:anchorId="6869B496" wp14:editId="3A41CC30">
             <wp:extent cx="4536000" cy="1916901"/>
             <wp:effectExtent l="0" t="0" r="0" b="0"/>
             <wp:docPr id="1326772254" name="Picture 1326772254"/>
@@ -4364,7 +4346,7 @@
         <w:pStyle w:val="Prvnodstavecprce"/>
       </w:pPr>
       <w:r>
-        <w:t>Po 5τ není kondenzátor matematicky plně nabitý. Zbývající odchylka činí e⁻⁵ ≈ 0,674 %. O praktickém ustálení lze mluvit tehdy, když je tato odchylka menší než požadovaná přesnost. Zvětšení R nebo C celý průběh zpomalí. Stejné RC však nezaručuje stejný proud ani energii, protože proud závisí na R a energie na C.</w:t>
+        <w:t>Ani po pěti časových konstantách není kondenzátor matematicky plně nabitý. Zbývá odchylka e⁻⁵ ≈ 0,674 %. Za ustálený můžeme děj prohlásit ve chvíli, kdy je tato odchylka menší než přesnost, se kterou pracujeme. Větší R nebo C celý průběh zpomalí. Stejný součin RC ale nezaručí stejný proud ani energii, protože proud řídí odpor a energii kapacita.</w:t>
       </w:r>
     </w:p>
     <w:p>
@@ -4372,7 +4354,7 @@
         <w:pStyle w:val="Heading2"/>
       </w:pPr>
       <w:r>
-        <w:t>Co znamená náběh mezi deseti a devadesáti procenty</w:t>
+        <w:t>Náběh mezi deseti a devadesáti procenty</w:t>
       </w:r>
     </w:p>
     <w:p>
@@ -4389,7 +4371,7 @@
         <w:t>α</w:t>
       </w:r>
       <w:r>
-        <w:t xml:space="preserve"> = −τ ln(1 − α). Dosažení 90 % z nulového napětí trvá τ ln 10 ≈ 2,303τ. Naproti tomu doba mezi 10 % a 90 % je t₁₀–₉₀ = τ ln 9 ≈ 2,197τ. Rozdíl je dán tím, od kterého bodu začínáme čas měřit.</w:t>
+        <w:t xml:space="preserve"> = −τ ln(1 − α). Cesta z nuly na 90 % trvá τ ln 10 ≈ 2,303τ. Doba mezi 10 % a 90 % je oproti tomu t₁₀–₉₀ = τ ln 9 ≈ 2,197τ. Rozdíl dělá jen to, od kterého bodu čas měříme.</w:t>
       </w:r>
     </w:p>
     <w:p>
@@ -4397,7 +4379,7 @@
         <w:pStyle w:val="Dalodstavceprce"/>
       </w:pPr>
       <w:r>
-        <w:t>Při obdélníkovém buzení je rozhodující délka každé půlperiody. Je-li mnohem delší než τ, napětí na C se v každém úseku téměř ustálí. Při rychlém střídání se kondenzátor mezi hranami nestihne výrazně nabít ani vybít. Výstup na C pak připomíná vyhlazený průběh. Přesná aproximace integrátoru vyžaduje ωRC ≫ 1 pro sledované složky signálu. [4, s. 3–6]</w:t>
+        <w:t>U obdélníkového buzení rozhoduje délka půlperiody. Když je mnohem delší než τ, napětí na kondenzátoru se v každém úseku téměř ustálí. Při rychlém střídání se kondenzátor nestihne výrazně nabít ani vybít a napětí se vyhlazuje. Pokud pro sledované složky platí ωRC ≫ 1, lze dolní propust přibližně popsat jako integrátor. [4, s. 3–6]</w:t>
       </w:r>
     </w:p>
     <w:p>
@@ -4423,14 +4405,14 @@
         <w:t>c</w:t>
       </w:r>
       <w:r>
-        <w:t xml:space="preserve"> je přibližně 0,350. Pomalejší reakce na hranu a nižší šířka pásma jsou tedy vlastnosti téhož obvodu.</w:t>
+        <w:t xml:space="preserve"> vychází přibližně 0,350. Snížení mezního kmitočtu tedy prodlouží dobu náběhu.</w:t>
       </w:r>
     </w:p>
     <w:p>
       <w:pPr>
         <w:pStyle w:val="Heading1"/>
       </w:pPr>
-      <w:bookmarkStart w:id="4" w:name="_Toc240101260"/>
+      <w:bookmarkStart w:id="4" w:name="_Toc240119875"/>
       <w:r>
         <w:lastRenderedPageBreak/>
         <w:t>RC filtry pro střídavé signály</w:t>
@@ -4451,7 +4433,7 @@
         <w:t>in</w:t>
       </w:r>
       <w:r>
-        <w:t>(t) = Û sin(ωt), kde Û je amplituda a ω = 2πf úhlový kmitočet. V ustáleném stavu používáme impedance Z</w:t>
+        <w:t>(t) = Û sin(ωt), kde Û je amplituda a ω = 2πf úhlový kmitočet. V ustáleném stavu počítáme s impedancemi Z</w:t>
       </w:r>
       <w:r>
         <w:rPr>
@@ -4469,7 +4451,7 @@
         <w:t>C</w:t>
       </w:r>
       <w:r>
-        <w:t xml:space="preserve"> = 1/(jωC), přičemž j² = −1. Velikost reaktance 1/(ωC) s rostoucím kmitočtem klesá. [6, kap. 12.2]</w:t>
+        <w:t xml:space="preserve"> = 1/(jωC), přičemž j² = −1. Reaktance 1/(ωC) s rostoucím kmitočtem klesá, takže kondenzátor propouští vyšší kmitočty snáz. [6, kap. 12.2]</w:t>
       </w:r>
     </w:p>
     <w:p>
@@ -4485,7 +4467,7 @@
         <w:pStyle w:val="Prvnodstavecprce"/>
       </w:pPr>
       <w:r>
-        <w:t>Výstup na kondenzátoru dává dolní propust, výstup na rezistoru horní propust. Následující vztahy předpokládají ideální zdroj a výstup nezatížený dalším obvodem. Přenos H je komplexní poměr výstupního a vstupního napětí. [4, s. 5–6; 7, s. 5]</w:t>
+        <w:t>Výstup na kondenzátoru dává dolní propust, výstup na rezistoru horní propust. Vztahy níže počítají s ideálním zdrojem a nezatíženým výstupem. Přenos H je komplexní poměr výstupního a vstupního napětí. [4, s. 5–6; 7, s. 5]</w:t>
       </w:r>
     </w:p>
     <w:p>
@@ -5105,7 +5087,7 @@
         <w:t>c</w:t>
       </w:r>
       <w:r>
-        <w:t xml:space="preserve"> = 1/(2πRC) platí ωRC = 1. Obě propusti mají |H| = 1/√2 a zisk 20 log₁₀|H| ≈ −3,01 dB. Výstupní amplituda je přibližně 70,7 % vstupní, nikoli 50 %. Poloviční výkon odpovídá tomuto poměru napětí při porovnání na stejném odporu. Fáze je −45° u dolní a +45° u horní propusti.</w:t>
+        <w:t xml:space="preserve"> = 1/(2πRC) platí ωRC = 1. Obě propusti mají |H| = 1/√2 a zisk 20 log₁₀|H| ≈ −3,01 dB. Výstupní amplituda je tedy přibližně 70,7 % vstupní, nikoli 50 %. Na stejném odporu tomuto poměru napětí odpovídá poloviční výkon. Fáze je −45° u dolní a +45° u horní propusti.</w:t>
       </w:r>
     </w:p>
     <w:p>
@@ -5120,7 +5102,7 @@
           <w:noProof/>
         </w:rPr>
         <w:drawing>
-          <wp:inline distT="0" distB="0" distL="0" distR="0" wp14:anchorId="2B8DAA93" wp14:editId="74D5971A">
+          <wp:inline distT="0" distB="0" distL="0" distR="0" wp14:anchorId="09432448" wp14:editId="6FD3A5A3">
             <wp:extent cx="5112000" cy="1857989"/>
             <wp:effectExtent l="0" t="0" r="0" b="0"/>
             <wp:docPr id="1326772255" name="Picture 1326772255"/>
@@ -5188,7 +5170,7 @@
         <w:t>c</w:t>
       </w:r>
       <w:r>
-        <w:t xml:space="preserve"> roste přenos horní propusti směrem k vyšším kmitočtům o 20 dB na dekádu. To odpovídá asi 6 dB na oktávu. Přechod není ostrý, takže jednoduchý RC článek odděluje kmitočtová pásma pozvolna.</w:t>
+        <w:t xml:space="preserve"> roste přenos horní propusti směrem k vyšším kmitočtům o týchž 20 dB na dekádu. To je asi 6 dB na oktávu. Přechod není ostrý, takže jednoduchý RC článek dělí pásma pozvolna.</w:t>
       </w:r>
     </w:p>
     <w:p>
@@ -5203,10 +5185,10 @@
       <w:pPr>
         <w:pStyle w:val="Heading1"/>
       </w:pPr>
-      <w:bookmarkStart w:id="5" w:name="_Toc240101261"/>
+      <w:bookmarkStart w:id="5" w:name="_Toc240119876"/>
       <w:r>
         <w:lastRenderedPageBreak/>
-        <w:t>Úkoly 1 a 2 Napětí na rezistoru a kondenzátoru</w:t>
+        <w:t>Úkoly 1 a 2: napětí na rezistoru a kondenzátoru</w:t>
       </w:r>
       <w:bookmarkEnd w:id="5"/>
     </w:p>
@@ -5215,7 +5197,7 @@
         <w:pStyle w:val="Prvnodstavecprce"/>
       </w:pPr>
       <w:r>
-        <w:t>Zadání projektu č. 8 požaduje vztahy pro u</w:t>
+        <w:t>Zadání požaduje vztahy pro u</w:t>
       </w:r>
       <w:r>
         <w:rPr>
@@ -5233,7 +5215,7 @@
         <w:t>C</w:t>
       </w:r>
       <w:r>
-        <w:t xml:space="preserve"> a napětí kondenzátoru v čase τ. Neobsahuje číselné hodnoty součástek ani počáteční napětí. Hlavní řešení proto používá nabíjení původně vybitého kondenzátoru ze stálého napětí U. Případ vybíjení uvádím zvlášť. [1]</w:t>
+        <w:t xml:space="preserve"> a napětí kondenzátoru v čase τ. Konkrétní hodnoty součástek ani počáteční napětí v něm nejsou. Řeším proto nabíjení vybitého kondenzátoru ze stálého napětí U a vybíjení doplňuji zvlášť. [1]</w:t>
       </w:r>
     </w:p>
     <w:p>
@@ -5241,7 +5223,7 @@
         <w:pStyle w:val="Heading2"/>
       </w:pPr>
       <w:r>
-        <w:t>Úkol 1 Obecné vztahy</w:t>
+        <w:t>Úkol 1: obecné vztahy</w:t>
       </w:r>
     </w:p>
     <w:p>
@@ -5249,7 +5231,7 @@
         <w:pStyle w:val="Prvnodstavecprce"/>
       </w:pPr>
       <w:r>
-        <w:t>Řešením diferenciální rovnice RC du</w:t>
+        <w:t>Řešením rovnice RC du</w:t>
       </w:r>
       <w:r>
         <w:rPr>
@@ -5545,7 +5527,7 @@
         <w:t>C</w:t>
       </w:r>
       <w:r>
-        <w:t>(t) = U pro libovolné t ≥ 0. Na začátku je napětí na rezistoru rovno U, zatímco na kondenzátoru je nulové. Po dlouhé době je situace obrácená. Při vybíjení z napětí U platí u</w:t>
+        <w:t>(t) = U pro libovolné t ≥ 0. Na začátku je celé napětí na rezistoru. V limitě t → ∞ je na kondenzátoru U a na rezistoru nula. Při vybíjení z napětí U platí u</w:t>
       </w:r>
       <w:r>
         <w:rPr>
@@ -5581,7 +5563,7 @@
         <w:t>−t/τ</w:t>
       </w:r>
       <w:r>
-        <w:t>, pokud se orientace měření nezmění. [5, kap. 7.6]</w:t>
+        <w:t>, pokud orientaci měření nezměníme. [5, kap. 7.6]</w:t>
       </w:r>
     </w:p>
     <w:p>
@@ -5589,7 +5571,7 @@
         <w:pStyle w:val="Heading2"/>
       </w:pPr>
       <w:r>
-        <w:t>Úkol 2 Dosazení času τ</w:t>
+        <w:t>Úkol 2: dosazení času τ</w:t>
       </w:r>
     </w:p>
     <w:p>
@@ -5715,7 +5697,7 @@
         <w:pStyle w:val="Prvnodstavecprce"/>
       </w:pPr>
       <w:r>
-        <w:t>Při vybíjení ze stejného počátečního napětí je u</w:t>
+        <w:t>Při vybíjení ze stejného počátečního napětí vyjde u</w:t>
       </w:r>
       <w:r>
         <w:rPr>
@@ -5724,7 +5706,7 @@
         <w:t>C</w:t>
       </w:r>
       <w:r>
-        <w:t>(τ) = Ue⁻¹ ≈ 0,367879U. Hodnoty 63,2 % a 36,8 % tedy popisují dva odlišné děje, které je třeba rozlišovat podle počáteční podmínky.</w:t>
+        <w:t>(τ) = Ue⁻¹ ≈ 0,367879U. Hodnoty 63,2 % a 36,8 % tedy patří dvěma různým dějům a rozlišuje je počáteční podmínka.</w:t>
       </w:r>
     </w:p>
     <w:p>
@@ -5740,7 +5722,7 @@
         <w:pStyle w:val="Prvnodstavecprce"/>
       </w:pPr>
       <w:r>
-        <w:t>Pro ilustraci volím U = 5,00 V, R = 10,0 kΩ a C = 1,00 µF. Jde o modelové hodnoty zvolené pro výpočet, nikoli o údaje předepsané zadáním nebo naměřené na konkrétním pedálu. Časová konstanta je τ = 10,0 ms a počáteční nabíjecí proud 0,500 mA.</w:t>
+        <w:t>Pro názornost dosadím U = 5,00 V, R = 10,0 kΩ a C = 1,00 µF. Jsou to modelové hodnoty, zadání je nepředepisuje. Časová konstanta vychází τ = 10,0 ms a počáteční nabíjecí proud 0,500 mA.</w:t>
       </w:r>
     </w:p>
     <w:tbl>
@@ -6135,7 +6117,7 @@
         <w:pStyle w:val="Prvnodstavecprce"/>
       </w:pPr>
       <w:r>
-        <w:t>Při nabíjení je součet napětí v tabulce 3,16060 V + 1,83940 V = 5,00000 V. Proud lze zkontrolovat nezávisle z u</w:t>
+        <w:t>Součet napětí při nabíjení sedí: 3,16060 V + 1,83940 V = 5,00000 V. Proud si lze nezávisle ověřit z podílu u</w:t>
       </w:r>
       <w:r>
         <w:rPr>
@@ -6144,7 +6126,7 @@
         <w:t>R</w:t>
       </w:r>
       <w:r>
-        <w:t>/R. Záporný proud při vybíjení označuje obrácený směr toku náboje.</w:t>
+        <w:t>/R. Záporný proud při vybíjení znamená obrácený směr toku náboje.</w:t>
       </w:r>
     </w:p>
     <w:p>
@@ -6152,7 +6134,7 @@
         <w:pStyle w:val="Dalodstavceprce"/>
       </w:pPr>
       <w:r>
-        <w:t>Pokud by počáteční napětí bylo 2,00 V, obecné řešení by dalo u</w:t>
+        <w:t>Kdyby na kondenzátoru zbylo počáteční napětí 2,00 V, dalo by obecné řešení u</w:t>
       </w:r>
       <w:r>
         <w:rPr>
@@ -6161,17 +6143,17 @@
         <w:t>C</w:t>
       </w:r>
       <w:r>
-        <w:t>(τ) = 5 + (2 − 5)e⁻¹ ≈ 3,896 V. Tento příklad ukazuje, proč hodnotu 0,632U nelze použít bez podmínky původně vybitého kondenzátoru.</w:t>
+        <w:t>(τ) = 5 + (2 − 5)e⁻¹ ≈ 3,896 V. Hodnota 0,632U tedy platí jen pro původně vybitý kondenzátor. U opakovaných impulzů je třeba počáteční napětí převzít z konce předchozího úseku.</w:t>
       </w:r>
     </w:p>
     <w:p>
       <w:pPr>
         <w:pStyle w:val="Heading1"/>
       </w:pPr>
-      <w:bookmarkStart w:id="6" w:name="_Toc240101262"/>
+      <w:bookmarkStart w:id="6" w:name="_Toc240119877"/>
       <w:r>
         <w:lastRenderedPageBreak/>
-        <w:t>Úkol 3 Energie přeměněná na teplo</w:t>
+        <w:t>Úkol 3: energie přeměněná na teplo</w:t>
       </w:r>
       <w:bookmarkEnd w:id="6"/>
     </w:p>
@@ -6180,7 +6162,7 @@
         <w:pStyle w:val="Prvnodstavecprce"/>
       </w:pPr>
       <w:r>
-        <w:t>Třetí úkol požaduje teplo na rezistoru od připojení zdroje do času τ, nikoli okamžitý výkon nebo ztrátu při úplném nabití. Pro nabíjení z nuly je i(t) = (U/R)e</w:t>
+        <w:t>Třetí úkol chce teplo na rezistoru od sepnutí do času τ. Ne okamžitý výkon a ne ztrátu při úplném nabití. Pro nabíjení z nuly je i(t) = (U/R)e</w:t>
       </w:r>
       <w:r>
         <w:rPr>
@@ -6694,7 +6676,7 @@
         <w:pStyle w:val="Prvnodstavecprce"/>
       </w:pPr>
       <w:r>
-        <w:t>Integrál exponenciály přinese faktor τ/2 = RC/2. Dvojka v exponentu vzniká umocněním proudu. Po dosazení požadovaného času vychází:</w:t>
+        <w:t>Dvojka v exponentu vzniká umocněním proudu. Integrace exponenciály pak přinese faktor τ/2 = RC/2. Po dosazení požadovaného času vychází:</w:t>
       </w:r>
     </w:p>
     <w:p>
@@ -6902,7 +6884,7 @@
         <w:pStyle w:val="Prvnodstavecprce"/>
       </w:pPr>
       <w:r>
-        <w:t>Jednotka F·V² je joule. Při pevném čase t výsledek závisí na odporu uvnitř exponentu. Při čase vyjádřeném jako jedna vlastní konstanta RC se odpor z konečného koeficientu vykrátí.</w:t>
+        <w:t>Součin F·V² dává joule. Při pevně zadaném čase t na odporu záleží, protože R sedí v exponentu. Měříme-li čas v násobcích RC, odpor se z koeficientu vykrátí.</w:t>
       </w:r>
     </w:p>
     <w:p>
@@ -7253,7 +7235,7 @@
         <w:pStyle w:val="Prvnodstavecprce"/>
       </w:pPr>
       <w:r>
-        <w:t>Součet W</w:t>
+        <w:t>Po úpravě je součet W</w:t>
       </w:r>
       <w:r>
         <w:rPr>
@@ -7271,7 +7253,7 @@
         <w:t>R</w:t>
       </w:r>
       <w:r>
-        <w:t xml:space="preserve"> je po algebraické úpravě roven W</w:t>
+        <w:t xml:space="preserve"> přesně roven W</w:t>
       </w:r>
       <w:r>
         <w:rPr>
@@ -7280,7 +7262,7 @@
         <w:t>z</w:t>
       </w:r>
       <w:r>
-        <w:t>. V čase τ vycházejí koeficienty 0,1997882 pro energii pole, 0,4323324 pro teplo a 0,6321206 pro zdroj. Shoda je přesná před zaokrouhlením.</w:t>
+        <w:t>. V čase τ vychází koeficient 0,1997882 pro energii pole, 0,4323324 pro teplo a 0,6321206 pro zdroj. Bilance sedí ještě před zaokrouhlením.</w:t>
       </w:r>
     </w:p>
     <w:p>
@@ -7295,7 +7277,7 @@
           <w:noProof/>
         </w:rPr>
         <w:drawing>
-          <wp:inline distT="0" distB="0" distL="0" distR="0" wp14:anchorId="4112A825" wp14:editId="03C97C45">
+          <wp:inline distT="0" distB="0" distL="0" distR="0" wp14:anchorId="258642FF" wp14:editId="2AC4EFF4">
             <wp:extent cx="4068000" cy="1830898"/>
             <wp:effectExtent l="0" t="0" r="0" b="0"/>
             <wp:docPr id="1326772256" name="Picture 1326772256"/>
@@ -7345,14 +7327,14 @@
         <w:pStyle w:val="Prvnodstavecprce"/>
       </w:pPr>
       <w:r>
-        <w:t>V číselném příkladu je CU² = 25,0 µJ. Teplo do τ činí 10,808 µJ, uložená energie 4,995 µJ a práce zdroje 15,803 µJ. Jejich bilance odpovídá odvozeným vztahům.</w:t>
+        <w:t>V číselném příkladu je CU² = 25,0 µJ. Teplo do τ činí 10,808 µJ, uložená energie 4,995 µJ a práce zdroje 15,803 µJ.</w:t>
       </w:r>
     </w:p>
     <w:p>
       <w:pPr>
         <w:pStyle w:val="Heading1"/>
       </w:pPr>
-      <w:bookmarkStart w:id="7" w:name="_Toc240101263"/>
+      <w:bookmarkStart w:id="7" w:name="_Toc240119878"/>
       <w:r>
         <w:lastRenderedPageBreak/>
         <w:t>Filtrace zvuku kytary a baskytary</w:t>
@@ -7364,7 +7346,7 @@
         <w:pStyle w:val="Prvnodstavecprce"/>
       </w:pPr>
       <w:r>
-        <w:t>Barvu tónu ovlivňuje poměr základní složky a vyšších harmonických i jejich časový průběh. Dolní propust zeslabuje vyšší složky, takže může zmírnit ostrost zvuku trsátka. Horní propust naopak omezuje spodní část spektra. Oba účinky se dají popsat přenosem jednotlivých harmonických složek, přestože výsledný nástrojový signál není čistá sinusovka.</w:t>
+        <w:t>Barvu tónu určuje poměr základní složky a vyšších harmonických i to, jak se v čase mění. Dolní propust zeslabuje vyšší složky, takže umí zmírnit ostrost trsátka. Horní propust naopak ubere ze spodku spektra. Oba účinky popíšeme přenosem jednotlivých harmonických, i když signál nástroje zdaleka není čistá sinusovka.</w:t>
       </w:r>
     </w:p>
     <w:p>
@@ -7380,7 +7362,7 @@
         <w:pStyle w:val="Prvnodstavecprce"/>
       </w:pPr>
       <w:r>
-        <w:t>Pasivní tónová clona používá kondenzátor a proměnný odpor. Fender uvádí kondenzátor 0,05 µF mezi součástkami tónových obvodů svých kytar a baskytar. Produktová dokumentace potvrzuje konkrétní použití součástky; neurčuje přenos všech nástrojů stejné značky. [8]</w:t>
+        <w:t>Pasivní tónová clona je kondenzátor a proměnný odpor. Fender dodává do tónových obvodů svých kytar a baskytar kondenzátor 0,05 µF. [8]</w:t>
       </w:r>
     </w:p>
     <w:p>
@@ -7388,7 +7370,7 @@
         <w:pStyle w:val="Dalodstavceprce"/>
       </w:pPr>
       <w:r>
-        <w:t>Magnetický snímač má odpor vinutí, indukčnost a vlastní kapacitu. Další zatížení vytváří kabel, potenciometry a vstup zesilovače. Obvod proto může vykazovat rezonanční vrchol. Změna tónové clony ovlivňuje jeho polohu i tlumení podle konkrétního zapojení. Samotná jmenovitá hodnota potenciometru a tónového kondenzátoru nestačí k výpočtu přesné charakteristiky celého nástroje. [9]</w:t>
+        <w:t>Magnetický snímač má ale i odpor vinutí, indukčnost a vlastní kapacitu. K tomu se přidá kabel, potenciometry a vstup zesilovače. Celek proto může mít rezonanční vrchol a stažení clony mění jeho polohu i tlumení. Z jmenovitých hodnot potenciometru a tónového kondenzátoru se charakteristika celého nástroje spočítat nedá. [9]</w:t>
       </w:r>
     </w:p>
     <w:p>
@@ -7396,7 +7378,7 @@
         <w:pStyle w:val="Dalodstavceprce"/>
       </w:pPr>
       <w:r>
-        <w:t>Vztah f</w:t>
+        <w:t>Vzorec f</w:t>
       </w:r>
       <w:r>
         <w:rPr>
@@ -7405,7 +7387,7 @@
         <w:t>c</w:t>
       </w:r>
       <w:r>
-        <w:t xml:space="preserve"> = 1/(2πRC) proto nelze automaticky použít na celý pasivní snímač. RC model v této práci slouží k popisu jednoduchého filtru za zdrojem s malým výstupním odporem. Pro úplný model snímače je nutné zahrnout i indukčnost L a jeho zatížení. [6, kap. 12.3]</w:t>
+        <w:t xml:space="preserve"> = 1/(2πRC) tedy na pasivní snímač jako celek nesedí. V této práci s ním popisuji jednoduchý filtr za zdrojem s malým výstupním odporem. Úplný model snímače by musel zahrnout indukčnost L a jeho zatížení. [6, kap. 12.3]</w:t>
       </w:r>
     </w:p>
     <w:p>
@@ -7421,7 +7403,7 @@
         <w:pStyle w:val="Prvnodstavecprce"/>
       </w:pPr>
       <w:r>
-        <w:t>Uvažujme R = 10,0 kΩ a C = 10,0 nF za oddělovacím zesilovačem. Odpor zdroje zanedbáme a další stupeň má vstupní odpor mnohem větší než R. Potom τ = 100 µs a f</w:t>
+        <w:t>Vezměme R = 10,0 kΩ a C = 10,0 nF za oddělovacím zesilovačem. Odpor zdroje zanedbáme a další stupeň má vstupní odpor mnohem větší než R. Potom je τ = 100 µs a f</w:t>
       </w:r>
       <w:r>
         <w:rPr>
@@ -7430,7 +7412,7 @@
         <w:t>c</w:t>
       </w:r>
       <w:r>
-        <w:t xml:space="preserve"> ≈ 1,59 kHz. Výpočet přenosu vybraných kmitočtů dává:</w:t>
+        <w:t xml:space="preserve"> ≈ 1,59 kHz. Přenos vybraných kmitočtů vychází takto:</w:t>
       </w:r>
     </w:p>
     <w:tbl>
@@ -7902,14 +7884,14 @@
         <w:pStyle w:val="Prvnodstavecprce"/>
       </w:pPr>
       <w:r>
-        <w:t>Složka 5 kHz projde přibližně s 30 % vstupní amplitudy, zatímco 100 Hz téměř beze změny. Změní se tedy poměr harmonických, nikoli samotné ladění struny. Při toleranci C ±10 % a přesném R leží mezní kmitočet mezi 1,45 a 1,77 kHz. Vjem rozdílu závisí na vstupním spektru a poslechových podmínkách; nelze jej rozhodnout jen podle tolerance součástky.</w:t>
+        <w:t>Složka 5 kHz projde zhruba s 30 % vstupní amplitudy, 100 Hz téměř beze změny. Mění se poměr harmonických, ladění struny zůstává. Při toleranci C ±10 % a přesném R leží mezní kmitočet mezi 1,45 a 1,77 kHz. Tolerance se projeví v charakteristice; slyšitelnost rozdílu závisí také na signálu a poslechu.</w:t>
       </w:r>
     </w:p>
     <w:p>
       <w:pPr>
         <w:pStyle w:val="Heading1"/>
       </w:pPr>
-      <w:bookmarkStart w:id="8" w:name="_Toc240101264"/>
+      <w:bookmarkStart w:id="8" w:name="_Toc240119879"/>
       <w:r>
         <w:lastRenderedPageBreak/>
         <w:t>Vazební kondenzátor a přenos basů</w:t>
@@ -7921,7 +7903,7 @@
         <w:pStyle w:val="Prvnodstavecprce"/>
       </w:pPr>
       <w:r>
-        <w:t>Vazební kondenzátor v sérii se signálem odděluje stejnosměrná pracovní napětí sousedních stupňů. Se vstupním odporem dalšího stupně tvoří horní propust. Při nízkém kmitočtu má kondenzátor velkou reaktanci, a proto větší část napětí připadá na něj. Na zátěži zbývá menší signál. [4, s. 5–6; 10]</w:t>
+        <w:t>Vazební kondenzátor v sérii se signálem odděluje stejnosměrná pracovní napětí sousedních stupňů. Se vstupním odporem dalšího stupně tvoří horní propust. Při nízkém kmitočtu má velkou reaktanci, takže si na sebe vezme větší část napětí. Na zátěž zbude méně signálu. [4, s. 5–6; 10]</w:t>
       </w:r>
     </w:p>
     <w:p>
@@ -7955,7 +7937,7 @@
         <w:t>L</w:t>
       </w:r>
       <w:r>
-        <w:t>. Impedanční dělič poskytne následující přenos:</w:t>
+        <w:t>. Napěťový dělič z impedancí dá přenos:</w:t>
       </w:r>
     </w:p>
     <w:p>
@@ -8444,7 +8426,7 @@
         <w:t>L</w:t>
       </w:r>
       <w:r>
-        <w:t xml:space="preserve"> lze odpor zdroje zanedbat. Jinak snižuje přenos v propustném pásmu a mění časovou konstantu. Nižší kmitočet pólu v takovém případě sám o sobě neznamená větší výstupní napětí.</w:t>
+        <w:t xml:space="preserve"> odpor zdroje zanedbáme. Jinak srazí přenos v propustném pásmu a posune časovou konstantu. Nižší kmitočet pólu pak sám o sobě neznamená větší výstupní napětí.</w:t>
       </w:r>
     </w:p>
     <w:p>
@@ -8487,7 +8469,7 @@
         <w:t>c</w:t>
       </w:r>
       <w:r>
-        <w:t xml:space="preserve"> ≈ 15,9 Hz, kapacita 10 nF mez přibližně 159 Hz. Tóny E₁ a H₀ odpovídají při běžném ladění A₄ = 440 Hz přibližně 41,2 a 30,9 Hz.</w:t>
+        <w:t xml:space="preserve"> ≈ 15,9 Hz, kapacita 10 nF mez přibližně 159 Hz. Tóny E₁ a H₀ mají při ladění A₄ = 440 Hz kmitočet přibližně 41,2 a 30,9 Hz.</w:t>
       </w:r>
     </w:p>
     <w:tbl>
@@ -8959,7 +8941,7 @@
         <w:pStyle w:val="Prvnodstavecprce"/>
       </w:pPr>
       <w:r>
-        <w:t>Zmenšení C na desetinu zeslabí základní složku E₁ z přibližně 0,60 dB na 12,02 dB. U H₀ vzroste útlum z 1,02 dB na 14,40 dB. Vyšší harmonické projdou lépe, takže tón může zůstat slyšitelný, ale jeho spektrální poměry se změní. Uvedená čísla jsou výsledkem modelu, ne měřením konkrétní baskytary.</w:t>
+        <w:t>Zmenšení C na desetinu zvětší útlum základní složky E₁ z 0,60 dB na 12,02 dB. U H₀ stoupne z 1,02 dB na 14,40 dB. Vyšší harmonické se zeslabují méně, a tak se mění jejich poměr k základnímu tónu. Výsledek popisuje zvolený RC model, nikoli měření konkrétní baskytary.</w:t>
       </w:r>
     </w:p>
     <w:p>
@@ -8967,7 +8949,7 @@
         <w:pStyle w:val="Dalodstavceprce"/>
       </w:pPr>
       <w:r>
-        <w:t>V kytarovém řetězci může být omezení basů před nelineárním stupněm záměrné. Mění, jaké složky jej budí a jak se na výsledku podílí zkreslení. Samotná lineární horní propust ovšem zkreslení zesilovače nesimuluje.</w:t>
+        <w:t>V kytarovém řetězci bývá takové omezení basů před zkreslujícím stupněm záměrné. Mění, které složky ten stupeň budí, a tím i charakter zkreslení. Samotná horní propust je ovšem lineární, takže zkreslení zesilovače nijak nemodeluje.</w:t>
       </w:r>
     </w:p>
     <w:p>
@@ -9011,14 +8993,14 @@
         <w:t>L</w:t>
       </w:r>
       <w:r>
-        <w:t>C. Kondenzátor tedy potlačuje ustálenou stejnosměrnou složku, ale neodstraňuje okamžitě přechodový děj.</w:t>
+        <w:t>C. Kondenzátor tedy potlačuje ustálenou stejnosměrnou složku, přechodový děj ale neodstraní okamžitě.</w:t>
       </w:r>
     </w:p>
     <w:p>
       <w:pPr>
         <w:pStyle w:val="Heading1"/>
       </w:pPr>
-      <w:bookmarkStart w:id="9" w:name="_Toc240101265"/>
+      <w:bookmarkStart w:id="9" w:name="_Toc240119880"/>
       <w:r>
         <w:lastRenderedPageBreak/>
         <w:t>Bicí a časové řízení signálu</w:t>
@@ -9030,7 +9012,7 @@
         <w:pStyle w:val="Prvnodstavecprce"/>
       </w:pPr>
       <w:r>
-        <w:t>Při zpracování bicích je podstatný nástup úderu a další vývoj jeho amplitudy. RC článek se může uplatnit v obálkovém detektoru nebo generátoru obálky. Napětí na kondenzátoru zde slouží jako řídicí veličina pro zesílení či filtraci. Není totožné se zvukovou vlnou bubnu.</w:t>
+        <w:t>U bicích rozhoduje nástup úderu a to, jak rychle pak amplituda klesá. RC článek najdeme v obálkovém detektoru i v generátoru obálky. Napětí na kondenzátoru tam řídí zesílení nebo filtraci. Se zvukovou vlnou bubnu totožné není.</w:t>
       </w:r>
     </w:p>
     <w:p>
@@ -9046,7 +9028,7 @@
         <w:pStyle w:val="Prvnodstavecprce"/>
       </w:pPr>
       <w:r>
-        <w:t>Jednoduchý detektor obsahuje usměrňovač a kondenzátor s vybíjecí cestou. Když vstupní napětí převýší napětí kondenzátoru a úbytek na diodě, kondenzátor se nabíjí. Po poklesu vstupu se dioda zavře a kondenzátor se vybíjí přes odpor. Čas nabíjení a vybíjení se proto může lišit. Samotná dolní propust připojená k symetrickému zvukovému signálu jeho kladnou amplitudovou obálku obecně nevytvoří. [11, část Peak Detector]</w:t>
+        <w:t>Jednoduchý detektor má usměrňovač a kondenzátor s vybíjecí cestou. Jakmile vstupní napětí převýší napětí kondenzátoru zvětšené o úbytek na diodě, kondenzátor se nabíjí. Po poklesu vstupu se dioda zavře a náboj odtéká přes odpor. Nabíjení a vybíjení proto mohou mít docela jiné časy. Pouhá dolní propust připojená k symetrickému zvukovému signálu kladnou obálku nevytvoří. [11, část Peak Detector]</w:t>
       </w:r>
     </w:p>
     <w:p>
@@ -9440,7 +9422,7 @@
           <w:noProof/>
         </w:rPr>
         <w:drawing>
-          <wp:inline distT="0" distB="0" distL="0" distR="0" wp14:anchorId="63B11AF6" wp14:editId="1C643C8A">
+          <wp:inline distT="0" distB="0" distL="0" distR="0" wp14:anchorId="603629C6" wp14:editId="18ED6B5F">
             <wp:extent cx="4140000" cy="1571583"/>
             <wp:effectExtent l="0" t="0" r="0" b="0"/>
             <wp:docPr id="1326772257" name="Picture 1326772257"/>
@@ -9490,7 +9472,7 @@
         <w:pStyle w:val="Prvnodstavecprce"/>
       </w:pPr>
       <w:r>
-        <w:t>Po 10 ms je napětí 0,632 V, na konci impulzu 0,993 V. Za dalších 100 ms klesne na 0,366 V. Pokles na desetinu hodnoty na konci impulzu trvá přibližně 230 ms.</w:t>
+        <w:t>Po 10 ms je napětí 0,632 V, na konci impulzu 0,993 V. Za dalších 100 ms klesne na 0,366 V. Pokles na desetinu hodnoty z konce impulzu trvá přibližně 230 ms.</w:t>
       </w:r>
     </w:p>
     <w:p>
@@ -9506,7 +9488,7 @@
         <w:pStyle w:val="Prvnodstavecprce"/>
       </w:pPr>
       <w:r>
-        <w:t>Krátká reakce detektoru umožní kompresoru zasáhnout do počátku úderu. Delší reakce může část špičky propustit. Analog Devices uvádí tento rozdíl i na příkladu malého bubnu. Konkrétní zařízení však definuje vlastní parametry attack, hold a release, které nelze bez znalosti měřicího postupu ztotožnit s jedinou konstantou RC. [12]</w:t>
+        <w:t>Krátká reakce detektoru umožní kompresoru zasáhnout do začátku úderu. Delší reakce může část špičky propustit. Analog Devices tento rozdíl popisuje na příkladu malého bubnu. Parametry attack, hold a release závisejí na konstrukci a způsobu měření, proto je nelze automaticky ztotožnit s jedinou konstantou RC. [12]</w:t>
       </w:r>
     </w:p>
     <w:p>
@@ -9514,14 +9496,14 @@
         <w:pStyle w:val="Dalodstavceprce"/>
       </w:pPr>
       <w:r>
-        <w:t>Rychlé sledování může zvlnit řídicí napětí, pomalé spojovat sousední údery. RC článek není úplný kompresor ani model vibrací bubnu.</w:t>
+        <w:t>Příliš rychlé sledování může zvlnit řídicí napětí. Pomalý pokles je zase může udržet zvýšené až do dalšího úderu. Vhodné časy proto závisejí na zpracovávaném signálu.</w:t>
       </w:r>
     </w:p>
     <w:p>
       <w:pPr>
         <w:pStyle w:val="Heading1"/>
       </w:pPr>
-      <w:bookmarkStart w:id="10" w:name="_Toc240101266"/>
+      <w:bookmarkStart w:id="10" w:name="_Toc240119881"/>
       <w:r>
         <w:lastRenderedPageBreak/>
         <w:t>Elektrické pole a kontrola modelu</w:t>
@@ -9542,7 +9524,7 @@
         <w:t>C</w:t>
       </w:r>
       <w:r>
-        <w:t>(t)/d spojuje obvodové napětí s dějem mezi elektrodami. Při stejné geometrii sleduje intenzita pole časový průběh napětí. Při nabíjení se přibližuje konečné hodnotě, při vybíjení klesá. Následující vizualizace používá homogenní deskový model bez okrajových jevů. [3, kap. 5.2 a 5.4]</w:t>
+        <w:t>(t)/d převádí obvodové napětí na děj mezi elektrodami. Při neměnné geometrii kopíruje intenzita pole průběh napětí. Při nabíjení se blíží konečné hodnotě, při vybíjení klesá. Obrázek níže používá homogenní deskový model bez okrajových jevů. [3, kap. 5.2 a 5.4]</w:t>
       </w:r>
     </w:p>
     <w:p>
@@ -9557,7 +9539,7 @@
           <w:noProof/>
         </w:rPr>
         <w:drawing>
-          <wp:inline distT="0" distB="0" distL="0" distR="0" wp14:anchorId="4C73468F" wp14:editId="7D66C046">
+          <wp:inline distT="0" distB="0" distL="0" distR="0" wp14:anchorId="673CD834" wp14:editId="243F21AD">
             <wp:extent cx="4608000" cy="1369043"/>
             <wp:effectExtent l="0" t="0" r="0" b="0"/>
             <wp:docPr id="1326772258" name="Picture 1326772258"/>
@@ -9615,7 +9597,7 @@
         <w:pStyle w:val="Prvnodstavecprce"/>
       </w:pPr>
       <w:r>
-        <w:t>Pro ilustraci zvolíme U = 5 V a d = 1 mm. Konečná intenzita je 5 000 V/m a v čase τ přibližně 3 161 V/m. Tento geometrický příklad je samostatný. Netvrdí, že kondenzátor 1 µF z numerické úlohy má právě takovou vzdálenost elektrod.</w:t>
+        <w:t>Pro U = 5 V a d = 1 mm vychází konečná intenzita 5 000 V/m a v čase τ přibližně 3 161 V/m. Vzdálenost elektrod volím jen kvůli názornosti tohoto geometrického příkladu.</w:t>
       </w:r>
     </w:p>
     <w:p>
@@ -9623,7 +9605,7 @@
         <w:pStyle w:val="Dalodstavceprce"/>
       </w:pPr>
       <w:r>
-        <w:t>V čase τ dosahuje napětí i intenzita 63,21 % konečné hodnoty. Energie ale závisí na druhé mocnině napětí. Uloženo je proto jen (1 − e⁻¹)² ≈ 39,96 % konečné energie. Poměr energie nelze zaměnit s poměrem napětí. [3, kap. 5.4]</w:t>
+        <w:t>V čase τ dosahují napětí i intenzita 63,21 % konečné hodnoty. Energie závisí na druhé mocnině napětí, takže uloženo je (1 − e⁻¹)² ≈ 39,96 % konečné energie. Zbývajících přibližně 60 % se uloží později. Poměr energií tedy nelze zaměňovat s poměrem napětí. [3, kap. 5.4]</w:t>
       </w:r>
     </w:p>
     <w:p>
@@ -9639,7 +9621,7 @@
         <w:pStyle w:val="Prvnodstavecprce"/>
       </w:pPr>
       <w:r>
-        <w:t>Analytické řešení lze prověřit dosazením do původní rovnice, kontrolou počáteční podmínky a součtem napětí. Pro energii je nezávislou kontrolou numerická integrace i²R a porovnání s prací zdroje a energií kondenzátoru. Tyto kontroly zachytí například chybějící dvojku v exponentu nebo nesprávné znaménko při vybíjení.</w:t>
+        <w:t>Odvozené řešení si ověřím dosazením zpět do rovnice, kontrolou počáteční podmínky a součtem napětí. U energie je nezávislou kontrolou numerická integrace i²R porovnaná s prací zdroje a energií kondenzátoru. Takové kontroly odhalí chybějící dvojku v exponentu i obrácené znaménko při vybíjení.</w:t>
       </w:r>
     </w:p>
     <w:p>
@@ -9647,7 +9629,7 @@
         <w:pStyle w:val="Dalodstavceprce"/>
       </w:pPr>
       <w:r>
-        <w:t>V kontrolním výpočtu pro U = 5 V, R = 10 kΩ a C = 1 µF byla energie do τ určena analyticky i lichoběžníkovou integrací se 100 000 intervaly. Obě metody daly přibližně 10,808309 µJ. Numerická integrace potvrzuje shodu implementace s odvozeným vztahem; není důkazem vlastností skutečného kondenzátoru.</w:t>
+        <w:t>Pro U = 5 V, R = 10 kΩ a C = 1 µF jsem energii do τ spočítal analyticky i lichoběžníkovou integrací se 100 000 intervaly. Obě cesty daly 10,808309 µJ.</w:t>
       </w:r>
     </w:p>
     <w:p>
@@ -9663,14 +9645,14 @@
         <w:pStyle w:val="Prvnodstavecprce"/>
       </w:pPr>
       <w:r>
-        <w:t>Na nízkonapěťový obvod lze přivést skok a osciloskopem odečíst τ při dosažení 63,2 % změny. Přenos lze měřit sinusovým signálem s proměnným kmitočtem. Výsledek ovlivní i odpor generátoru a zatížení sondou. Tento experiment nebyl proveden; práce používá analytický a výpočetní model.</w:t>
+        <w:t>Na nízkonapěťovém obvodu by stačilo přivést skok a osciloskopem odečíst čas, kdy napětí dosáhne 63,2 % změny. Přenos by se změřil sinusovým signálem s proměnným kmitočtem. Do výsledku by promluvil odpor generátoru i zatížení sondou. Měření jsem neprováděl, práce stojí na výpočtu.</w:t>
       </w:r>
     </w:p>
     <w:p>
       <w:pPr>
         <w:pStyle w:val="Heading1"/>
       </w:pPr>
-      <w:bookmarkStart w:id="11" w:name="_Toc240101267"/>
+      <w:bookmarkStart w:id="11" w:name="_Toc240119882"/>
       <w:r>
         <w:lastRenderedPageBreak/>
         <w:t>Interaktivní simulace k zápočtovému projektu</w:t>
@@ -9682,7 +9664,7 @@
         <w:pStyle w:val="Prvnodstavecprce"/>
       </w:pPr>
       <w:r>
-        <w:t>K této práci jsem vytvořil simulaci RC Audio Lab, abych lépe porozuměl odvozeným výpočtům. Propojuje je s hudební elektronikou, kterou znám při hře na kytaru, baskytaru a bicí. K poslechu přidává grafy napětí, proudu a přenosu a ukazuje účinek změny součástek. [2]</w:t>
+        <w:t>K této práci jsem si naprogramoval simulaci RC Audio Lab, abych odvozeným výpočtům lépe rozuměl. Propojuje je s hudební elektronikou, kterou znám z hraní na kytaru, baskytaru a bicí. Kromě grafů napětí, proudu a přenosu umí obvod také přehrát. [2]</w:t>
       </w:r>
     </w:p>
     <w:p>
@@ -9697,8 +9679,8 @@
           <w:noProof/>
         </w:rPr>
         <w:drawing>
-          <wp:inline distT="0" distB="0" distL="0" distR="0" wp14:anchorId="69EB45F2" wp14:editId="01E75352">
-            <wp:extent cx="4824000" cy="1262859"/>
+          <wp:inline distT="0" distB="0" distL="0" distR="0" wp14:anchorId="24FBBB12" wp14:editId="6844777B">
+            <wp:extent cx="4824000" cy="2205257"/>
             <wp:effectExtent l="0" t="0" r="0" b="0"/>
             <wp:docPr id="1326772259" name="Picture 1326772259"/>
             <wp:cNvGraphicFramePr>
@@ -9720,7 +9702,7 @@
                   <pic:spPr>
                     <a:xfrm>
                       <a:off x="0" y="0"/>
-                      <a:ext cx="4824000" cy="1262859"/>
+                      <a:ext cx="4824000" cy="2205257"/>
                     </a:xfrm>
                     <a:prstGeom prst="rect">
                       <a:avLst/>
@@ -9739,7 +9721,7 @@
         <w:spacing w:after="140"/>
       </w:pPr>
       <w:r>
-        <w:t>Obrázek 7 Ovládání vlastní simulace RC Audio Lab. Odpor lze měnit posuvníkem i otočným ovladačem u rezistoru. Snímek vlastní aplikace. [2]</w:t>
+        <w:t>Obrázek 7 Ovládání vlastní simulace RC Audio Lab v režimu dolní propusti. Odpor lze měnit posuvníkem i otočným ovladačem u rezistoru. Snímek vlastní aplikace. [2]</w:t>
       </w:r>
     </w:p>
     <w:p>
@@ -9747,7 +9729,7 @@
         <w:pStyle w:val="Heading2"/>
       </w:pPr>
       <w:r>
-        <w:t>Změna parametrů a zvuk</w:t>
+        <w:t>Dvě odbočky téhož obvodu</w:t>
       </w:r>
     </w:p>
     <w:p>
@@ -9755,25 +9737,7 @@
         <w:pStyle w:val="Prvnodstavecprce"/>
       </w:pPr>
       <w:r>
-        <w:t>V časovém režimu lze nastavit U, R a C, přepnout nabíjení a vybíjení a zastavit děj v čase τ. Frekvenční režim ukazuje amplitudu a fázi horní propusti. Oba režimy používají stejné R a C. Pro výchozí R = 100 kΩ, C = 10 nF a U = 5 V vychází τ = 1 ms, f</w:t>
-      </w:r>
-      <w:r>
-        <w:rPr>
-          <w:vertAlign w:val="subscript"/>
-        </w:rPr>
-        <w:t>c</w:t>
-      </w:r>
-      <w:r>
-        <w:t xml:space="preserve"> ≈ 159 Hz a W</w:t>
-      </w:r>
-      <w:r>
-        <w:rPr>
-          <w:vertAlign w:val="subscript"/>
-        </w:rPr>
-        <w:t>R</w:t>
-      </w:r>
-      <w:r>
-        <w:t>(τ) ≈ 108 nJ.</w:t>
+        <w:t>Odbočku výstupu lze přepnout. Na rezistoru vzniká horní propust, tedy vazební člen mezi zesilovacími stupni. Na kondenzátoru dolní propust, což je zapojení tónové clony. Schéma přitom obě součástky prohodí, protože u dolní propusti leží v sérii rezistor. R i C zůstávají stejné, takže je vidět, že jde pořád o týž článek.</w:t>
       </w:r>
     </w:p>
     <w:p>
@@ -9781,7 +9745,15 @@
         <w:pStyle w:val="Dalodstavceprce"/>
       </w:pPr>
       <w:r>
-        <w:t>Zvuková ukázka používá nahrávku elektrické kytary z knihovny FreePats pod CC0. Z jednoho tónu vzniká krátký riff změnou výšky jednotlivých not. Druhá varianta je posunutá o oktávu níž; není vydávána za samostatnou nahrávku baskytary. Přepínač A/B zachovává stejné vstupní zesílení a R i C lze měnit během přehrávání. [13]</w:t>
+        <w:t>Slyšet je rozdíl především na dolní propusti. Při R = 10 kΩ a C = 47 nF leží mezní kmitočet na 339 Hz a z kytarové nahrávky ubude 16,4 dB energie nad 2 kHz. Tuto hodnotu měří automatický test přímo na vykresleném zvuku. Horní propust na 159 Hz proti tomu odebere jen basy, které reproduktory notebooku stejně nepřenesou.</w:t>
+      </w:r>
+    </w:p>
+    <w:p>
+      <w:pPr>
+        <w:pStyle w:val="Dalodstavceprce"/>
+      </w:pPr>
+      <w:r>
+        <w:t>Zvuková ukázka stojí na nahrávce elektrické kytary z knihovny FreePats pod licencí CC0. Z jednoho tónu skládám krátký riff přeladěním jednotlivých not. Přepínač A/B drží stejné vstupní zesílení a R i C jdou měnit za chodu. [13]</w:t>
       </w:r>
     </w:p>
     <w:p>
@@ -9789,7 +9761,7 @@
         <w:pStyle w:val="Heading2"/>
       </w:pPr>
       <w:r>
-        <w:t>Digitální výpočet a ověření</w:t>
+        <w:t>Změřený přenos proti vypočtenému</w:t>
       </w:r>
     </w:p>
     <w:p>
@@ -9797,7 +9769,7 @@
         <w:pStyle w:val="Prvnodstavecprce"/>
       </w:pPr>
       <w:r>
-        <w:t>Zvuk zpracovává filtr prvního řádu v AudioWorkletu. Jeho koeficient vzniká bilineární transformací s přizpůsobením mezního kmitočtu. Pro ustálené parametry platí: [14; 2]</w:t>
+        <w:t>Zvuk zpracovává filtr prvního řádu v AudioWorkletu. Jeho koeficienty vzniknou bilineární transformací s přizpůsobením mezního kmitočtu. Pro dolní propust a ustálené parametry platí: [14; 2]</w:t>
       </w:r>
     </w:p>
     <w:p>
@@ -9866,8 +9838,16 @@
               </m:r>
             </m:sub>
           </m:sSub>
+          <m:r>
+            <w:rPr>
+              <w:rFonts w:ascii="Cambria Math" w:hAnsi="Cambria Math"/>
+            </w:rPr>
+            <m:t>x</m:t>
+          </m:r>
           <m:d>
             <m:dPr>
+              <m:begChr m:val="["/>
+              <m:endChr m:val="]"/>
               <m:ctrlPr>
                 <w:rPr>
                   <w:rFonts w:ascii="Cambria Math" w:hAnsi="Cambria Math"/>
@@ -9880,12 +9860,325 @@
                 <w:rPr>
                   <w:rFonts w:ascii="Cambria Math" w:hAnsi="Cambria Math"/>
                 </w:rPr>
-                <m:t>x</m:t>
+                <m:t>n</m:t>
               </m:r>
+            </m:e>
+          </m:d>
+          <m:r>
+            <w:rPr>
+              <w:rFonts w:ascii="Cambria Math" w:hAnsi="Cambria Math"/>
+            </w:rPr>
+            <m:t xml:space="preserve">+ </m:t>
+          </m:r>
+          <m:sSub>
+            <m:sSubPr>
+              <m:ctrlPr>
+                <w:rPr>
+                  <w:rFonts w:ascii="Cambria Math" w:hAnsi="Cambria Math"/>
+                  <w:i/>
+                </w:rPr>
+              </m:ctrlPr>
+            </m:sSubPr>
+            <m:e>
+              <m:r>
+                <w:rPr>
+                  <w:rFonts w:ascii="Cambria Math" w:hAnsi="Cambria Math"/>
+                </w:rPr>
+                <m:t>b</m:t>
+              </m:r>
+            </m:e>
+            <m:sub>
+              <m:r>
+                <w:rPr>
+                  <w:rFonts w:ascii="Cambria Math" w:hAnsi="Cambria Math"/>
+                </w:rPr>
+                <m:t>1</m:t>
+              </m:r>
+            </m:sub>
+          </m:sSub>
+          <m:r>
+            <w:rPr>
+              <w:rFonts w:ascii="Cambria Math" w:hAnsi="Cambria Math"/>
+            </w:rPr>
+            <m:t>x</m:t>
+          </m:r>
+          <m:d>
+            <m:dPr>
+              <m:begChr m:val="["/>
+              <m:endChr m:val="]"/>
+              <m:ctrlPr>
+                <w:rPr>
+                  <w:rFonts w:ascii="Cambria Math" w:hAnsi="Cambria Math"/>
+                  <w:i/>
+                </w:rPr>
+              </m:ctrlPr>
+            </m:dPr>
+            <m:e>
+              <m:r>
+                <w:rPr>
+                  <w:rFonts w:ascii="Cambria Math" w:hAnsi="Cambria Math"/>
+                </w:rPr>
+                <m:t>n-1</m:t>
+              </m:r>
+            </m:e>
+          </m:d>
+          <m:r>
+            <w:rPr>
+              <w:rFonts w:ascii="Cambria Math" w:hAnsi="Cambria Math"/>
+            </w:rPr>
+            <m:t xml:space="preserve">- </m:t>
+          </m:r>
+          <m:sSub>
+            <m:sSubPr>
+              <m:ctrlPr>
+                <w:rPr>
+                  <w:rFonts w:ascii="Cambria Math" w:hAnsi="Cambria Math"/>
+                  <w:i/>
+                </w:rPr>
+              </m:ctrlPr>
+            </m:sSubPr>
+            <m:e>
+              <m:r>
+                <w:rPr>
+                  <w:rFonts w:ascii="Cambria Math" w:hAnsi="Cambria Math"/>
+                </w:rPr>
+                <m:t>a</m:t>
+              </m:r>
+            </m:e>
+            <m:sub>
+              <m:r>
+                <w:rPr>
+                  <w:rFonts w:ascii="Cambria Math" w:hAnsi="Cambria Math"/>
+                </w:rPr>
+                <m:t>1</m:t>
+              </m:r>
+            </m:sub>
+          </m:sSub>
+          <m:r>
+            <w:rPr>
+              <w:rFonts w:ascii="Cambria Math" w:hAnsi="Cambria Math"/>
+            </w:rPr>
+            <m:t>y</m:t>
+          </m:r>
+          <m:d>
+            <m:dPr>
+              <m:begChr m:val="["/>
+              <m:endChr m:val="]"/>
+              <m:ctrlPr>
+                <w:rPr>
+                  <w:rFonts w:ascii="Cambria Math" w:hAnsi="Cambria Math"/>
+                  <w:i/>
+                </w:rPr>
+              </m:ctrlPr>
+            </m:dPr>
+            <m:e>
+              <m:r>
+                <w:rPr>
+                  <w:rFonts w:ascii="Cambria Math" w:hAnsi="Cambria Math"/>
+                </w:rPr>
+                <m:t>n-1</m:t>
+              </m:r>
+            </m:e>
+          </m:d>
+        </m:oMath>
+      </m:oMathPara>
+    </w:p>
+    <w:p>
+      <w:pPr>
+        <w:pStyle w:val="Prvnodstavecprce"/>
+        <w:spacing w:before="60" w:after="60" w:line="240" w:lineRule="auto"/>
+        <w:jc w:val="center"/>
+      </w:pPr>
+      <m:oMathPara>
+        <m:oMath>
+          <m:sSub>
+            <m:sSubPr>
+              <m:ctrlPr>
+                <w:rPr>
+                  <w:rFonts w:ascii="Cambria Math" w:hAnsi="Cambria Math"/>
+                  <w:i/>
+                </w:rPr>
+              </m:ctrlPr>
+            </m:sSubPr>
+            <m:e>
+              <m:r>
+                <w:rPr>
+                  <w:rFonts w:ascii="Cambria Math" w:hAnsi="Cambria Math"/>
+                </w:rPr>
+                <m:t>b</m:t>
+              </m:r>
+            </m:e>
+            <m:sub>
+              <m:r>
+                <w:rPr>
+                  <w:rFonts w:ascii="Cambria Math" w:hAnsi="Cambria Math"/>
+                </w:rPr>
+                <m:t>0</m:t>
+              </m:r>
+            </m:sub>
+          </m:sSub>
+          <m:r>
+            <w:rPr>
+              <w:rFonts w:ascii="Cambria Math" w:hAnsi="Cambria Math"/>
+            </w:rPr>
+            <m:t xml:space="preserve">= </m:t>
+          </m:r>
+          <m:sSub>
+            <m:sSubPr>
+              <m:ctrlPr>
+                <w:rPr>
+                  <w:rFonts w:ascii="Cambria Math" w:hAnsi="Cambria Math"/>
+                  <w:i/>
+                </w:rPr>
+              </m:ctrlPr>
+            </m:sSubPr>
+            <m:e>
+              <m:r>
+                <w:rPr>
+                  <w:rFonts w:ascii="Cambria Math" w:hAnsi="Cambria Math"/>
+                </w:rPr>
+                <m:t>b</m:t>
+              </m:r>
+            </m:e>
+            <m:sub>
+              <m:r>
+                <w:rPr>
+                  <w:rFonts w:ascii="Cambria Math" w:hAnsi="Cambria Math"/>
+                </w:rPr>
+                <m:t>1</m:t>
+              </m:r>
+            </m:sub>
+          </m:sSub>
+          <m:r>
+            <w:rPr>
+              <w:rFonts w:ascii="Cambria Math" w:hAnsi="Cambria Math"/>
+            </w:rPr>
+            <m:t>=</m:t>
+          </m:r>
+          <m:f>
+            <m:fPr>
+              <m:ctrlPr>
+                <w:rPr>
+                  <w:rFonts w:ascii="Cambria Math" w:hAnsi="Cambria Math"/>
+                  <w:i/>
+                </w:rPr>
+              </m:ctrlPr>
+            </m:fPr>
+            <m:num>
+              <m:r>
+                <w:rPr>
+                  <w:rFonts w:ascii="Cambria Math" w:hAnsi="Cambria Math"/>
+                </w:rPr>
+                <m:t>k</m:t>
+              </m:r>
+            </m:num>
+            <m:den>
+              <m:r>
+                <w:rPr>
+                  <w:rFonts w:ascii="Cambria Math" w:hAnsi="Cambria Math"/>
+                </w:rPr>
+                <m:t>1 + k</m:t>
+              </m:r>
+            </m:den>
+          </m:f>
+          <m:r>
+            <w:rPr>
+              <w:rFonts w:ascii="Cambria Math" w:hAnsi="Cambria Math"/>
+            </w:rPr>
+            <m:t xml:space="preserve">    ;     </m:t>
+          </m:r>
+          <m:sSub>
+            <m:sSubPr>
+              <m:ctrlPr>
+                <w:rPr>
+                  <w:rFonts w:ascii="Cambria Math" w:hAnsi="Cambria Math"/>
+                  <w:i/>
+                </w:rPr>
+              </m:ctrlPr>
+            </m:sSubPr>
+            <m:e>
+              <m:r>
+                <w:rPr>
+                  <w:rFonts w:ascii="Cambria Math" w:hAnsi="Cambria Math"/>
+                </w:rPr>
+                <m:t>a</m:t>
+              </m:r>
+            </m:e>
+            <m:sub>
+              <m:r>
+                <w:rPr>
+                  <w:rFonts w:ascii="Cambria Math" w:hAnsi="Cambria Math"/>
+                </w:rPr>
+                <m:t>1</m:t>
+              </m:r>
+            </m:sub>
+          </m:sSub>
+          <m:r>
+            <w:rPr>
+              <w:rFonts w:ascii="Cambria Math" w:hAnsi="Cambria Math"/>
+            </w:rPr>
+            <m:t>=</m:t>
+          </m:r>
+          <m:f>
+            <m:fPr>
+              <m:ctrlPr>
+                <w:rPr>
+                  <w:rFonts w:ascii="Cambria Math" w:hAnsi="Cambria Math"/>
+                  <w:i/>
+                </w:rPr>
+              </m:ctrlPr>
+            </m:fPr>
+            <m:num>
+              <m:r>
+                <w:rPr>
+                  <w:rFonts w:ascii="Cambria Math" w:hAnsi="Cambria Math"/>
+                </w:rPr>
+                <m:t>k - 1</m:t>
+              </m:r>
+            </m:num>
+            <m:den>
+              <m:r>
+                <w:rPr>
+                  <w:rFonts w:ascii="Cambria Math" w:hAnsi="Cambria Math"/>
+                </w:rPr>
+                <m:t>k + 1</m:t>
+              </m:r>
+            </m:den>
+          </m:f>
+          <m:r>
+            <w:rPr>
+              <w:rFonts w:ascii="Cambria Math" w:hAnsi="Cambria Math"/>
+            </w:rPr>
+            <m:t xml:space="preserve">    ;     k =</m:t>
+          </m:r>
+          <m:func>
+            <m:funcPr>
+              <m:ctrlPr>
+                <w:rPr>
+                  <w:rFonts w:ascii="Cambria Math" w:hAnsi="Cambria Math"/>
+                </w:rPr>
+              </m:ctrlPr>
+            </m:funcPr>
+            <m:fName>
+              <m:r>
+                <m:rPr>
+                  <m:sty m:val="p"/>
+                </m:rPr>
+                <w:rPr>
+                  <w:rFonts w:ascii="Cambria Math" w:hAnsi="Cambria Math"/>
+                </w:rPr>
+                <m:t>tan</m:t>
+              </m:r>
+              <m:ctrlPr>
+                <w:rPr>
+                  <w:rFonts w:ascii="Cambria Math" w:hAnsi="Cambria Math"/>
+                  <w:i/>
+                </w:rPr>
+              </m:ctrlPr>
+            </m:fName>
+            <m:e>
               <m:d>
                 <m:dPr>
-                  <m:begChr m:val="["/>
-                  <m:endChr m:val="]"/>
                   <m:ctrlPr>
                     <w:rPr>
                       <w:rFonts w:ascii="Cambria Math" w:hAnsi="Cambria Math"/>
@@ -9898,299 +10191,76 @@
                     <w:rPr>
                       <w:rFonts w:ascii="Cambria Math" w:hAnsi="Cambria Math"/>
                     </w:rPr>
-                    <m:t>n</m:t>
+                    <m:t>π</m:t>
                   </m:r>
-                </m:e>
-              </m:d>
-              <m:r>
-                <w:rPr>
-                  <w:rFonts w:ascii="Cambria Math" w:hAnsi="Cambria Math"/>
-                </w:rPr>
-                <m:t>- x</m:t>
-              </m:r>
-              <m:d>
-                <m:dPr>
-                  <m:begChr m:val="["/>
-                  <m:endChr m:val="]"/>
-                  <m:ctrlPr>
-                    <w:rPr>
-                      <w:rFonts w:ascii="Cambria Math" w:hAnsi="Cambria Math"/>
-                      <w:i/>
-                    </w:rPr>
-                  </m:ctrlPr>
-                </m:dPr>
-                <m:e>
-                  <m:r>
-                    <w:rPr>
-                      <w:rFonts w:ascii="Cambria Math" w:hAnsi="Cambria Math"/>
-                    </w:rPr>
-                    <m:t>n-1</m:t>
-                  </m:r>
-                </m:e>
-              </m:d>
-            </m:e>
-          </m:d>
-          <m:r>
-            <w:rPr>
-              <w:rFonts w:ascii="Cambria Math" w:hAnsi="Cambria Math"/>
-            </w:rPr>
-            <m:t xml:space="preserve">+ </m:t>
-          </m:r>
-          <m:d>
-            <m:dPr>
-              <m:ctrlPr>
-                <w:rPr>
-                  <w:rFonts w:ascii="Cambria Math" w:hAnsi="Cambria Math"/>
-                  <w:i/>
-                </w:rPr>
-              </m:ctrlPr>
-            </m:dPr>
-            <m:e>
-              <m:r>
-                <w:rPr>
-                  <w:rFonts w:ascii="Cambria Math" w:hAnsi="Cambria Math"/>
-                </w:rPr>
-                <m:t>2</m:t>
-              </m:r>
-              <m:sSub>
-                <m:sSubPr>
-                  <m:ctrlPr>
-                    <w:rPr>
-                      <w:rFonts w:ascii="Cambria Math" w:hAnsi="Cambria Math"/>
-                      <w:i/>
-                    </w:rPr>
-                  </m:ctrlPr>
-                </m:sSubPr>
-                <m:e>
-                  <m:r>
-                    <w:rPr>
-                      <w:rFonts w:ascii="Cambria Math" w:hAnsi="Cambria Math"/>
-                    </w:rPr>
-                    <m:t>b</m:t>
-                  </m:r>
-                </m:e>
-                <m:sub>
-                  <m:r>
-                    <w:rPr>
-                      <w:rFonts w:ascii="Cambria Math" w:hAnsi="Cambria Math"/>
-                    </w:rPr>
-                    <m:t>0</m:t>
-                  </m:r>
-                </m:sub>
-              </m:sSub>
-              <m:r>
-                <w:rPr>
-                  <w:rFonts w:ascii="Cambria Math" w:hAnsi="Cambria Math"/>
-                </w:rPr>
-                <m:t>- 1</m:t>
-              </m:r>
-            </m:e>
-          </m:d>
-          <m:r>
-            <w:rPr>
-              <w:rFonts w:ascii="Cambria Math" w:hAnsi="Cambria Math"/>
-            </w:rPr>
-            <m:t>y</m:t>
-          </m:r>
-          <m:d>
-            <m:dPr>
-              <m:begChr m:val="["/>
-              <m:endChr m:val="]"/>
-              <m:ctrlPr>
-                <w:rPr>
-                  <w:rFonts w:ascii="Cambria Math" w:hAnsi="Cambria Math"/>
-                  <w:i/>
-                </w:rPr>
-              </m:ctrlPr>
-            </m:dPr>
-            <m:e>
-              <m:r>
-                <w:rPr>
-                  <w:rFonts w:ascii="Cambria Math" w:hAnsi="Cambria Math"/>
-                </w:rPr>
-                <m:t>n-1</m:t>
-              </m:r>
-            </m:e>
-          </m:d>
-        </m:oMath>
-      </m:oMathPara>
-    </w:p>
-    <w:p>
-      <w:pPr>
-        <w:pStyle w:val="Prvnodstavecprce"/>
-        <w:spacing w:before="60" w:after="60" w:line="240" w:lineRule="auto"/>
-        <w:jc w:val="center"/>
-      </w:pPr>
-      <m:oMathPara>
-        <m:oMath>
-          <m:sSub>
-            <m:sSubPr>
-              <m:ctrlPr>
-                <w:rPr>
-                  <w:rFonts w:ascii="Cambria Math" w:hAnsi="Cambria Math"/>
-                  <w:i/>
-                </w:rPr>
-              </m:ctrlPr>
-            </m:sSubPr>
-            <m:e>
-              <m:r>
-                <w:rPr>
-                  <w:rFonts w:ascii="Cambria Math" w:hAnsi="Cambria Math"/>
-                </w:rPr>
-                <m:t>b</m:t>
-              </m:r>
-            </m:e>
-            <m:sub>
-              <m:r>
-                <w:rPr>
-                  <w:rFonts w:ascii="Cambria Math" w:hAnsi="Cambria Math"/>
-                </w:rPr>
-                <m:t>0</m:t>
-              </m:r>
-            </m:sub>
-          </m:sSub>
-          <m:r>
-            <w:rPr>
-              <w:rFonts w:ascii="Cambria Math" w:hAnsi="Cambria Math"/>
-            </w:rPr>
-            <m:t>=</m:t>
-          </m:r>
-          <m:f>
-            <m:fPr>
-              <m:ctrlPr>
-                <w:rPr>
-                  <w:rFonts w:ascii="Cambria Math" w:hAnsi="Cambria Math"/>
-                  <w:i/>
-                </w:rPr>
-              </m:ctrlPr>
-            </m:fPr>
-            <m:num>
-              <m:r>
-                <w:rPr>
-                  <w:rFonts w:ascii="Cambria Math" w:hAnsi="Cambria Math"/>
-                </w:rPr>
-                <m:t>1</m:t>
-              </m:r>
-            </m:num>
-            <m:den>
-              <m:r>
-                <w:rPr>
-                  <w:rFonts w:ascii="Cambria Math" w:hAnsi="Cambria Math"/>
-                </w:rPr>
-                <m:t>1 +</m:t>
-              </m:r>
-              <m:func>
-                <m:funcPr>
-                  <m:ctrlPr>
-                    <w:rPr>
-                      <w:rFonts w:ascii="Cambria Math" w:hAnsi="Cambria Math"/>
-                    </w:rPr>
-                  </m:ctrlPr>
-                </m:funcPr>
-                <m:fName>
-                  <m:r>
-                    <m:rPr>
-                      <m:sty m:val="p"/>
-                    </m:rPr>
-                    <w:rPr>
-                      <w:rFonts w:ascii="Cambria Math" w:hAnsi="Cambria Math"/>
-                    </w:rPr>
-                    <m:t>tan</m:t>
-                  </m:r>
-                  <m:ctrlPr>
-                    <w:rPr>
-                      <w:rFonts w:ascii="Cambria Math" w:hAnsi="Cambria Math"/>
-                      <w:i/>
-                    </w:rPr>
-                  </m:ctrlPr>
-                </m:fName>
-                <m:e>
-                  <m:d>
-                    <m:dPr>
+                  <m:f>
+                    <m:fPr>
                       <m:ctrlPr>
                         <w:rPr>
                           <w:rFonts w:ascii="Cambria Math" w:hAnsi="Cambria Math"/>
                           <w:i/>
                         </w:rPr>
                       </m:ctrlPr>
-                    </m:dPr>
-                    <m:e>
-                      <m:r>
-                        <w:rPr>
-                          <w:rFonts w:ascii="Cambria Math" w:hAnsi="Cambria Math"/>
-                        </w:rPr>
-                        <m:t>π</m:t>
-                      </m:r>
-                      <m:f>
-                        <m:fPr>
+                    </m:fPr>
+                    <m:num>
+                      <m:sSub>
+                        <m:sSubPr>
                           <m:ctrlPr>
                             <w:rPr>
                               <w:rFonts w:ascii="Cambria Math" w:hAnsi="Cambria Math"/>
-                              <w:i/>
                             </w:rPr>
                           </m:ctrlPr>
-                        </m:fPr>
-                        <m:num>
-                          <m:sSub>
-                            <m:sSubPr>
-                              <m:ctrlPr>
-                                <w:rPr>
-                                  <w:rFonts w:ascii="Cambria Math" w:hAnsi="Cambria Math"/>
-                                </w:rPr>
-                              </m:ctrlPr>
-                            </m:sSubPr>
-                            <m:e>
-                              <m:r>
-                                <w:rPr>
-                                  <w:rFonts w:ascii="Cambria Math" w:hAnsi="Cambria Math"/>
-                                </w:rPr>
-                                <m:t>f</m:t>
-                              </m:r>
-                            </m:e>
-                            <m:sub>
-                              <m:r>
-                                <w:rPr>
-                                  <w:rFonts w:ascii="Cambria Math" w:hAnsi="Cambria Math"/>
-                                </w:rPr>
-                                <m:t>c</m:t>
-                              </m:r>
-                            </m:sub>
-                          </m:sSub>
-                        </m:num>
-                        <m:den>
-                          <m:sSub>
-                            <m:sSubPr>
-                              <m:ctrlPr>
-                                <w:rPr>
-                                  <w:rFonts w:ascii="Cambria Math" w:hAnsi="Cambria Math"/>
-                                </w:rPr>
-                              </m:ctrlPr>
-                            </m:sSubPr>
-                            <m:e>
-                              <m:r>
-                                <w:rPr>
-                                  <w:rFonts w:ascii="Cambria Math" w:hAnsi="Cambria Math"/>
-                                </w:rPr>
-                                <m:t>f</m:t>
-                              </m:r>
-                            </m:e>
-                            <m:sub>
-                              <m:r>
-                                <w:rPr>
-                                  <w:rFonts w:ascii="Cambria Math" w:hAnsi="Cambria Math"/>
-                                </w:rPr>
-                                <m:t>s</m:t>
-                              </m:r>
-                            </m:sub>
-                          </m:sSub>
-                        </m:den>
-                      </m:f>
-                    </m:e>
-                  </m:d>
+                        </m:sSubPr>
+                        <m:e>
+                          <m:r>
+                            <w:rPr>
+                              <w:rFonts w:ascii="Cambria Math" w:hAnsi="Cambria Math"/>
+                            </w:rPr>
+                            <m:t>f</m:t>
+                          </m:r>
+                        </m:e>
+                        <m:sub>
+                          <m:r>
+                            <w:rPr>
+                              <w:rFonts w:ascii="Cambria Math" w:hAnsi="Cambria Math"/>
+                            </w:rPr>
+                            <m:t>c</m:t>
+                          </m:r>
+                        </m:sub>
+                      </m:sSub>
+                    </m:num>
+                    <m:den>
+                      <m:sSub>
+                        <m:sSubPr>
+                          <m:ctrlPr>
+                            <w:rPr>
+                              <w:rFonts w:ascii="Cambria Math" w:hAnsi="Cambria Math"/>
+                            </w:rPr>
+                          </m:ctrlPr>
+                        </m:sSubPr>
+                        <m:e>
+                          <m:r>
+                            <w:rPr>
+                              <w:rFonts w:ascii="Cambria Math" w:hAnsi="Cambria Math"/>
+                            </w:rPr>
+                            <m:t>f</m:t>
+                          </m:r>
+                        </m:e>
+                        <m:sub>
+                          <m:r>
+                            <w:rPr>
+                              <w:rFonts w:ascii="Cambria Math" w:hAnsi="Cambria Math"/>
+                            </w:rPr>
+                            <m:t>s</m:t>
+                          </m:r>
+                        </m:sub>
+                      </m:sSub>
+                    </m:den>
+                  </m:f>
                 </m:e>
-              </m:func>
-            </m:den>
-          </m:f>
+              </m:d>
+            </m:e>
+          </m:func>
         </m:oMath>
       </m:oMathPara>
     </w:p>
@@ -10199,7 +10269,7 @@
         <w:pStyle w:val="Prvnodstavecprce"/>
       </w:pPr>
       <w:r>
-        <w:t>Vzorkovací kmitočet f</w:t>
+        <w:t>U odbočky na rezistoru se mění jen čitatel, kde je b₀ = 1/(1 + k) a b₁ = −b₀. Vzorkovací kmitočet f</w:t>
       </w:r>
       <w:r>
         <w:rPr>
@@ -10208,7 +10278,7 @@
         <w:t>s</w:t>
       </w:r>
       <w:r>
-        <w:t xml:space="preserve"> je 48 kHz. Analogový a digitální model se shodují v mezním bodě; jejich rozdíl jinde ukazuje samostatná křivka. Kontrola prvních tří sekund zdrojové nahrávky naměřila při změně C ze 100 nF na 2,2 nF a R = 100 kΩ pokles středního kvadrátu signálu o 10,19 dB. Výsledek platí pro tuto nahrávku a nastavení, nikoli všechny tóny.</w:t>
+        <w:t xml:space="preserve"> je 48 kHz.</w:t>
       </w:r>
     </w:p>
     <w:p>
@@ -10216,14 +10286,87 @@
         <w:pStyle w:val="Dalodstavceprce"/>
       </w:pPr>
       <w:r>
-        <w:t>Simulace je dostupná na https://majkey25.github.io/rc-audio-lab/. Zdrojový kód a dokumentace jsou na https://github.com/Majkey25/rc-audio-lab. [2]</w:t>
+        <w:t>Do cesty signálu jsem zapojil dva spektrální analyzátory, jeden před filtr a druhý za něj. Rozdíl jejich spekter dává změřený přenos běžícího zvuku. S bílým šumem na vstupu je odhad natolik klidný, že jde porovnat s vypočtenou křivkou.</w:t>
+      </w:r>
+    </w:p>
+    <w:p>
+      <w:pPr>
+        <w:pStyle w:val="Prvnodstavecprce"/>
+        <w:keepNext/>
+        <w:spacing w:line="240" w:lineRule="auto"/>
+        <w:jc w:val="center"/>
+      </w:pPr>
+      <w:r>
+        <w:rPr>
+          <w:noProof/>
+        </w:rPr>
+        <w:drawing>
+          <wp:inline distT="0" distB="0" distL="0" distR="0" wp14:anchorId="25A890A3" wp14:editId="4EC186B8">
+            <wp:extent cx="4248000" cy="3091268"/>
+            <wp:effectExtent l="0" t="0" r="0" b="0"/>
+            <wp:docPr id="1326772260" name="Picture 1326772260"/>
+            <wp:cNvGraphicFramePr>
+              <a:graphicFrameLocks xmlns:a="http://schemas.openxmlformats.org/drawingml/2006/main" noChangeAspect="1"/>
+            </wp:cNvGraphicFramePr>
+            <a:graphic xmlns:a="http://schemas.openxmlformats.org/drawingml/2006/main">
+              <a:graphicData uri="http://schemas.openxmlformats.org/drawingml/2006/picture">
+                <pic:pic xmlns:pic="http://schemas.openxmlformats.org/drawingml/2006/picture">
+                  <pic:nvPicPr>
+                    <pic:cNvPr id="0" name="mereni.png"/>
+                    <pic:cNvPicPr/>
+                  </pic:nvPicPr>
+                  <pic:blipFill>
+                    <a:blip r:embed="rId19"/>
+                    <a:stretch>
+                      <a:fillRect/>
+                    </a:stretch>
+                  </pic:blipFill>
+                  <pic:spPr>
+                    <a:xfrm>
+                      <a:off x="0" y="0"/>
+                      <a:ext cx="4248000" cy="3091268"/>
+                    </a:xfrm>
+                    <a:prstGeom prst="rect">
+                      <a:avLst/>
+                    </a:prstGeom>
+                  </pic:spPr>
+                </pic:pic>
+              </a:graphicData>
+            </a:graphic>
+          </wp:inline>
+        </w:drawing>
+      </w:r>
+    </w:p>
+    <w:p>
+      <w:pPr>
+        <w:pStyle w:val="Caption"/>
+        <w:spacing w:after="140"/>
+      </w:pPr>
+      <w:r>
+        <w:t>Obrázek 8 Přenos změřený na běžícím zvuku položený na vypočtenou křivku ideálního RC článku. Snímek vlastní aplikace. [2]</w:t>
+      </w:r>
+    </w:p>
+    <w:p>
+      <w:pPr>
+        <w:pStyle w:val="Prvnodstavecprce"/>
+      </w:pPr>
+      <w:r>
+        <w:t>Obě křivky se přes celé slyšitelné pásmo překrývají. Nad 10 kHz se změřený průběh od analogového vzorce odchyluje a sleduje křivku číslicového filtru, protože se blíží polovina vzorkovacího kmitočtu. Přesně tam bilineární transformace kmitočtovou osu stlačuje.</w:t>
+      </w:r>
+    </w:p>
+    <w:p>
+      <w:pPr>
+        <w:pStyle w:val="Dalodstavceprce"/>
+      </w:pPr>
+      <w:r>
+        <w:t>Při stavbě simulace mě zaujalo, jak málo si graf a sluch odpovídají. Útlum 3 dB na mezním kmitočtu vypadá v šedesátidecibelovém měřítku jako téměř nic, v poslechu jde o znatelnou změnu váhy tónu. Simulace je dostupná na https://majkey25.github.io/rc-audio-lab/, zdrojový kód a dokumentace na https://github.com/Majkey25/rc-audio-lab. [2]</w:t>
       </w:r>
     </w:p>
     <w:p>
       <w:pPr>
         <w:pStyle w:val="Nadpisyseznamy"/>
       </w:pPr>
-      <w:bookmarkStart w:id="12" w:name="_Toc240101268"/>
+      <w:bookmarkStart w:id="12" w:name="_Toc240119883"/>
       <w:r>
         <w:lastRenderedPageBreak/>
         <w:t>Závěr</w:t>
@@ -10271,7 +10414,7 @@
         <w:t>−t/RC</w:t>
       </w:r>
       <w:r>
-        <w:t>. Jejich součet je v každém okamžiku roven U. Po jedné časové konstantě τ = RC dosahuje napětí kondenzátoru 0,632121U. Při vybíjení ze stejného napětí zbývá na kondenzátoru 0,367879U a proud má opačný směr vůči nabíjecí referenci.</w:t>
+        <w:t>. Jejich součet je v každém okamžiku roven U. Po jedné časové konstantě τ = RC dosahuje napětí kondenzátoru 0,632121U. Při vybíjení ze stejného napětí na něm zbývá 0,367879U a proud teče opačně než při nabíjení.</w:t>
       </w:r>
     </w:p>
     <w:p>
@@ -10288,7 +10431,7 @@
         <w:t>R</w:t>
       </w:r>
       <w:r>
-        <w:t>(τ) = ½CU²(1 − e⁻²), přibližně 0,432332CU². Součet tepla a uložené energie odpovídá práci zdroje. Úplné nabití napěťovým skokem rozdělí energii na ½CU² v poli a ½CU² v teple. Toto rozdělení neplatí pro všechny nabíjecí metody. Při vybíjení z U je teplo do τ stejné, ale energii dodává pouze kondenzátor. Numerická integrace potvrdila analytický výpočet.</w:t>
+        <w:t>(τ) = ½CU²(1 − e⁻²), tedy přibližně 0,432332CU². Součet tepla a uložené energie odpovídá práci zdroje. Při úplném nabití napěťovým skokem se energie rozdělí na ½CU² v poli a ½CU² v teple, a to nezávisle na odporu. Platí to ale jen pro nabíjení skokem, ne pro každý způsob nabíjení. Při vybíjení z U je teplo do τ stejné, jen energii tentokrát dodává kondenzátor. Numerická integrace analytický výpočet potvrdila.</w:t>
       </w:r>
     </w:p>
     <w:p>
@@ -10296,7 +10439,7 @@
         <w:pStyle w:val="Dalodstavceprce"/>
       </w:pPr>
       <w:r>
-        <w:t>Vazební kondenzátor ukazuje praktický význam mezního kmitočtu. Při odporu 100 kΩ zvedne změna kapacity ze 100 nF na 10 nF mez z 15,9 Hz na 159 Hz. Základní složka basového tónu E₁ pak zeslábne přibližně o 12 dB namísto 0,60 dB. V časovacích obvodech se stejné RC uplatní při náběhu a poklesu řídicího napětí.</w:t>
+        <w:t>Vazební kondenzátor ukazuje praktický význam mezního kmitočtu. Při odporu 100 kΩ zvedne změna kapacity ze 100 nF na 10 nF mez z 15,9 Hz na 159 Hz. Základní složka basového tónu E₁ pak zeslábne přibližně o 12 dB namísto 0,60 dB. V časovacích obvodech tatáž konstanta RC řídí náběh a pokles řídicího napětí.</w:t>
       </w:r>
     </w:p>
     <w:p>
@@ -10304,14 +10447,14 @@
         <w:pStyle w:val="Dalodstavceprce"/>
       </w:pPr>
       <w:r>
-        <w:t>Vlastní simulace umožňuje sledovat tyto vztahy při změně parametrů a porovnat je s filtrovaným zvukem. Jejím účelem je názorné vysvětlení části výpočtů této práce. Úplný model pasivního snímače by musel zahrnout indukčnost a zatížení, model kompresoru také detektor a řízené zesílení. Tyto obvody proto nejsou zaměňovány s jednoduchým RC článkem. [2]</w:t>
+        <w:t>V simulaci si tyto vztahy projdu při změně parametrů a porovnám je s filtrovaným zvukem. Slouží k názornému vysvětlení části výpočtů. Pasivní snímač by vyžadoval také indukčnost a zatížení, kompresor navíc detektor a řízené zesílení. [2]</w:t>
       </w:r>
     </w:p>
     <w:p>
       <w:pPr>
         <w:pStyle w:val="Nadpisyseznamy"/>
       </w:pPr>
-      <w:bookmarkStart w:id="13" w:name="_Toc240101269"/>
+      <w:bookmarkStart w:id="13" w:name="_Toc240119884"/>
       <w:r>
         <w:lastRenderedPageBreak/>
         <w:t>Použití nástrojů umělé inteligence</w:t>
@@ -10323,7 +10466,7 @@
         <w:pStyle w:val="Prvnodstavecprce"/>
       </w:pPr>
       <w:r>
-        <w:t>Při přípravě tohoto projektu jsem využil nástroje generativní umělé inteligence jako moderní pracovní pomůcky pro psaní, výpočty a vývoj softwaru. Šlo o Antigravity, Codex a Claude Code. Pomáhaly při hledání zdrojů, návrhu a úpravě textu, vysvětlování vztahů, tvorbě grafů, programování simulace, kontrole kódu a sazbě dokumentu. Jejich podíl se tedy neomezil pouze na kontrolu pravopisu. [15; 16; 17]</w:t>
+        <w:t>Při přípravě tohoto projektu jsem využil nástroje generativní umělé inteligence jako moderní pracovní pomůcky pro psaní, výpočty a vývoj softwaru. Šlo o Antigravity, Codex a Claude Code. Pomáhaly při hledání zdrojů, návrhu a úpravě textu, vysvětlování vztahů, tvorbě grafů, programování simulace, kontrole kódu a sazbě dokumentu. Nešlo tedy jen o kontrolu pravopisu. [15; 16; 17]</w:t>
       </w:r>
     </w:p>
     <w:p>
@@ -10331,7 +10474,7 @@
         <w:pStyle w:val="Dalodstavceprce"/>
       </w:pPr>
       <w:r>
-        <w:t>Použité modely a nastavení uvádím podle pracovního záznamu: Gemini 3.8 Flash (high), GPT-6 Astra (high a medium), Fable 5.1 (high) a Opus 5 (xhigh). Názvy jsou zachovány v podobě uvedené při práci s nástroji; označení režimu vyjadřuje nastavení daného běhu, nikoli samostatný odborný zdroj.</w:t>
+        <w:t>Použité modely a nastavení uvádím podle pracovního záznamu: Gemini 3.8 Flash (high), GPT-6 Astra (high a medium), Fable 5.1 (high) a Opus 5 (xhigh). Názvy nechávám v podobě, ve které je nástroje hlásily. Označení režimu vyjadřuje nastavení daného běhu, nikoli samostatný odborný zdroj.</w:t>
       </w:r>
     </w:p>
     <w:p>
@@ -10339,7 +10482,7 @@
         <w:pStyle w:val="Dalodstavceprce"/>
       </w:pPr>
       <w:r>
-        <w:t>Za konečné znění projektu, jeho výpočty a interpretaci odpovídám jako autor. Fyzikální tvrzení jsou doložena literaturou. Výstupy AI nenahrazují tyto zdroje ani laboratorní měření. Numerické hodnoty byly porovnány s analytickými vztahy, energetickou bilancí a automatickými testy. Toto uvedení nástrojů vychází z doporučení knihovny UTB k transparentní deklaraci a citování AI. [18; 19]</w:t>
+        <w:t>Za konečné znění projektu, za výpočty i za jejich výklad odpovídám jako autor. Fyzikální výklad opírám o uvedenou literaturu, kterou výstupy AI nenahrazují. Číselné hodnoty byly porovnány s analytickými vztahy, energetickou bilancí a automatickými testy. Nástroje uvádím podle doporučení knihovny UTB k deklaraci a citování AI. [18; 19]</w:t>
       </w:r>
     </w:p>
     <w:p>
@@ -10347,7 +10490,7 @@
         <w:pStyle w:val="Dalodstavceprce"/>
       </w:pPr>
       <w:r>
-        <w:t>Shrnutí zadaných úloh pro AI: vysvětlit RC děj a odvodit tři výsledky podle zadání; propojit téma s hudební elektronikou; vytvořit grafy a vysadit text do šablony UTB; naprogramovat česko-anglickou simulaci se zvukovým filtrem; zkontrolovat rovnice, kód, citace a čitelnost. Následné revize požadovaly odstranit nepodložená tvrzení, odlišit výpočet od měření a opravit nalezené chyby.</w:t>
+        <w:t>Shrnutí zadaných úloh pro AI: vysvětlit RC děj a odvodit tři výsledky podle zadání, propojit téma s hudební elektronikou, vytvořit grafy a vysázet text do šablony UTB, naprogramovat česko-anglickou simulaci se zvukovým filtrem a zkontrolovat rovnice, kód, citace i čitelnost. Pozdější revize pak žádaly odstranit nepodložená tvrzení, odlišit výpočet od měření a opravit nalezené chyby.</w:t>
       </w:r>
     </w:p>
     <w:p>
@@ -10355,7 +10498,7 @@
         <w:pStyle w:val="Nadpisyseznamy"/>
         <w:spacing w:after="80"/>
       </w:pPr>
-      <w:bookmarkStart w:id="14" w:name="_Toc240101270"/>
+      <w:bookmarkStart w:id="14" w:name="_Toc240119885"/>
       <w:r>
         <w:lastRenderedPageBreak/>
         <w:t>Seznam použité literatury</w:t>
@@ -10373,7 +10516,7 @@
         </w:rPr>
         <w:t xml:space="preserve">[1] AK3EJ. Podrobný popis projektů: projekt č. 8 Nabíjení a vybíjení kondenzátoru, děj RC. Studijní zadání dodané ve formátu CSV a v souboru Projekt8.docx. Bez data. Shrnutí zadání v dokumentaci projektu. Dostupné z: </w:t>
       </w:r>
-      <w:hyperlink r:id="rId19">
+      <w:hyperlink r:id="rId20">
         <w:r>
           <w:rPr>
             <w:sz w:val="21"/>
@@ -10393,7 +10536,7 @@
         </w:rPr>
         <w:t xml:space="preserve">[2] TEPLÝ, Matěj. RC Audio Lab: interaktivní simulace RC obvodů v hudební elektronice. Verze 1.0. 2026. Webová aplikace a zdrojový kód, repozitář Majkey25/rc-audio-lab. Online. [cit. 2026-09-11]. Dostupné z: </w:t>
       </w:r>
-      <w:hyperlink r:id="rId20">
+      <w:hyperlink r:id="rId21">
         <w:r>
           <w:rPr>
             <w:sz w:val="21"/>
@@ -10413,7 +10556,7 @@
         </w:rPr>
         <w:t xml:space="preserve">[3] MIT; ALDEBARAN GROUP FOR ASTROPHYSICS. Elektřina a magnetizmus V Kapacita a dielektrika. Český překlad Petr Kulhánek. Bez data. Kap. 5.1, 5.2 a 5.4. Dodaný soubor kurz_05_diel.pdf; online kurz. [cit. 2026-09-11]. Dostupné z: </w:t>
       </w:r>
-      <w:hyperlink r:id="rId21">
+      <w:hyperlink r:id="rId22">
         <w:r>
           <w:rPr>
             <w:sz w:val="21"/>
@@ -10433,7 +10576,7 @@
         </w:rPr>
         <w:t xml:space="preserve">[4] BALES, James A. Lecture 4 RC Circuits. Practical Electronics, Fall 2004. MIT OpenCourseWare. 2004. S. 2–6. Online. [cit. 2026-09-11]. Dostupné z: </w:t>
       </w:r>
-      <w:hyperlink r:id="rId22">
+      <w:hyperlink r:id="rId23">
         <w:r>
           <w:rPr>
             <w:sz w:val="21"/>
@@ -10453,7 +10596,7 @@
         </w:rPr>
         <w:t xml:space="preserve">[5] MIT; ALDEBARAN GROUP FOR ASTROPHYSICS. Elektřina a magnetizmus VII Stejnosměrné obvody. Český překlad Jan Pacák. Bez data. Kap. 7.4 a 7.6, s. 6–14. Dodaný soubor kurz_07_curd.pdf. [cit. 2026-09-11]. Dostupné z: </w:t>
       </w:r>
-      <w:hyperlink r:id="rId23">
+      <w:hyperlink r:id="rId24">
         <w:r>
           <w:rPr>
             <w:sz w:val="21"/>
@@ -10473,7 +10616,7 @@
         </w:rPr>
         <w:t xml:space="preserve">[6] MIT; ALDEBARAN GROUP FOR ASTROPHYSICS. Elektřina a magnetizmus XII Střídavé obvody. Český překlad Jan Pacák. Bez data. Kap. 12.2–12.3, s. 2–11. Dodaný soubor kurz_12_cura.pdf. [cit. 2026-09-11]. Dostupné z: </w:t>
       </w:r>
-      <w:hyperlink r:id="rId24">
+      <w:hyperlink r:id="rId25">
         <w:r>
           <w:rPr>
             <w:sz w:val="21"/>
@@ -10493,7 +10636,7 @@
         </w:rPr>
         <w:t xml:space="preserve">[7] MASSACHUSETTS INSTITUTE OF TECHNOLOGY. 6.117 Lecture 3 Digital circuits power supplies and regulation. IAP 2020. S. 5, Types of filters. Online. [cit. 2026-09-11]. Dostupné z: </w:t>
       </w:r>
-      <w:hyperlink r:id="rId25">
+      <w:hyperlink r:id="rId26">
         <w:r>
           <w:rPr>
             <w:sz w:val="21"/>
@@ -10513,7 +10656,7 @@
         </w:rPr>
         <w:t xml:space="preserve">[8] FENDER MUSICAL INSTRUMENTS CORPORATION. Capacitor Ceramic Disc .05uF @ 100V 20% (12). Produktová dokumentace, části Overview a Features. Bez data. Online. [cit. 2026-09-11]. Dostupné z: </w:t>
       </w:r>
-      <w:hyperlink r:id="rId26">
+      <w:hyperlink r:id="rId27">
         <w:r>
           <w:rPr>
             <w:sz w:val="21"/>
@@ -10533,7 +10676,7 @@
         </w:rPr>
         <w:t xml:space="preserve">[9] ORPHEO. 250k vs 500k pots: Going Deeper into the Subject. Seymour Duncan. Aktualizováno 28. 9. 2022. Část o rezonanci snímače a odporové a kapacitní zátěži. Online. [cit. 2026-09-11]. Dostupné z: </w:t>
       </w:r>
-      <w:hyperlink r:id="rId27">
+      <w:hyperlink r:id="rId28">
         <w:r>
           <w:rPr>
             <w:sz w:val="21"/>
@@ -10553,7 +10696,7 @@
         </w:rPr>
         <w:t xml:space="preserve">[10] TEXAS INSTRUMENTS. RC circuits. TI Precision Labs, výukové video o přechodovém a kmitočtovém chování RC obvodů. 31. 12. 2020. Online. [cit. 2026-09-11]. Dostupné z: </w:t>
       </w:r>
-      <w:hyperlink r:id="rId28">
+      <w:hyperlink r:id="rId29">
         <w:r>
           <w:rPr>
             <w:sz w:val="21"/>
@@ -10573,7 +10716,7 @@
         </w:rPr>
         <w:t xml:space="preserve">[11] ANALOG DEVICES. Chapter 7 Diode application topics. Část Peak Detector. Analog Devices University Program. Bez data. Online. [cit. 2026-09-11]. Dostupné z: </w:t>
       </w:r>
-      <w:hyperlink r:id="rId29">
+      <w:hyperlink r:id="rId30">
         <w:r>
           <w:rPr>
             <w:sz w:val="21"/>
@@ -10593,7 +10736,7 @@
         </w:rPr>
         <w:t xml:space="preserve">[12] ANALOG DEVICES. An Overview of Automatic Level Control. 22. 12. 2005. Technický článek, část How Does ALC Work. Online. [cit. 2026-09-11]. Dostupné z: </w:t>
       </w:r>
-      <w:hyperlink r:id="rId30">
+      <w:hyperlink r:id="rId31">
         <w:r>
           <w:rPr>
             <w:sz w:val="21"/>
@@ -10614,7 +10757,7 @@
         <w:lastRenderedPageBreak/>
         <w:t xml:space="preserve">[13] FREEPATS. Electric Guitar FSBS clean. Verze 2026-08-07. Zvuková knihovna, vzorek F2_s1_01.flac. Licence CC0 1.0. Online. [cit. 2026-09-11]. Dostupné z: </w:t>
       </w:r>
-      <w:hyperlink r:id="rId31">
+      <w:hyperlink r:id="rId32">
         <w:r>
           <w:rPr>
             <w:sz w:val="21"/>
@@ -10634,7 +10777,7 @@
         </w:rPr>
         <w:t xml:space="preserve">[14] W3C. Web Audio API. W3C Recommendation, 17. 6. 2021. Části AudioWorklet a AudioParam. Online. [cit. 2026-09-11]. Dostupné z: </w:t>
       </w:r>
-      <w:hyperlink r:id="rId32">
+      <w:hyperlink r:id="rId33">
         <w:r>
           <w:rPr>
             <w:sz w:val="21"/>
@@ -10654,7 +10797,7 @@
         </w:rPr>
         <w:t xml:space="preserve">[15] GOOGLE. Antigravity. Vývojový nástroj využitý při přípravě projektu. Online. [cit. 2026-09-11]. Dostupné z: </w:t>
       </w:r>
-      <w:hyperlink r:id="rId33">
+      <w:hyperlink r:id="rId34">
         <w:r>
           <w:rPr>
             <w:sz w:val="21"/>
@@ -10674,7 +10817,7 @@
         </w:rPr>
         <w:t xml:space="preserve">[16] OPENAI. Codex. Vývojový nástroj využitý při přípravě projektu. Online. [cit. 2026-09-11]. Dostupné z: </w:t>
       </w:r>
-      <w:hyperlink r:id="rId34">
+      <w:hyperlink r:id="rId35">
         <w:r>
           <w:rPr>
             <w:sz w:val="21"/>
@@ -10694,7 +10837,7 @@
         </w:rPr>
         <w:t xml:space="preserve">[17] ANTHROPIC. Claude Code overview. Dokumentace vývojového nástroje využitého při přípravě projektu. Online. [cit. 2026-09-11]. Dostupné z: </w:t>
       </w:r>
-      <w:hyperlink r:id="rId35">
+      <w:hyperlink r:id="rId36">
         <w:r>
           <w:rPr>
             <w:sz w:val="21"/>
@@ -10714,7 +10857,7 @@
         </w:rPr>
         <w:t xml:space="preserve">[18] UNIVERZITA TOMÁŠE BATI VE ZLÍNĚ, Knihovna. Prohlášení o používání nástrojů AI v práci. Informační výchova K.UTB. Bez data. Online. [cit. 2026-09-11]. Dostupné z: </w:t>
       </w:r>
-      <w:hyperlink r:id="rId36">
+      <w:hyperlink r:id="rId37">
         <w:r>
           <w:rPr>
             <w:sz w:val="21"/>
@@ -10734,7 +10877,7 @@
         </w:rPr>
         <w:t xml:space="preserve">[19] UNIVERZITA TOMÁŠE BATI VE ZLÍNĚ, Knihovna. Citování při využívání nástrojů AI. Informační výchova K.UTB. Bez data. Online. [cit. 2026-09-11]. Dostupné z: </w:t>
       </w:r>
-      <w:hyperlink r:id="rId37">
+      <w:hyperlink r:id="rId38">
         <w:r>
           <w:rPr>
             <w:sz w:val="21"/>
@@ -10744,8 +10887,8 @@
       </w:hyperlink>
     </w:p>
     <w:sectPr>
-      <w:footerReference w:type="even" r:id="rId38"/>
-      <w:footerReference w:type="default" r:id="rId39"/>
+      <w:footerReference w:type="even" r:id="rId39"/>
+      <w:footerReference w:type="default" r:id="rId40"/>
       <w:pgSz w:w="11906" w:h="16838" w:code="9"/>
       <w:pgMar w:top="1985" w:right="1134" w:bottom="2381" w:left="1134" w:header="709" w:footer="680" w:gutter="851"/>
       <w:lnNumType w:countBy="1"/>
@@ -16413,13 +16556,13 @@
   <w:rsids>
     <w:rsidRoot w:val="00AA277A"/>
     <w:rsid w:val="00033AFA"/>
+    <w:rsid w:val="00093320"/>
     <w:rsid w:val="00292321"/>
-    <w:rsid w:val="0042510D"/>
     <w:rsid w:val="005E10AF"/>
-    <w:rsid w:val="009D1C42"/>
+    <w:rsid w:val="00841E86"/>
     <w:rsid w:val="00AA277A"/>
+    <w:rsid w:val="00AE5316"/>
     <w:rsid w:val="00E1326D"/>
-    <w:rsid w:val="00F153E3"/>
     <w:rsid w:val="00F83112"/>
   </w:rsids>
   <m:mathPr>

</xml_diff>

<commit_message>
fix: clarify report claims and simplify simulation labels
Correct the scope of the RC model and audio measurement, remove invented listening claims, and refresh the Word and Markdown reports.
</commit_message>
<xml_diff>
--- a/docs/Zapoctovy_projekt_RC_obvody_v_hudbe.docx
+++ b/docs/Zapoctovy_projekt_RC_obvody_v_hudbe.docx
@@ -691,7 +691,7 @@
       <w:r>
         <w:fldChar w:fldCharType="separate"/>
       </w:r>
-      <w:hyperlink w:anchor="_Toc240119871" w:history="1">
+      <w:hyperlink w:anchor="_Toc240272173" w:history="1">
         <w:r>
           <w:rPr>
             <w:rStyle w:val="Hyperlink"/>
@@ -718,7 +718,7 @@
             <w:noProof/>
             <w:webHidden/>
           </w:rPr>
-          <w:instrText xml:space="preserve"> PAGEREF _Toc240119871 \h </w:instrText>
+          <w:instrText xml:space="preserve"> PAGEREF _Toc240272173 \h </w:instrText>
         </w:r>
         <w:r>
           <w:rPr>
@@ -763,7 +763,7 @@
           <w:lang w:eastAsia="cs-CZ"/>
         </w:rPr>
       </w:pPr>
-      <w:hyperlink w:anchor="_Toc240119872" w:history="1">
+      <w:hyperlink w:anchor="_Toc240272174" w:history="1">
         <w:r>
           <w:rPr>
             <w:rStyle w:val="Hyperlink"/>
@@ -807,7 +807,7 @@
             <w:noProof/>
             <w:webHidden/>
           </w:rPr>
-          <w:instrText xml:space="preserve"> PAGEREF _Toc240119872 \h </w:instrText>
+          <w:instrText xml:space="preserve"> PAGEREF _Toc240272174 \h </w:instrText>
         </w:r>
         <w:r>
           <w:rPr>
@@ -852,7 +852,7 @@
           <w:lang w:eastAsia="cs-CZ"/>
         </w:rPr>
       </w:pPr>
-      <w:hyperlink w:anchor="_Toc240119873" w:history="1">
+      <w:hyperlink w:anchor="_Toc240272175" w:history="1">
         <w:r>
           <w:rPr>
             <w:rStyle w:val="Hyperlink"/>
@@ -896,7 +896,7 @@
             <w:noProof/>
             <w:webHidden/>
           </w:rPr>
-          <w:instrText xml:space="preserve"> PAGEREF _Toc240119873 \h </w:instrText>
+          <w:instrText xml:space="preserve"> PAGEREF _Toc240272175 \h </w:instrText>
         </w:r>
         <w:r>
           <w:rPr>
@@ -941,7 +941,7 @@
           <w:lang w:eastAsia="cs-CZ"/>
         </w:rPr>
       </w:pPr>
-      <w:hyperlink w:anchor="_Toc240119874" w:history="1">
+      <w:hyperlink w:anchor="_Toc240272176" w:history="1">
         <w:r>
           <w:rPr>
             <w:rStyle w:val="Hyperlink"/>
@@ -985,7 +985,7 @@
             <w:noProof/>
             <w:webHidden/>
           </w:rPr>
-          <w:instrText xml:space="preserve"> PAGEREF _Toc240119874 \h </w:instrText>
+          <w:instrText xml:space="preserve"> PAGEREF _Toc240272176 \h </w:instrText>
         </w:r>
         <w:r>
           <w:rPr>
@@ -1030,7 +1030,7 @@
           <w:lang w:eastAsia="cs-CZ"/>
         </w:rPr>
       </w:pPr>
-      <w:hyperlink w:anchor="_Toc240119875" w:history="1">
+      <w:hyperlink w:anchor="_Toc240272177" w:history="1">
         <w:r>
           <w:rPr>
             <w:rStyle w:val="Hyperlink"/>
@@ -1074,7 +1074,7 @@
             <w:noProof/>
             <w:webHidden/>
           </w:rPr>
-          <w:instrText xml:space="preserve"> PAGEREF _Toc240119875 \h </w:instrText>
+          <w:instrText xml:space="preserve"> PAGEREF _Toc240272177 \h </w:instrText>
         </w:r>
         <w:r>
           <w:rPr>
@@ -1119,7 +1119,7 @@
           <w:lang w:eastAsia="cs-CZ"/>
         </w:rPr>
       </w:pPr>
-      <w:hyperlink w:anchor="_Toc240119876" w:history="1">
+      <w:hyperlink w:anchor="_Toc240272178" w:history="1">
         <w:r>
           <w:rPr>
             <w:rStyle w:val="Hyperlink"/>
@@ -1163,7 +1163,7 @@
             <w:noProof/>
             <w:webHidden/>
           </w:rPr>
-          <w:instrText xml:space="preserve"> PAGEREF _Toc240119876 \h </w:instrText>
+          <w:instrText xml:space="preserve"> PAGEREF _Toc240272178 \h </w:instrText>
         </w:r>
         <w:r>
           <w:rPr>
@@ -1208,7 +1208,7 @@
           <w:lang w:eastAsia="cs-CZ"/>
         </w:rPr>
       </w:pPr>
-      <w:hyperlink w:anchor="_Toc240119877" w:history="1">
+      <w:hyperlink w:anchor="_Toc240272179" w:history="1">
         <w:r>
           <w:rPr>
             <w:rStyle w:val="Hyperlink"/>
@@ -1252,7 +1252,7 @@
             <w:noProof/>
             <w:webHidden/>
           </w:rPr>
-          <w:instrText xml:space="preserve"> PAGEREF _Toc240119877 \h </w:instrText>
+          <w:instrText xml:space="preserve"> PAGEREF _Toc240272179 \h </w:instrText>
         </w:r>
         <w:r>
           <w:rPr>
@@ -1297,7 +1297,7 @@
           <w:lang w:eastAsia="cs-CZ"/>
         </w:rPr>
       </w:pPr>
-      <w:hyperlink w:anchor="_Toc240119878" w:history="1">
+      <w:hyperlink w:anchor="_Toc240272180" w:history="1">
         <w:r>
           <w:rPr>
             <w:rStyle w:val="Hyperlink"/>
@@ -1341,7 +1341,7 @@
             <w:noProof/>
             <w:webHidden/>
           </w:rPr>
-          <w:instrText xml:space="preserve"> PAGEREF _Toc240119878 \h </w:instrText>
+          <w:instrText xml:space="preserve"> PAGEREF _Toc240272180 \h </w:instrText>
         </w:r>
         <w:r>
           <w:rPr>
@@ -1386,7 +1386,7 @@
           <w:lang w:eastAsia="cs-CZ"/>
         </w:rPr>
       </w:pPr>
-      <w:hyperlink w:anchor="_Toc240119879" w:history="1">
+      <w:hyperlink w:anchor="_Toc240272181" w:history="1">
         <w:r>
           <w:rPr>
             <w:rStyle w:val="Hyperlink"/>
@@ -1430,7 +1430,7 @@
             <w:noProof/>
             <w:webHidden/>
           </w:rPr>
-          <w:instrText xml:space="preserve"> PAGEREF _Toc240119879 \h </w:instrText>
+          <w:instrText xml:space="preserve"> PAGEREF _Toc240272181 \h </w:instrText>
         </w:r>
         <w:r>
           <w:rPr>
@@ -1475,7 +1475,7 @@
           <w:lang w:eastAsia="cs-CZ"/>
         </w:rPr>
       </w:pPr>
-      <w:hyperlink w:anchor="_Toc240119880" w:history="1">
+      <w:hyperlink w:anchor="_Toc240272182" w:history="1">
         <w:r>
           <w:rPr>
             <w:rStyle w:val="Hyperlink"/>
@@ -1519,7 +1519,7 @@
             <w:noProof/>
             <w:webHidden/>
           </w:rPr>
-          <w:instrText xml:space="preserve"> PAGEREF _Toc240119880 \h </w:instrText>
+          <w:instrText xml:space="preserve"> PAGEREF _Toc240272182 \h </w:instrText>
         </w:r>
         <w:r>
           <w:rPr>
@@ -1564,7 +1564,7 @@
           <w:lang w:eastAsia="cs-CZ"/>
         </w:rPr>
       </w:pPr>
-      <w:hyperlink w:anchor="_Toc240119881" w:history="1">
+      <w:hyperlink w:anchor="_Toc240272183" w:history="1">
         <w:r>
           <w:rPr>
             <w:rStyle w:val="Hyperlink"/>
@@ -1608,7 +1608,7 @@
             <w:noProof/>
             <w:webHidden/>
           </w:rPr>
-          <w:instrText xml:space="preserve"> PAGEREF _Toc240119881 \h </w:instrText>
+          <w:instrText xml:space="preserve"> PAGEREF _Toc240272183 \h </w:instrText>
         </w:r>
         <w:r>
           <w:rPr>
@@ -1653,7 +1653,7 @@
           <w:lang w:eastAsia="cs-CZ"/>
         </w:rPr>
       </w:pPr>
-      <w:hyperlink w:anchor="_Toc240119882" w:history="1">
+      <w:hyperlink w:anchor="_Toc240272184" w:history="1">
         <w:r>
           <w:rPr>
             <w:rStyle w:val="Hyperlink"/>
@@ -1697,7 +1697,7 @@
             <w:noProof/>
             <w:webHidden/>
           </w:rPr>
-          <w:instrText xml:space="preserve"> PAGEREF _Toc240119882 \h </w:instrText>
+          <w:instrText xml:space="preserve"> PAGEREF _Toc240272184 \h </w:instrText>
         </w:r>
         <w:r>
           <w:rPr>
@@ -1739,7 +1739,7 @@
           <w:lang w:eastAsia="cs-CZ"/>
         </w:rPr>
       </w:pPr>
-      <w:hyperlink w:anchor="_Toc240119883" w:history="1">
+      <w:hyperlink w:anchor="_Toc240272185" w:history="1">
         <w:r>
           <w:rPr>
             <w:rStyle w:val="Hyperlink"/>
@@ -1766,7 +1766,7 @@
             <w:noProof/>
             <w:webHidden/>
           </w:rPr>
-          <w:instrText xml:space="preserve"> PAGEREF _Toc240119883 \h </w:instrText>
+          <w:instrText xml:space="preserve"> PAGEREF _Toc240272185 \h </w:instrText>
         </w:r>
         <w:r>
           <w:rPr>
@@ -1808,7 +1808,7 @@
           <w:lang w:eastAsia="cs-CZ"/>
         </w:rPr>
       </w:pPr>
-      <w:hyperlink w:anchor="_Toc240119884" w:history="1">
+      <w:hyperlink w:anchor="_Toc240272186" w:history="1">
         <w:r>
           <w:rPr>
             <w:rStyle w:val="Hyperlink"/>
@@ -1835,7 +1835,7 @@
             <w:noProof/>
             <w:webHidden/>
           </w:rPr>
-          <w:instrText xml:space="preserve"> PAGEREF _Toc240119884 \h </w:instrText>
+          <w:instrText xml:space="preserve"> PAGEREF _Toc240272186 \h </w:instrText>
         </w:r>
         <w:r>
           <w:rPr>
@@ -1877,7 +1877,7 @@
           <w:lang w:eastAsia="cs-CZ"/>
         </w:rPr>
       </w:pPr>
-      <w:hyperlink w:anchor="_Toc240119885" w:history="1">
+      <w:hyperlink w:anchor="_Toc240272187" w:history="1">
         <w:r>
           <w:rPr>
             <w:rStyle w:val="Hyperlink"/>
@@ -1904,7 +1904,7 @@
             <w:noProof/>
             <w:webHidden/>
           </w:rPr>
-          <w:instrText xml:space="preserve"> PAGEREF _Toc240119885 \h </w:instrText>
+          <w:instrText xml:space="preserve"> PAGEREF _Toc240272187 \h </w:instrText>
         </w:r>
         <w:r>
           <w:rPr>
@@ -1982,7 +1982,7 @@
       <w:pPr>
         <w:pStyle w:val="Nadpisyseznamy"/>
       </w:pPr>
-      <w:bookmarkStart w:id="0" w:name="_Toc240119871"/>
+      <w:bookmarkStart w:id="0" w:name="_Toc240272173"/>
       <w:r>
         <w:lastRenderedPageBreak/>
         <w:t>Úvod</w:t>
@@ -2025,7 +2025,7 @@
       <w:pPr>
         <w:pStyle w:val="Heading1"/>
       </w:pPr>
-      <w:bookmarkStart w:id="1" w:name="_Toc240119872"/>
+      <w:bookmarkStart w:id="1" w:name="_Toc240272174"/>
       <w:r>
         <w:lastRenderedPageBreak/>
         <w:t>Kondenzátor a energie elektrického pole</w:t>
@@ -2711,7 +2711,7 @@
       <w:pPr>
         <w:pStyle w:val="Heading1"/>
       </w:pPr>
-      <w:bookmarkStart w:id="2" w:name="_Toc240119873"/>
+      <w:bookmarkStart w:id="2" w:name="_Toc240272175"/>
       <w:r>
         <w:lastRenderedPageBreak/>
         <w:t>Nabíjení a vybíjení RC obvodu</w:t>
@@ -3805,7 +3805,7 @@
       <w:pPr>
         <w:pStyle w:val="Heading1"/>
       </w:pPr>
-      <w:bookmarkStart w:id="3" w:name="_Toc240119874"/>
+      <w:bookmarkStart w:id="3" w:name="_Toc240272176"/>
       <w:r>
         <w:lastRenderedPageBreak/>
         <w:t>Časová konstanta a doba náběhu</w:t>
@@ -4412,7 +4412,7 @@
       <w:pPr>
         <w:pStyle w:val="Heading1"/>
       </w:pPr>
-      <w:bookmarkStart w:id="4" w:name="_Toc240119875"/>
+      <w:bookmarkStart w:id="4" w:name="_Toc240272177"/>
       <w:r>
         <w:lastRenderedPageBreak/>
         <w:t>RC filtry pro střídavé signály</w:t>
@@ -5185,7 +5185,7 @@
       <w:pPr>
         <w:pStyle w:val="Heading1"/>
       </w:pPr>
-      <w:bookmarkStart w:id="5" w:name="_Toc240119876"/>
+      <w:bookmarkStart w:id="5" w:name="_Toc240272178"/>
       <w:r>
         <w:lastRenderedPageBreak/>
         <w:t>Úkoly 1 a 2: napětí na rezistoru a kondenzátoru</w:t>
@@ -6005,13 +6005,7 @@
               <w:rPr>
                 <w:sz w:val="20"/>
               </w:rPr>
-              <w:t>−</w:t>
-            </w:r>
-            <w:r>
-              <w:rPr>
-                <w:sz w:val="20"/>
-              </w:rPr>
-              <w:t>1,83940 V</w:t>
+              <w:t>−1,83940 V</w:t>
             </w:r>
           </w:p>
         </w:tc>
@@ -6100,13 +6094,7 @@
               <w:rPr>
                 <w:sz w:val="20"/>
               </w:rPr>
-              <w:t>−</w:t>
-            </w:r>
-            <w:r>
-              <w:rPr>
-                <w:sz w:val="20"/>
-              </w:rPr>
-              <w:t>0,18394 mA</w:t>
+              <w:t>−0,18394 mA</w:t>
             </w:r>
           </w:p>
         </w:tc>
@@ -6150,7 +6138,7 @@
       <w:pPr>
         <w:pStyle w:val="Heading1"/>
       </w:pPr>
-      <w:bookmarkStart w:id="6" w:name="_Toc240119877"/>
+      <w:bookmarkStart w:id="6" w:name="_Toc240272179"/>
       <w:r>
         <w:lastRenderedPageBreak/>
         <w:t>Úkol 3: energie přeměněná na teplo</w:t>
@@ -6162,16 +6150,7 @@
         <w:pStyle w:val="Prvnodstavecprce"/>
       </w:pPr>
       <w:r>
-        <w:t>Třetí úkol chce teplo na rezistoru od sepnutí do času τ. Ne okamžitý výkon a ne ztrátu při úplném nabití. Pro nabíjení z nuly je i(t) = (U/R)e</w:t>
-      </w:r>
-      <w:r>
-        <w:rPr>
-          <w:vertAlign w:val="superscript"/>
-        </w:rPr>
-        <w:t>−t/τ</w:t>
-      </w:r>
-      <w:r>
-        <w:t>. [1; 5, kap. 7.6]</w:t>
+        <w:t>Třetí úkol požaduje energii přeměněnou na teplo od sepnutí do času τ. Spočítáme ji integrací výkonu na rezistoru přes tento časový interval. Pro nabíjení z nuly použijeme proud odvozený v kapitole 2. [1; 5, kap. 7.6]</w:t>
       </w:r>
     </w:p>
     <w:p>
@@ -6884,7 +6863,7 @@
         <w:pStyle w:val="Prvnodstavecprce"/>
       </w:pPr>
       <w:r>
-        <w:t>Součin F·V² dává joule. Při pevně zadaném čase t na odporu záleží, protože R sedí v exponentu. Měříme-li čas v násobcích RC, odpor se z koeficientu vykrátí.</w:t>
+        <w:t>Součin F·V² dává joule. Při pevně zadaném čase t na odporu záleží, protože R je součástí exponentu. Měříme-li čas v násobcích RC, odpor se z koeficientu vykrátí.</w:t>
       </w:r>
     </w:p>
     <w:p>
@@ -7334,7 +7313,7 @@
       <w:pPr>
         <w:pStyle w:val="Heading1"/>
       </w:pPr>
-      <w:bookmarkStart w:id="7" w:name="_Toc240119878"/>
+      <w:bookmarkStart w:id="7" w:name="_Toc240272180"/>
       <w:r>
         <w:lastRenderedPageBreak/>
         <w:t>Filtrace zvuku kytary a baskytary</w:t>
@@ -7891,7 +7870,7 @@
       <w:pPr>
         <w:pStyle w:val="Heading1"/>
       </w:pPr>
-      <w:bookmarkStart w:id="8" w:name="_Toc240119879"/>
+      <w:bookmarkStart w:id="8" w:name="_Toc240272181"/>
       <w:r>
         <w:lastRenderedPageBreak/>
         <w:t>Vazební kondenzátor a přenos basů</w:t>
@@ -9000,7 +8979,7 @@
       <w:pPr>
         <w:pStyle w:val="Heading1"/>
       </w:pPr>
-      <w:bookmarkStart w:id="9" w:name="_Toc240119880"/>
+      <w:bookmarkStart w:id="9" w:name="_Toc240272182"/>
       <w:r>
         <w:lastRenderedPageBreak/>
         <w:t>Bicí a časové řízení signálu</w:t>
@@ -9503,7 +9482,7 @@
       <w:pPr>
         <w:pStyle w:val="Heading1"/>
       </w:pPr>
-      <w:bookmarkStart w:id="10" w:name="_Toc240119881"/>
+      <w:bookmarkStart w:id="10" w:name="_Toc240272183"/>
       <w:r>
         <w:lastRenderedPageBreak/>
         <w:t>Elektrické pole a kontrola modelu</w:t>
@@ -9652,7 +9631,7 @@
       <w:pPr>
         <w:pStyle w:val="Heading1"/>
       </w:pPr>
-      <w:bookmarkStart w:id="11" w:name="_Toc240119882"/>
+      <w:bookmarkStart w:id="11" w:name="_Toc240272184"/>
       <w:r>
         <w:lastRenderedPageBreak/>
         <w:t>Interaktivní simulace k zápočtovému projektu</w:t>
@@ -9664,7 +9643,7 @@
         <w:pStyle w:val="Prvnodstavecprce"/>
       </w:pPr>
       <w:r>
-        <w:t>K této práci jsem si naprogramoval simulaci RC Audio Lab, abych odvozeným výpočtům lépe rozuměl. Propojuje je s hudební elektronikou, kterou znám z hraní na kytaru, baskytaru a bicí. Kromě grafů napětí, proudu a přenosu umí obvod také přehrát. [2]</w:t>
+        <w:t>K této práci jsem si naprogramoval simulaci RC Audio Lab, abych odvozeným výpočtům lépe rozuměl. Propojuje je s hudební elektronikou, kterou znám z hraní na kytaru, baskytaru a bicí. Vedle grafů napětí, proudu a přenosu nabízí přehrávání zvuku zpracovaného filtrem. [2]</w:t>
       </w:r>
     </w:p>
     <w:p>
@@ -9680,7 +9659,7 @@
         </w:rPr>
         <w:drawing>
           <wp:inline distT="0" distB="0" distL="0" distR="0" wp14:anchorId="24FBBB12" wp14:editId="6844777B">
-            <wp:extent cx="4824000" cy="2205257"/>
+            <wp:extent cx="4824000" cy="1262859"/>
             <wp:effectExtent l="0" t="0" r="0" b="0"/>
             <wp:docPr id="1326772259" name="Picture 1326772259"/>
             <wp:cNvGraphicFramePr>
@@ -9702,7 +9681,7 @@
                   <pic:spPr>
                     <a:xfrm>
                       <a:off x="0" y="0"/>
-                      <a:ext cx="4824000" cy="2205257"/>
+                      <a:ext cx="4824000" cy="1262859"/>
                     </a:xfrm>
                     <a:prstGeom prst="rect">
                       <a:avLst/>
@@ -9737,7 +9716,7 @@
         <w:pStyle w:val="Prvnodstavecprce"/>
       </w:pPr>
       <w:r>
-        <w:t>Odbočku výstupu lze přepnout. Na rezistoru vzniká horní propust, tedy vazební člen mezi zesilovacími stupni. Na kondenzátoru dolní propust, což je zapojení tónové clony. Schéma přitom obě součástky prohodí, protože u dolní propusti leží v sérii rezistor. R i C zůstávají stejné, takže je vidět, že jde pořád o týž článek.</w:t>
+        <w:t>Odbočku výstupu lze přepnout. Na rezistoru vzniká horní propust, která modeluje vazební člen mezi zesilovacími stupni. Na kondenzátoru vzniká dolní propust pro omezení výšek za zdrojem s malým výstupním odporem. Pasivní kytarovou clonu se snímačem tento model plně nepopisuje, jak vysvětluje kapitola 7. Schéma při přepnutí prohodí polohu součástek, jejich hodnoty ale zůstanou stejné.</w:t>
       </w:r>
     </w:p>
     <w:p>
@@ -9745,7 +9724,7 @@
         <w:pStyle w:val="Dalodstavceprce"/>
       </w:pPr>
       <w:r>
-        <w:t>Slyšet je rozdíl především na dolní propusti. Při R = 10 kΩ a C = 47 nF leží mezní kmitočet na 339 Hz a z kytarové nahrávky ubude 16,4 dB energie nad 2 kHz. Tuto hodnotu měří automatický test přímo na vykresleném zvuku. Horní propust na 159 Hz proti tomu odebere jen basy, které reproduktory notebooku stejně nepřenesou.</w:t>
+        <w:t>Výchozí dolní propust má R = 10 kΩ, C = 47 nF a mezní kmitočet přibližně 339 Hz. Potlačuje proto značnou část vyšších harmonických. Automatický test používá první tři sekundy původní nahrávky tónu F₂, ze které aplikace skládá riff. Původní i filtrovaný signál při stejném zesílení dále procházejí čtyřmi měřicími horními propustmi na 2 kHz. Ty zvýrazní výšky, pásmo ale neoddělují ostře. Střední kvadratická hodnota takto upraveného signálu klesla při kontrole přibližně o 16,4 dB. Výsledek se vztahuje k této nahrávce a tomuto postupu.</w:t>
       </w:r>
     </w:p>
     <w:p>
@@ -9759,9 +9738,11 @@
     <w:p>
       <w:pPr>
         <w:pStyle w:val="Heading2"/>
-      </w:pPr>
-      <w:r>
-        <w:t>Změřený přenos proti vypočtenému</w:t>
+        <w:pageBreakBefore/>
+      </w:pPr>
+      <w:r>
+        <w:lastRenderedPageBreak/>
+        <w:t>Odhad přenosu z běžícího zvuku</w:t>
       </w:r>
     </w:p>
     <w:p>
@@ -10286,7 +10267,7 @@
         <w:pStyle w:val="Dalodstavceprce"/>
       </w:pPr>
       <w:r>
-        <w:t>Do cesty signálu jsem zapojil dva spektrální analyzátory, jeden před filtr a druhý za něj. Rozdíl jejich spekter dává změřený přenos běžícího zvuku. S bílým šumem na vstupu je odhad natolik klidný, že jde porovnat s vypočtenou křivkou.</w:t>
+        <w:t>Dva spektrální analyzátory sledují signál před filtrem a za ním. Rozdíl jejich úrovní v decibelech odhaduje amplitudový přenos. Pro tuto ukázku je vhodný bílý šum, protože budí celé sledované pásmo. U kytarového tónu se odhad zhoršuje tam, kde vstup obsahuje málo energie. Výsledek ovlivňuje také délka analyzovaného úseku a vyhlazování spekter.</w:t>
       </w:r>
     </w:p>
     <w:p>
@@ -10343,7 +10324,7 @@
         <w:spacing w:after="140"/>
       </w:pPr>
       <w:r>
-        <w:t>Obrázek 8 Přenos změřený na běžícím zvuku položený na vypočtenou křivku ideálního RC článku. Snímek vlastní aplikace. [2]</w:t>
+        <w:t>Obrázek 8 Odhad přenosu ze vstupního a výstupního spektra vedle vypočtené charakteristiky. Snímek vlastní aplikace. [2]</w:t>
       </w:r>
     </w:p>
     <w:p>
@@ -10351,7 +10332,7 @@
         <w:pStyle w:val="Prvnodstavecprce"/>
       </w:pPr>
       <w:r>
-        <w:t>Obě křivky se přes celé slyšitelné pásmo překrývají. Nad 10 kHz se změřený průběh od analogového vzorce odchyluje a sleduje křivku číslicového filtru, protože se blíží polovina vzorkovacího kmitočtu. Přesně tam bilineární transformace kmitočtovou osu stlačuje.</w:t>
+        <w:t>V nižších kmitočtech se číslicový a analogový model téměř shodují. U zobrazené dolní propusti se blízko poloviny vzorkovacího kmitočtu rozcházejí kvůli nelineárnímu převodu kmitočtové osy při bilineární transformaci. Přizpůsobení zaručuje shodu na mezním kmitočtu, nikoli v celém pásmu. Přepnutí na nefiltrovaný zvuk má odhad přenosu vrátit k 0 dB. Takto lze ověřit, že ovladač mění zpracování signálu. Nejde o měření fyzického obvodu.</w:t>
       </w:r>
     </w:p>
     <w:p>
@@ -10359,14 +10340,30 @@
         <w:pStyle w:val="Dalodstavceprce"/>
       </w:pPr>
       <w:r>
-        <w:t>Při stavbě simulace mě zaujalo, jak málo si graf a sluch odpovídají. Útlum 3 dB na mezním kmitočtu vypadá v šedesátidecibelovém měřítku jako téměř nic, v poslechu jde o znatelnou změnu váhy tónu. Simulace je dostupná na https://majkey25.github.io/rc-audio-lab/, zdrojový kód a dokumentace na https://github.com/Majkey25/rc-audio-lab. [2]</w:t>
+        <w:t xml:space="preserve">Simulace je dostupná na </w:t>
+      </w:r>
+      <w:hyperlink r:id="rId20">
+        <w:r>
+          <w:t>https://majkey25.github.io/rc-audio-lab/</w:t>
+        </w:r>
+      </w:hyperlink>
+      <w:r>
+        <w:t xml:space="preserve">, zdrojový kód a dokumentace na </w:t>
+      </w:r>
+      <w:hyperlink r:id="rId21">
+        <w:r>
+          <w:t>https://github.com/Majkey25/rc-audio-lab</w:t>
+        </w:r>
+      </w:hyperlink>
+      <w:r>
+        <w:t>. [2]</w:t>
       </w:r>
     </w:p>
     <w:p>
       <w:pPr>
         <w:pStyle w:val="Nadpisyseznamy"/>
       </w:pPr>
-      <w:bookmarkStart w:id="12" w:name="_Toc240119883"/>
+      <w:bookmarkStart w:id="12" w:name="_Toc240272185"/>
       <w:r>
         <w:lastRenderedPageBreak/>
         <w:t>Závěr</w:t>
@@ -10454,7 +10451,7 @@
       <w:pPr>
         <w:pStyle w:val="Nadpisyseznamy"/>
       </w:pPr>
-      <w:bookmarkStart w:id="13" w:name="_Toc240119884"/>
+      <w:bookmarkStart w:id="13" w:name="_Toc240272186"/>
       <w:r>
         <w:lastRenderedPageBreak/>
         <w:t>Použití nástrojů umělé inteligence</w:t>
@@ -10498,7 +10495,7 @@
         <w:pStyle w:val="Nadpisyseznamy"/>
         <w:spacing w:after="80"/>
       </w:pPr>
-      <w:bookmarkStart w:id="14" w:name="_Toc240119885"/>
+      <w:bookmarkStart w:id="14" w:name="_Toc240272187"/>
       <w:r>
         <w:lastRenderedPageBreak/>
         <w:t>Seznam použité literatury</w:t>
@@ -10516,7 +10513,7 @@
         </w:rPr>
         <w:t xml:space="preserve">[1] AK3EJ. Podrobný popis projektů: projekt č. 8 Nabíjení a vybíjení kondenzátoru, děj RC. Studijní zadání dodané ve formátu CSV a v souboru Projekt8.docx. Bez data. Shrnutí zadání v dokumentaci projektu. Dostupné z: </w:t>
       </w:r>
-      <w:hyperlink r:id="rId20">
+      <w:hyperlink r:id="rId22">
         <w:r>
           <w:rPr>
             <w:sz w:val="21"/>
@@ -10536,7 +10533,7 @@
         </w:rPr>
         <w:t xml:space="preserve">[2] TEPLÝ, Matěj. RC Audio Lab: interaktivní simulace RC obvodů v hudební elektronice. Verze 1.0. 2026. Webová aplikace a zdrojový kód, repozitář Majkey25/rc-audio-lab. Online. [cit. 2026-09-11]. Dostupné z: </w:t>
       </w:r>
-      <w:hyperlink r:id="rId21">
+      <w:hyperlink r:id="rId23">
         <w:r>
           <w:rPr>
             <w:sz w:val="21"/>
@@ -10556,7 +10553,7 @@
         </w:rPr>
         <w:t xml:space="preserve">[3] MIT; ALDEBARAN GROUP FOR ASTROPHYSICS. Elektřina a magnetizmus V Kapacita a dielektrika. Český překlad Petr Kulhánek. Bez data. Kap. 5.1, 5.2 a 5.4. Dodaný soubor kurz_05_diel.pdf; online kurz. [cit. 2026-09-11]. Dostupné z: </w:t>
       </w:r>
-      <w:hyperlink r:id="rId22">
+      <w:hyperlink r:id="rId24">
         <w:r>
           <w:rPr>
             <w:sz w:val="21"/>
@@ -10576,7 +10573,7 @@
         </w:rPr>
         <w:t xml:space="preserve">[4] BALES, James A. Lecture 4 RC Circuits. Practical Electronics, Fall 2004. MIT OpenCourseWare. 2004. S. 2–6. Online. [cit. 2026-09-11]. Dostupné z: </w:t>
       </w:r>
-      <w:hyperlink r:id="rId23">
+      <w:hyperlink r:id="rId25">
         <w:r>
           <w:rPr>
             <w:sz w:val="21"/>
@@ -10596,7 +10593,7 @@
         </w:rPr>
         <w:t xml:space="preserve">[5] MIT; ALDEBARAN GROUP FOR ASTROPHYSICS. Elektřina a magnetizmus VII Stejnosměrné obvody. Český překlad Jan Pacák. Bez data. Kap. 7.4 a 7.6, s. 6–14. Dodaný soubor kurz_07_curd.pdf. [cit. 2026-09-11]. Dostupné z: </w:t>
       </w:r>
-      <w:hyperlink r:id="rId24">
+      <w:hyperlink r:id="rId26">
         <w:r>
           <w:rPr>
             <w:sz w:val="21"/>
@@ -10616,7 +10613,7 @@
         </w:rPr>
         <w:t xml:space="preserve">[6] MIT; ALDEBARAN GROUP FOR ASTROPHYSICS. Elektřina a magnetizmus XII Střídavé obvody. Český překlad Jan Pacák. Bez data. Kap. 12.2–12.3, s. 2–11. Dodaný soubor kurz_12_cura.pdf. [cit. 2026-09-11]. Dostupné z: </w:t>
       </w:r>
-      <w:hyperlink r:id="rId25">
+      <w:hyperlink r:id="rId27">
         <w:r>
           <w:rPr>
             <w:sz w:val="21"/>
@@ -10636,7 +10633,7 @@
         </w:rPr>
         <w:t xml:space="preserve">[7] MASSACHUSETTS INSTITUTE OF TECHNOLOGY. 6.117 Lecture 3 Digital circuits power supplies and regulation. IAP 2020. S. 5, Types of filters. Online. [cit. 2026-09-11]. Dostupné z: </w:t>
       </w:r>
-      <w:hyperlink r:id="rId26">
+      <w:hyperlink r:id="rId28">
         <w:r>
           <w:rPr>
             <w:sz w:val="21"/>
@@ -10656,7 +10653,7 @@
         </w:rPr>
         <w:t xml:space="preserve">[8] FENDER MUSICAL INSTRUMENTS CORPORATION. Capacitor Ceramic Disc .05uF @ 100V 20% (12). Produktová dokumentace, části Overview a Features. Bez data. Online. [cit. 2026-09-11]. Dostupné z: </w:t>
       </w:r>
-      <w:hyperlink r:id="rId27">
+      <w:hyperlink r:id="rId29">
         <w:r>
           <w:rPr>
             <w:sz w:val="21"/>
@@ -10676,7 +10673,7 @@
         </w:rPr>
         <w:t xml:space="preserve">[9] ORPHEO. 250k vs 500k pots: Going Deeper into the Subject. Seymour Duncan. Aktualizováno 28. 9. 2022. Část o rezonanci snímače a odporové a kapacitní zátěži. Online. [cit. 2026-09-11]. Dostupné z: </w:t>
       </w:r>
-      <w:hyperlink r:id="rId28">
+      <w:hyperlink r:id="rId30">
         <w:r>
           <w:rPr>
             <w:sz w:val="21"/>
@@ -10696,7 +10693,7 @@
         </w:rPr>
         <w:t xml:space="preserve">[10] TEXAS INSTRUMENTS. RC circuits. TI Precision Labs, výukové video o přechodovém a kmitočtovém chování RC obvodů. 31. 12. 2020. Online. [cit. 2026-09-11]. Dostupné z: </w:t>
       </w:r>
-      <w:hyperlink r:id="rId29">
+      <w:hyperlink r:id="rId31">
         <w:r>
           <w:rPr>
             <w:sz w:val="21"/>
@@ -10716,7 +10713,7 @@
         </w:rPr>
         <w:t xml:space="preserve">[11] ANALOG DEVICES. Chapter 7 Diode application topics. Část Peak Detector. Analog Devices University Program. Bez data. Online. [cit. 2026-09-11]. Dostupné z: </w:t>
       </w:r>
-      <w:hyperlink r:id="rId30">
+      <w:hyperlink r:id="rId32">
         <w:r>
           <w:rPr>
             <w:sz w:val="21"/>
@@ -10736,7 +10733,7 @@
         </w:rPr>
         <w:t xml:space="preserve">[12] ANALOG DEVICES. An Overview of Automatic Level Control. 22. 12. 2005. Technický článek, část How Does ALC Work. Online. [cit. 2026-09-11]. Dostupné z: </w:t>
       </w:r>
-      <w:hyperlink r:id="rId31">
+      <w:hyperlink r:id="rId33">
         <w:r>
           <w:rPr>
             <w:sz w:val="21"/>
@@ -10757,7 +10754,7 @@
         <w:lastRenderedPageBreak/>
         <w:t xml:space="preserve">[13] FREEPATS. Electric Guitar FSBS clean. Verze 2026-08-07. Zvuková knihovna, vzorek F2_s1_01.flac. Licence CC0 1.0. Online. [cit. 2026-09-11]. Dostupné z: </w:t>
       </w:r>
-      <w:hyperlink r:id="rId32">
+      <w:hyperlink r:id="rId34">
         <w:r>
           <w:rPr>
             <w:sz w:val="21"/>
@@ -10777,7 +10774,7 @@
         </w:rPr>
         <w:t xml:space="preserve">[14] W3C. Web Audio API. W3C Recommendation, 17. 6. 2021. Části AudioWorklet a AudioParam. Online. [cit. 2026-09-11]. Dostupné z: </w:t>
       </w:r>
-      <w:hyperlink r:id="rId33">
+      <w:hyperlink r:id="rId35">
         <w:r>
           <w:rPr>
             <w:sz w:val="21"/>
@@ -10797,7 +10794,7 @@
         </w:rPr>
         <w:t xml:space="preserve">[15] GOOGLE. Antigravity. Vývojový nástroj využitý při přípravě projektu. Online. [cit. 2026-09-11]. Dostupné z: </w:t>
       </w:r>
-      <w:hyperlink r:id="rId34">
+      <w:hyperlink r:id="rId36">
         <w:r>
           <w:rPr>
             <w:sz w:val="21"/>
@@ -10817,7 +10814,7 @@
         </w:rPr>
         <w:t xml:space="preserve">[16] OPENAI. Codex. Vývojový nástroj využitý při přípravě projektu. Online. [cit. 2026-09-11]. Dostupné z: </w:t>
       </w:r>
-      <w:hyperlink r:id="rId35">
+      <w:hyperlink r:id="rId37">
         <w:r>
           <w:rPr>
             <w:sz w:val="21"/>
@@ -10837,7 +10834,7 @@
         </w:rPr>
         <w:t xml:space="preserve">[17] ANTHROPIC. Claude Code overview. Dokumentace vývojového nástroje využitého při přípravě projektu. Online. [cit. 2026-09-11]. Dostupné z: </w:t>
       </w:r>
-      <w:hyperlink r:id="rId36">
+      <w:hyperlink r:id="rId38">
         <w:r>
           <w:rPr>
             <w:sz w:val="21"/>
@@ -10857,7 +10854,7 @@
         </w:rPr>
         <w:t xml:space="preserve">[18] UNIVERZITA TOMÁŠE BATI VE ZLÍNĚ, Knihovna. Prohlášení o používání nástrojů AI v práci. Informační výchova K.UTB. Bez data. Online. [cit. 2026-09-11]. Dostupné z: </w:t>
       </w:r>
-      <w:hyperlink r:id="rId37">
+      <w:hyperlink r:id="rId39">
         <w:r>
           <w:rPr>
             <w:sz w:val="21"/>
@@ -10877,7 +10874,7 @@
         </w:rPr>
         <w:t xml:space="preserve">[19] UNIVERZITA TOMÁŠE BATI VE ZLÍNĚ, Knihovna. Citování při využívání nástrojů AI. Informační výchova K.UTB. Bez data. Online. [cit. 2026-09-11]. Dostupné z: </w:t>
       </w:r>
-      <w:hyperlink r:id="rId38">
+      <w:hyperlink r:id="rId40">
         <w:r>
           <w:rPr>
             <w:sz w:val="21"/>
@@ -10887,8 +10884,8 @@
       </w:hyperlink>
     </w:p>
     <w:sectPr>
-      <w:footerReference w:type="even" r:id="rId39"/>
-      <w:footerReference w:type="default" r:id="rId40"/>
+      <w:footerReference w:type="even" r:id="rId41"/>
+      <w:footerReference w:type="default" r:id="rId42"/>
       <w:pgSz w:w="11906" w:h="16838" w:code="9"/>
       <w:pgMar w:top="1985" w:right="1134" w:bottom="2381" w:left="1134" w:header="709" w:footer="680" w:gutter="851"/>
       <w:lnNumType w:countBy="1"/>
@@ -16267,1004 +16264,6 @@
 </w:styles>
 </file>
 
-<file path=word/glossary/document.xml><?xml version="1.0" encoding="utf-8"?>
-<w:glossaryDocument xmlns:wpc="http://schemas.microsoft.com/office/word/2010/wordprocessingCanvas" xmlns:cx="http://schemas.microsoft.com/office/drawing/2014/chartex" xmlns:cx1="http://schemas.microsoft.com/office/drawing/2015/9/8/chartex" xmlns:cx2="http://schemas.microsoft.com/office/drawing/2015/10/21/chartex" xmlns:cx3="http://schemas.microsoft.com/office/drawing/2016/5/9/chartex" xmlns:cx4="http://schemas.microsoft.com/office/drawing/2016/5/10/chartex" xmlns:cx5="http://schemas.microsoft.com/office/drawing/2016/5/11/chartex" xmlns:cx6="http://schemas.microsoft.com/office/drawing/2016/5/12/chartex" xmlns:cx7="http://schemas.microsoft.com/office/drawing/2016/5/13/chartex" xmlns:cx8="http://schemas.microsoft.com/office/drawing/2016/5/14/chartex" xmlns:mc="http://schemas.openxmlformats.org/markup-compatibility/2006" xmlns:aink="http://schemas.microsoft.com/office/drawing/2016/ink" xmlns:am3d="http://schemas.microsoft.com/office/drawing/2017/model3d" xmlns:o="urn:schemas-microsoft-com:office:office" xmlns:oel="http://schemas.microsoft.com/office/2019/extlst" xmlns:r="http://schemas.openxmlformats.org/officeDocument/2006/relationships" xmlns:m="http://schemas.openxmlformats.org/officeDocument/2006/math" xmlns:v="urn:schemas-microsoft-com:vml" xmlns:wp14="http://schemas.microsoft.com/office/word/2010/wordprocessingDrawing" xmlns:wp="http://schemas.openxmlformats.org/drawingml/2006/wordprocessingDrawing" xmlns:w10="urn:schemas-microsoft-com:office:word" xmlns:w="http://schemas.openxmlformats.org/wordprocessingml/2006/main" xmlns:w14="http://schemas.microsoft.com/office/word/2010/wordml" xmlns:w15="http://schemas.microsoft.com/office/word/2012/wordml" xmlns:w16cex="http://schemas.microsoft.com/office/word/2018/wordml/cex" xmlns:w16cid="http://schemas.microsoft.com/office/word/2016/wordml/cid" xmlns:w16="http://schemas.microsoft.com/office/word/2018/wordml" xmlns:w16du="http://schemas.microsoft.com/office/word/2023/wordml/word16du" xmlns:w16sdtdh="http://schemas.microsoft.com/office/word/2020/wordml/sdtdatahash" xmlns:w16sdtfl="http://schemas.microsoft.com/office/word/2024/wordml/sdtformatlock" xmlns:w16se="http://schemas.microsoft.com/office/word/2015/wordml/symex" xmlns:wpg="http://schemas.microsoft.com/office/word/2010/wordprocessingGroup" xmlns:wpi="http://schemas.microsoft.com/office/word/2010/wordprocessingInk" xmlns:wne="http://schemas.microsoft.com/office/word/2006/wordml" xmlns:wps="http://schemas.microsoft.com/office/word/2010/wordprocessingShape" mc:Ignorable="w14 w15 w16se w16cid w16 w16cex w16sdtdh w16sdtfl w16du wp14">
-  <w:docParts>
-    <w:docPart>
-      <w:docPartPr>
-        <w:name w:val="5ABF7DB96A41425AB00C7D74E9E7F523"/>
-        <w:category>
-          <w:name w:val="Obecné"/>
-          <w:gallery w:val="placeholder"/>
-        </w:category>
-        <w:types>
-          <w:type w:val="bbPlcHdr"/>
-        </w:types>
-        <w:behaviors>
-          <w:behavior w:val="content"/>
-        </w:behaviors>
-        <w:guid w:val="{60C77171-8DBA-4F3E-943B-96A3DBA7C072}"/>
-      </w:docPartPr>
-      <w:docPartBody>
-        <w:p>
-          <w:pPr>
-            <w:pStyle w:val="5ABF7DB96A41425AB00C7D74E9E7F523"/>
-          </w:pPr>
-          <m:oMathPara>
-            <m:oMath>
-              <m:r>
-                <w:rPr>
-                  <w:rStyle w:val="PlaceholderText"/>
-                  <w:rFonts w:ascii="Cambria Math" w:hAnsi="Cambria Math"/>
-                </w:rPr>
-                <m:t>Sem zadejte rovnici.</m:t>
-              </m:r>
-            </m:oMath>
-          </m:oMathPara>
-        </w:p>
-      </w:docPartBody>
-    </w:docPart>
-    <w:docPart>
-      <w:docPartPr>
-        <w:name w:val="A08C21E212D24DFBA5A5CD5A98B27E8F"/>
-        <w:category>
-          <w:name w:val="Obecné"/>
-          <w:gallery w:val="placeholder"/>
-        </w:category>
-        <w:types>
-          <w:type w:val="bbPlcHdr"/>
-        </w:types>
-        <w:behaviors>
-          <w:behavior w:val="content"/>
-        </w:behaviors>
-        <w:guid w:val="{AA83A500-B6B6-4317-ABF8-93D4C9392C04}"/>
-      </w:docPartPr>
-      <w:docPartBody>
-        <w:p>
-          <w:pPr>
-            <w:pStyle w:val="A08C21E212D24DFBA5A5CD5A98B27E8F"/>
-          </w:pPr>
-          <w:r>
-            <w:rPr>
-              <w:rStyle w:val="PlaceholderText"/>
-              <w:rFonts w:eastAsiaTheme="majorEastAsia"/>
-            </w:rPr>
-            <w:t>[Tabulku vložíte do odstavce níže přes Vložení/Tabulka. Sem pak klepněte a napište titulek.</w:t>
-          </w:r>
-          <w:r>
-            <w:rPr>
-              <w:rStyle w:val="PlaceholderText"/>
-              <w:rFonts w:eastAsiaTheme="majorEastAsia"/>
-              <w:lang w:val="en-US"/>
-            </w:rPr>
-            <w:t>]</w:t>
-          </w:r>
-        </w:p>
-      </w:docPartBody>
-    </w:docPart>
-    <w:docPart>
-      <w:docPartPr>
-        <w:name w:val="3217433250DA4D0B9A1B5F4B40692D47"/>
-        <w:category>
-          <w:name w:val="Obecné"/>
-          <w:gallery w:val="placeholder"/>
-        </w:category>
-        <w:types>
-          <w:type w:val="bbPlcHdr"/>
-        </w:types>
-        <w:behaviors>
-          <w:behavior w:val="content"/>
-        </w:behaviors>
-        <w:guid w:val="{AAE17A71-7A84-406F-9E6E-2746C31A55B0}"/>
-      </w:docPartPr>
-      <w:docPartBody>
-        <w:p>
-          <w:pPr>
-            <w:pStyle w:val="3217433250DA4D0B9A1B5F4B40692D47"/>
-          </w:pPr>
-          <w:r>
-            <w:rPr>
-              <w:rFonts w:eastAsiaTheme="majorEastAsia"/>
-            </w:rPr>
-            <w:t>[Titulek obrázku]</w:t>
-          </w:r>
-        </w:p>
-      </w:docPartBody>
-    </w:docPart>
-    <w:docPart>
-      <w:docPartPr>
-        <w:name w:val="C6C31ABA008440A7B58F20F7A7FC4919"/>
-        <w:category>
-          <w:name w:val="Obecné"/>
-          <w:gallery w:val="placeholder"/>
-        </w:category>
-        <w:types>
-          <w:type w:val="bbPlcHdr"/>
-        </w:types>
-        <w:behaviors>
-          <w:behavior w:val="content"/>
-        </w:behaviors>
-        <w:guid w:val="{2E91AC26-174A-4BCD-B506-D5425FA62814}"/>
-      </w:docPartPr>
-      <w:docPartBody>
-        <w:p>
-          <w:pPr>
-            <w:pStyle w:val="C6C31ABA008440A7B58F20F7A7FC4919"/>
-          </w:pPr>
-          <w:r>
-            <w:rPr>
-              <w:rStyle w:val="PlaceholderText"/>
-              <w:rFonts w:eastAsiaTheme="majorEastAsia"/>
-              <w:lang w:val="en-US"/>
-            </w:rPr>
-            <w:t>[Titulek obr</w:t>
-          </w:r>
-          <w:r>
-            <w:rPr>
-              <w:rStyle w:val="PlaceholderText"/>
-              <w:rFonts w:eastAsiaTheme="majorEastAsia"/>
-            </w:rPr>
-            <w:t>ázku</w:t>
-          </w:r>
-          <w:r>
-            <w:rPr>
-              <w:rStyle w:val="PlaceholderText"/>
-              <w:rFonts w:eastAsiaTheme="majorEastAsia"/>
-              <w:lang w:val="en-US"/>
-            </w:rPr>
-            <w:t>]</w:t>
-          </w:r>
-        </w:p>
-      </w:docPartBody>
-    </w:docPart>
-    <w:docPart>
-      <w:docPartPr>
-        <w:name w:val="5CDCC436BBAF400CA921FA0C680B3CF1"/>
-        <w:category>
-          <w:name w:val="Obecné"/>
-          <w:gallery w:val="placeholder"/>
-        </w:category>
-        <w:types>
-          <w:type w:val="bbPlcHdr"/>
-        </w:types>
-        <w:behaviors>
-          <w:behavior w:val="content"/>
-        </w:behaviors>
-        <w:guid w:val="{D1FD1F33-C490-4DCF-BABA-32E4929C8CED}"/>
-      </w:docPartPr>
-      <w:docPartBody>
-        <w:p>
-          <w:pPr>
-            <w:pStyle w:val="5CDCC436BBAF400CA921FA0C680B3CF1"/>
-          </w:pPr>
-          <w:r>
-            <w:rPr>
-              <w:rStyle w:val="PlaceholderText"/>
-              <w:rFonts w:eastAsiaTheme="majorEastAsia"/>
-            </w:rPr>
-            <w:t>[Uve</w:t>
-          </w:r>
-          <w:r>
-            <w:rPr>
-              <w:rStyle w:val="PlaceholderText"/>
-              <w:rFonts w:eastAsiaTheme="majorEastAsia"/>
-            </w:rPr>
-            <w:t>ďte zdroj obrázku.</w:t>
-          </w:r>
-          <w:r>
-            <w:rPr>
-              <w:rStyle w:val="PlaceholderText"/>
-              <w:rFonts w:eastAsiaTheme="majorEastAsia"/>
-            </w:rPr>
-            <w:t>]</w:t>
-          </w:r>
-        </w:p>
-      </w:docPartBody>
-    </w:docPart>
-  </w:docParts>
-</w:glossaryDocument>
-</file>
-
-<file path=word/glossary/fontTable.xml><?xml version="1.0" encoding="utf-8"?>
-<w:fonts xmlns:mc="http://schemas.openxmlformats.org/markup-compatibility/2006" xmlns:r="http://schemas.openxmlformats.org/officeDocument/2006/relationships" xmlns:w="http://schemas.openxmlformats.org/wordprocessingml/2006/main" xmlns:w14="http://schemas.microsoft.com/office/word/2010/wordml" xmlns:w15="http://schemas.microsoft.com/office/word/2012/wordml" xmlns:w16cex="http://schemas.microsoft.com/office/word/2018/wordml/cex" xmlns:w16cid="http://schemas.microsoft.com/office/word/2016/wordml/cid" xmlns:w16="http://schemas.microsoft.com/office/word/2018/wordml" xmlns:w16du="http://schemas.microsoft.com/office/word/2023/wordml/word16du" xmlns:w16sdtdh="http://schemas.microsoft.com/office/word/2020/wordml/sdtdatahash" xmlns:w16sdtfl="http://schemas.microsoft.com/office/word/2024/wordml/sdtformatlock" xmlns:w16se="http://schemas.microsoft.com/office/word/2015/wordml/symex" mc:Ignorable="w14 w15 w16se w16cid w16 w16cex w16sdtdh w16sdtfl w16du">
-  <w:font w:name="Symbol">
-    <w:panose1 w:val="05050102010706020507"/>
-    <w:charset w:val="02"/>
-    <w:family w:val="roman"/>
-    <w:pitch w:val="variable"/>
-    <w:sig w:usb0="00000000" w:usb1="10000000" w:usb2="00000000" w:usb3="00000000" w:csb0="80000000" w:csb1="00000000"/>
-  </w:font>
-  <w:font w:name="Times New Roman">
-    <w:panose1 w:val="02020603050405020304"/>
-    <w:charset w:val="00"/>
-    <w:family w:val="roman"/>
-    <w:pitch w:val="variable"/>
-    <w:sig w:usb0="E0002EFF" w:usb1="C000785B" w:usb2="00000009" w:usb3="00000000" w:csb0="000001FF" w:csb1="00000000"/>
-  </w:font>
-  <w:font w:name="Courier New">
-    <w:panose1 w:val="02070309020205020404"/>
-    <w:charset w:val="EE"/>
-    <w:family w:val="modern"/>
-    <w:pitch w:val="fixed"/>
-    <w:sig w:usb0="E0002EFF" w:usb1="C0007843" w:usb2="00000009" w:usb3="00000000" w:csb0="000001FF" w:csb1="00000000"/>
-  </w:font>
-  <w:font w:name="Wingdings">
-    <w:panose1 w:val="05000000000000000000"/>
-    <w:charset w:val="02"/>
-    <w:family w:val="auto"/>
-    <w:pitch w:val="variable"/>
-    <w:sig w:usb0="00000000" w:usb1="10000000" w:usb2="00000000" w:usb3="00000000" w:csb0="80000000" w:csb1="00000000"/>
-  </w:font>
-  <w:font w:name="Arial">
-    <w:panose1 w:val="020B0604020202020204"/>
-    <w:charset w:val="00"/>
-    <w:family w:val="swiss"/>
-    <w:pitch w:val="variable"/>
-    <w:sig w:usb0="E0002EFF" w:usb1="C000785B" w:usb2="00000009" w:usb3="00000000" w:csb0="000001FF" w:csb1="00000000"/>
-  </w:font>
-  <w:font w:name="Aptos">
-    <w:charset w:val="00"/>
-    <w:family w:val="swiss"/>
-    <w:pitch w:val="variable"/>
-    <w:sig w:usb0="20000287" w:usb1="00000003" w:usb2="00000000" w:usb3="00000000" w:csb0="0000019F" w:csb1="00000000"/>
-  </w:font>
-  <w:font w:name="Segoe UI">
-    <w:panose1 w:val="020B0502040204020203"/>
-    <w:charset w:val="EE"/>
-    <w:family w:val="swiss"/>
-    <w:pitch w:val="variable"/>
-    <w:sig w:usb0="E4002EFF" w:usb1="C000E47F" w:usb2="00000009" w:usb3="00000000" w:csb0="000001FF" w:csb1="00000000"/>
-  </w:font>
-  <w:font w:name="Cambria Math">
-    <w:panose1 w:val="02040503050406030204"/>
-    <w:charset w:val="EE"/>
-    <w:family w:val="roman"/>
-    <w:pitch w:val="variable"/>
-    <w:sig w:usb0="E00006FF" w:usb1="420024FF" w:usb2="02000000" w:usb3="00000000" w:csb0="0000019F" w:csb1="00000000"/>
-  </w:font>
-  <w:font w:name="Cambria">
-    <w:panose1 w:val="02040503050406030204"/>
-    <w:charset w:val="EE"/>
-    <w:family w:val="roman"/>
-    <w:pitch w:val="variable"/>
-    <w:sig w:usb0="E00006FF" w:usb1="420024FF" w:usb2="02000000" w:usb3="00000000" w:csb0="0000019F" w:csb1="00000000"/>
-  </w:font>
-  <w:font w:name="Aptos Display">
-    <w:charset w:val="00"/>
-    <w:family w:val="swiss"/>
-    <w:pitch w:val="variable"/>
-    <w:sig w:usb0="20000287" w:usb1="00000003" w:usb2="00000000" w:usb3="00000000" w:csb0="0000019F" w:csb1="00000000"/>
-  </w:font>
-</w:fonts>
-</file>
-
-<file path=word/glossary/settings.xml><?xml version="1.0" encoding="utf-8"?>
-<w:settings xmlns:mc="http://schemas.openxmlformats.org/markup-compatibility/2006" xmlns:o="urn:schemas-microsoft-com:office:office" xmlns:r="http://schemas.openxmlformats.org/officeDocument/2006/relationships" xmlns:m="http://schemas.openxmlformats.org/officeDocument/2006/math" xmlns:v="urn:schemas-microsoft-com:vml" xmlns:w10="urn:schemas-microsoft-com:office:word" xmlns:w="http://schemas.openxmlformats.org/wordprocessingml/2006/main" xmlns:w14="http://schemas.microsoft.com/office/word/2010/wordml" xmlns:w15="http://schemas.microsoft.com/office/word/2012/wordml" xmlns:w16cex="http://schemas.microsoft.com/office/word/2018/wordml/cex" xmlns:w16cid="http://schemas.microsoft.com/office/word/2016/wordml/cid" xmlns:w16="http://schemas.microsoft.com/office/word/2018/wordml" xmlns:w16du="http://schemas.microsoft.com/office/word/2023/wordml/word16du" xmlns:w16sdtdh="http://schemas.microsoft.com/office/word/2020/wordml/sdtdatahash" xmlns:w16sdtfl="http://schemas.microsoft.com/office/word/2024/wordml/sdtformatlock" xmlns:w16se="http://schemas.microsoft.com/office/word/2015/wordml/symex" xmlns:sl="http://schemas.openxmlformats.org/schemaLibrary/2006/main" mc:Ignorable="w14 w15 w16se w16cid w16 w16cex w16sdtdh w16sdtfl w16du">
-  <w:view w:val="normal"/>
-  <w:defaultTabStop w:val="708"/>
-  <w:hyphenationZone w:val="425"/>
-  <w:characterSpacingControl w:val="doNotCompress"/>
-  <w:compat>
-    <w:useFELayout/>
-    <w:compatSetting w:name="compatibilityMode" w:uri="http://schemas.microsoft.com/office/word" w:val="15"/>
-    <w:compatSetting w:name="overrideTableStyleFontSizeAndJustification" w:uri="http://schemas.microsoft.com/office/word" w:val="1"/>
-    <w:compatSetting w:name="enableOpenTypeFeatures" w:uri="http://schemas.microsoft.com/office/word" w:val="1"/>
-    <w:compatSetting w:name="doNotFlipMirrorIndents" w:uri="http://schemas.microsoft.com/office/word" w:val="1"/>
-    <w:compatSetting w:name="differentiateMultirowTableHeaders" w:uri="http://schemas.microsoft.com/office/word" w:val="1"/>
-    <w:compatSetting w:name="useWord2013TrackBottomHyphenation" w:uri="http://schemas.microsoft.com/office/word" w:val="0"/>
-  </w:compat>
-  <w:rsids>
-    <w:rsidRoot w:val="00AA277A"/>
-    <w:rsid w:val="00033AFA"/>
-    <w:rsid w:val="00093320"/>
-    <w:rsid w:val="00292321"/>
-    <w:rsid w:val="005E10AF"/>
-    <w:rsid w:val="00841E86"/>
-    <w:rsid w:val="00AA277A"/>
-    <w:rsid w:val="00AE5316"/>
-    <w:rsid w:val="00E1326D"/>
-    <w:rsid w:val="00F83112"/>
-  </w:rsids>
-  <m:mathPr>
-    <m:mathFont m:val="Cambria Math"/>
-    <m:brkBin m:val="before"/>
-    <m:brkBinSub m:val="--"/>
-    <m:smallFrac m:val="0"/>
-    <m:dispDef/>
-    <m:lMargin m:val="0"/>
-    <m:rMargin m:val="0"/>
-    <m:defJc m:val="centerGroup"/>
-    <m:wrapIndent m:val="1440"/>
-    <m:intLim m:val="subSup"/>
-    <m:naryLim m:val="undOvr"/>
-  </m:mathPr>
-  <w:themeFontLang w:val="cs-CZ"/>
-  <w:clrSchemeMapping w:bg1="light1" w:t1="dark1" w:bg2="light2" w:t2="dark2" w:accent1="accent1" w:accent2="accent2" w:accent3="accent3" w:accent4="accent4" w:accent5="accent5" w:accent6="accent6" w:hyperlink="hyperlink" w:followedHyperlink="followedHyperlink"/>
-  <w:decimalSymbol w:val=","/>
-  <w:listSeparator w:val=";"/>
-  <w15:chartTrackingRefBased/>
-</w:settings>
-</file>
-
-<file path=word/glossary/styles.xml><?xml version="1.0" encoding="utf-8"?>
-<w:styles xmlns:mc="http://schemas.openxmlformats.org/markup-compatibility/2006" xmlns:r="http://schemas.openxmlformats.org/officeDocument/2006/relationships" xmlns:w="http://schemas.openxmlformats.org/wordprocessingml/2006/main" xmlns:w14="http://schemas.microsoft.com/office/word/2010/wordml" xmlns:w15="http://schemas.microsoft.com/office/word/2012/wordml" xmlns:w16cex="http://schemas.microsoft.com/office/word/2018/wordml/cex" xmlns:w16cid="http://schemas.microsoft.com/office/word/2016/wordml/cid" xmlns:w16="http://schemas.microsoft.com/office/word/2018/wordml" xmlns:w16du="http://schemas.microsoft.com/office/word/2023/wordml/word16du" xmlns:w16sdtdh="http://schemas.microsoft.com/office/word/2020/wordml/sdtdatahash" xmlns:w16sdtfl="http://schemas.microsoft.com/office/word/2024/wordml/sdtformatlock" xmlns:w16se="http://schemas.microsoft.com/office/word/2015/wordml/symex" mc:Ignorable="w14 w15 w16se w16cid w16 w16cex w16sdtdh w16sdtfl w16du">
-  <w:docDefaults>
-    <w:rPrDefault>
-      <w:rPr>
-        <w:rFonts w:asciiTheme="minorHAnsi" w:eastAsiaTheme="minorEastAsia" w:hAnsiTheme="minorHAnsi" w:cstheme="minorBidi"/>
-        <w:kern w:val="2"/>
-        <w:sz w:val="24"/>
-        <w:szCs w:val="24"/>
-        <w:lang w:val="cs-CZ" w:eastAsia="cs-CZ" w:bidi="ar-SA"/>
-        <w14:ligatures w14:val="standardContextual"/>
-      </w:rPr>
-    </w:rPrDefault>
-    <w:pPrDefault>
-      <w:pPr>
-        <w:spacing w:after="160" w:line="278" w:lineRule="auto"/>
-      </w:pPr>
-    </w:pPrDefault>
-  </w:docDefaults>
-  <w:latentStyles w:defLockedState="0" w:defUIPriority="99" w:defSemiHidden="0" w:defUnhideWhenUsed="0" w:defQFormat="0" w:count="376">
-    <w:lsdException w:name="Normal" w:uiPriority="0" w:qFormat="1"/>
-    <w:lsdException w:name="heading 1" w:uiPriority="9" w:qFormat="1"/>
-    <w:lsdException w:name="heading 2" w:semiHidden="1" w:uiPriority="9" w:unhideWhenUsed="1" w:qFormat="1"/>
-    <w:lsdException w:name="heading 3" w:semiHidden="1" w:uiPriority="9" w:unhideWhenUsed="1" w:qFormat="1"/>
-    <w:lsdException w:name="heading 4" w:semiHidden="1" w:uiPriority="9" w:unhideWhenUsed="1" w:qFormat="1"/>
-    <w:lsdException w:name="heading 5" w:semiHidden="1" w:uiPriority="9" w:unhideWhenUsed="1" w:qFormat="1"/>
-    <w:lsdException w:name="heading 6" w:semiHidden="1" w:uiPriority="9" w:unhideWhenUsed="1" w:qFormat="1"/>
-    <w:lsdException w:name="heading 7" w:semiHidden="1" w:uiPriority="9" w:unhideWhenUsed="1" w:qFormat="1"/>
-    <w:lsdException w:name="heading 8" w:semiHidden="1" w:uiPriority="9" w:unhideWhenUsed="1" w:qFormat="1"/>
-    <w:lsdException w:name="heading 9" w:semiHidden="1" w:uiPriority="9" w:unhideWhenUsed="1" w:qFormat="1"/>
-    <w:lsdException w:name="index 1" w:semiHidden="1" w:unhideWhenUsed="1"/>
-    <w:lsdException w:name="index 2" w:semiHidden="1" w:unhideWhenUsed="1"/>
-    <w:lsdException w:name="index 3" w:semiHidden="1" w:unhideWhenUsed="1"/>
-    <w:lsdException w:name="index 4" w:semiHidden="1" w:unhideWhenUsed="1"/>
-    <w:lsdException w:name="index 5" w:semiHidden="1" w:unhideWhenUsed="1"/>
-    <w:lsdException w:name="index 6" w:semiHidden="1" w:unhideWhenUsed="1"/>
-    <w:lsdException w:name="index 7" w:semiHidden="1" w:unhideWhenUsed="1"/>
-    <w:lsdException w:name="index 8" w:semiHidden="1" w:unhideWhenUsed="1"/>
-    <w:lsdException w:name="index 9" w:semiHidden="1" w:unhideWhenUsed="1"/>
-    <w:lsdException w:name="toc 1" w:semiHidden="1" w:uiPriority="39" w:unhideWhenUsed="1"/>
-    <w:lsdException w:name="toc 2" w:semiHidden="1" w:uiPriority="39" w:unhideWhenUsed="1"/>
-    <w:lsdException w:name="toc 3" w:semiHidden="1" w:uiPriority="39" w:unhideWhenUsed="1"/>
-    <w:lsdException w:name="toc 4" w:semiHidden="1" w:uiPriority="39" w:unhideWhenUsed="1"/>
-    <w:lsdException w:name="toc 5" w:semiHidden="1" w:uiPriority="39" w:unhideWhenUsed="1"/>
-    <w:lsdException w:name="toc 6" w:semiHidden="1" w:uiPriority="39" w:unhideWhenUsed="1"/>
-    <w:lsdException w:name="toc 7" w:semiHidden="1" w:uiPriority="39" w:unhideWhenUsed="1"/>
-    <w:lsdException w:name="toc 8" w:semiHidden="1" w:uiPriority="39" w:unhideWhenUsed="1"/>
-    <w:lsdException w:name="toc 9" w:semiHidden="1" w:uiPriority="39" w:unhideWhenUsed="1"/>
-    <w:lsdException w:name="Normal Indent" w:semiHidden="1" w:unhideWhenUsed="1"/>
-    <w:lsdException w:name="footnote text" w:semiHidden="1" w:unhideWhenUsed="1"/>
-    <w:lsdException w:name="annotation text" w:semiHidden="1" w:unhideWhenUsed="1"/>
-    <w:lsdException w:name="header" w:semiHidden="1" w:unhideWhenUsed="1"/>
-    <w:lsdException w:name="footer" w:semiHidden="1" w:unhideWhenUsed="1"/>
-    <w:lsdException w:name="index heading" w:semiHidden="1" w:unhideWhenUsed="1"/>
-    <w:lsdException w:name="caption" w:semiHidden="1" w:uiPriority="35" w:unhideWhenUsed="1" w:qFormat="1"/>
-    <w:lsdException w:name="table of figures" w:semiHidden="1" w:unhideWhenUsed="1"/>
-    <w:lsdException w:name="envelope address" w:semiHidden="1" w:unhideWhenUsed="1"/>
-    <w:lsdException w:name="envelope return" w:semiHidden="1" w:unhideWhenUsed="1"/>
-    <w:lsdException w:name="footnote reference" w:semiHidden="1" w:unhideWhenUsed="1"/>
-    <w:lsdException w:name="annotation reference" w:semiHidden="1" w:unhideWhenUsed="1"/>
-    <w:lsdException w:name="line number" w:semiHidden="1" w:unhideWhenUsed="1"/>
-    <w:lsdException w:name="page number" w:semiHidden="1" w:unhideWhenUsed="1"/>
-    <w:lsdException w:name="endnote reference" w:semiHidden="1" w:unhideWhenUsed="1"/>
-    <w:lsdException w:name="endnote text" w:semiHidden="1" w:unhideWhenUsed="1"/>
-    <w:lsdException w:name="table of authorities" w:semiHidden="1" w:unhideWhenUsed="1"/>
-    <w:lsdException w:name="macro" w:semiHidden="1" w:unhideWhenUsed="1"/>
-    <w:lsdException w:name="toa heading" w:semiHidden="1" w:unhideWhenUsed="1"/>
-    <w:lsdException w:name="List" w:semiHidden="1" w:unhideWhenUsed="1"/>
-    <w:lsdException w:name="List Bullet" w:semiHidden="1" w:unhideWhenUsed="1"/>
-    <w:lsdException w:name="List Number" w:semiHidden="1" w:unhideWhenUsed="1"/>
-    <w:lsdException w:name="List 2" w:semiHidden="1" w:unhideWhenUsed="1"/>
-    <w:lsdException w:name="List 3" w:semiHidden="1" w:unhideWhenUsed="1"/>
-    <w:lsdException w:name="List 4" w:semiHidden="1" w:unhideWhenUsed="1"/>
-    <w:lsdException w:name="List 5" w:semiHidden="1" w:unhideWhenUsed="1"/>
-    <w:lsdException w:name="List Bullet 2" w:semiHidden="1" w:unhideWhenUsed="1"/>
-    <w:lsdException w:name="List Bullet 3" w:semiHidden="1" w:unhideWhenUsed="1"/>
-    <w:lsdException w:name="List Bullet 4" w:semiHidden="1" w:unhideWhenUsed="1"/>
-    <w:lsdException w:name="List Bullet 5" w:semiHidden="1" w:unhideWhenUsed="1"/>
-    <w:lsdException w:name="List Number 2" w:semiHidden="1" w:unhideWhenUsed="1"/>
-    <w:lsdException w:name="List Number 3" w:semiHidden="1" w:unhideWhenUsed="1"/>
-    <w:lsdException w:name="List Number 4" w:semiHidden="1" w:unhideWhenUsed="1"/>
-    <w:lsdException w:name="List Number 5" w:semiHidden="1" w:unhideWhenUsed="1"/>
-    <w:lsdException w:name="Title" w:uiPriority="10" w:qFormat="1"/>
-    <w:lsdException w:name="Closing" w:semiHidden="1" w:unhideWhenUsed="1"/>
-    <w:lsdException w:name="Signature" w:semiHidden="1" w:unhideWhenUsed="1"/>
-    <w:lsdException w:name="Default Paragraph Font" w:semiHidden="1" w:uiPriority="1" w:unhideWhenUsed="1"/>
-    <w:lsdException w:name="Body Text" w:semiHidden="1" w:unhideWhenUsed="1"/>
-    <w:lsdException w:name="Body Text Indent" w:semiHidden="1" w:unhideWhenUsed="1"/>
-    <w:lsdException w:name="List Continue" w:semiHidden="1" w:unhideWhenUsed="1"/>
-    <w:lsdException w:name="List Continue 2" w:semiHidden="1" w:unhideWhenUsed="1"/>
-    <w:lsdException w:name="List Continue 3" w:semiHidden="1" w:unhideWhenUsed="1"/>
-    <w:lsdException w:name="List Continue 4" w:semiHidden="1" w:unhideWhenUsed="1"/>
-    <w:lsdException w:name="List Continue 5" w:semiHidden="1" w:unhideWhenUsed="1"/>
-    <w:lsdException w:name="Message Header" w:semiHidden="1" w:unhideWhenUsed="1"/>
-    <w:lsdException w:name="Subtitle" w:uiPriority="11" w:qFormat="1"/>
-    <w:lsdException w:name="Salutation" w:semiHidden="1" w:unhideWhenUsed="1"/>
-    <w:lsdException w:name="Date" w:semiHidden="1" w:unhideWhenUsed="1"/>
-    <w:lsdException w:name="Body Text First Indent" w:semiHidden="1" w:unhideWhenUsed="1"/>
-    <w:lsdException w:name="Body Text First Indent 2" w:semiHidden="1" w:unhideWhenUsed="1"/>
-    <w:lsdException w:name="Note Heading" w:semiHidden="1" w:unhideWhenUsed="1"/>
-    <w:lsdException w:name="Body Text 2" w:semiHidden="1" w:unhideWhenUsed="1"/>
-    <w:lsdException w:name="Body Text 3" w:semiHidden="1" w:unhideWhenUsed="1"/>
-    <w:lsdException w:name="Body Text Indent 2" w:semiHidden="1" w:unhideWhenUsed="1"/>
-    <w:lsdException w:name="Body Text Indent 3" w:semiHidden="1" w:unhideWhenUsed="1"/>
-    <w:lsdException w:name="Block Text" w:semiHidden="1" w:unhideWhenUsed="1"/>
-    <w:lsdException w:name="Hyperlink" w:semiHidden="1" w:unhideWhenUsed="1"/>
-    <w:lsdException w:name="FollowedHyperlink" w:semiHidden="1" w:unhideWhenUsed="1"/>
-    <w:lsdException w:name="Strong" w:uiPriority="22" w:qFormat="1"/>
-    <w:lsdException w:name="Emphasis" w:uiPriority="20" w:qFormat="1"/>
-    <w:lsdException w:name="Document Map" w:semiHidden="1" w:unhideWhenUsed="1"/>
-    <w:lsdException w:name="Plain Text" w:semiHidden="1" w:unhideWhenUsed="1"/>
-    <w:lsdException w:name="E-mail Signature" w:semiHidden="1" w:unhideWhenUsed="1"/>
-    <w:lsdException w:name="HTML Top of Form" w:semiHidden="1" w:unhideWhenUsed="1"/>
-    <w:lsdException w:name="HTML Bottom of Form" w:semiHidden="1" w:unhideWhenUsed="1"/>
-    <w:lsdException w:name="Normal (Web)" w:semiHidden="1" w:unhideWhenUsed="1"/>
-    <w:lsdException w:name="HTML Acronym" w:semiHidden="1" w:unhideWhenUsed="1"/>
-    <w:lsdException w:name="HTML Address" w:semiHidden="1" w:unhideWhenUsed="1"/>
-    <w:lsdException w:name="HTML Cite" w:semiHidden="1" w:unhideWhenUsed="1"/>
-    <w:lsdException w:name="HTML Code" w:semiHidden="1" w:unhideWhenUsed="1"/>
-    <w:lsdException w:name="HTML Definition" w:semiHidden="1" w:unhideWhenUsed="1"/>
-    <w:lsdException w:name="HTML Keyboard" w:semiHidden="1" w:unhideWhenUsed="1"/>
-    <w:lsdException w:name="HTML Preformatted" w:semiHidden="1" w:unhideWhenUsed="1"/>
-    <w:lsdException w:name="HTML Sample" w:semiHidden="1" w:unhideWhenUsed="1"/>
-    <w:lsdException w:name="HTML Typewriter" w:semiHidden="1" w:unhideWhenUsed="1"/>
-    <w:lsdException w:name="HTML Variable" w:semiHidden="1" w:unhideWhenUsed="1"/>
-    <w:lsdException w:name="Normal Table" w:semiHidden="1" w:unhideWhenUsed="1"/>
-    <w:lsdException w:name="annotation subject" w:semiHidden="1" w:unhideWhenUsed="1"/>
-    <w:lsdException w:name="No List" w:semiHidden="1" w:unhideWhenUsed="1"/>
-    <w:lsdException w:name="Outline List 1" w:semiHidden="1" w:unhideWhenUsed="1"/>
-    <w:lsdException w:name="Outline List 2" w:semiHidden="1" w:unhideWhenUsed="1"/>
-    <w:lsdException w:name="Outline List 3" w:semiHidden="1" w:unhideWhenUsed="1"/>
-    <w:lsdException w:name="Table Simple 1" w:semiHidden="1" w:unhideWhenUsed="1"/>
-    <w:lsdException w:name="Table Simple 2" w:semiHidden="1" w:unhideWhenUsed="1"/>
-    <w:lsdException w:name="Table Simple 3" w:semiHidden="1" w:unhideWhenUsed="1"/>
-    <w:lsdException w:name="Table Classic 1" w:semiHidden="1" w:unhideWhenUsed="1"/>
-    <w:lsdException w:name="Table Classic 2" w:semiHidden="1" w:unhideWhenUsed="1"/>
-    <w:lsdException w:name="Table Classic 3" w:semiHidden="1" w:unhideWhenUsed="1"/>
-    <w:lsdException w:name="Table Classic 4" w:semiHidden="1" w:unhideWhenUsed="1"/>
-    <w:lsdException w:name="Table Colorful 1" w:semiHidden="1" w:unhideWhenUsed="1"/>
-    <w:lsdException w:name="Table Colorful 2" w:semiHidden="1" w:unhideWhenUsed="1"/>
-    <w:lsdException w:name="Table Colorful 3" w:semiHidden="1" w:unhideWhenUsed="1"/>
-    <w:lsdException w:name="Table Columns 1" w:semiHidden="1" w:unhideWhenUsed="1"/>
-    <w:lsdException w:name="Table Columns 2" w:semiHidden="1" w:unhideWhenUsed="1"/>
-    <w:lsdException w:name="Table Columns 3" w:semiHidden="1" w:unhideWhenUsed="1"/>
-    <w:lsdException w:name="Table Columns 4" w:semiHidden="1" w:unhideWhenUsed="1"/>
-    <w:lsdException w:name="Table Columns 5" w:semiHidden="1" w:unhideWhenUsed="1"/>
-    <w:lsdException w:name="Table Grid 1" w:semiHidden="1" w:unhideWhenUsed="1"/>
-    <w:lsdException w:name="Table Grid 2" w:semiHidden="1" w:unhideWhenUsed="1"/>
-    <w:lsdException w:name="Table Grid 3" w:semiHidden="1" w:unhideWhenUsed="1"/>
-    <w:lsdException w:name="Table Grid 4" w:semiHidden="1" w:unhideWhenUsed="1"/>
-    <w:lsdException w:name="Table Grid 5" w:semiHidden="1" w:unhideWhenUsed="1"/>
-    <w:lsdException w:name="Table Grid 6" w:semiHidden="1" w:unhideWhenUsed="1"/>
-    <w:lsdException w:name="Table Grid 7" w:semiHidden="1" w:unhideWhenUsed="1"/>
-    <w:lsdException w:name="Table Grid 8" w:semiHidden="1" w:unhideWhenUsed="1"/>
-    <w:lsdException w:name="Table List 1" w:semiHidden="1" w:unhideWhenUsed="1"/>
-    <w:lsdException w:name="Table List 2" w:semiHidden="1" w:unhideWhenUsed="1"/>
-    <w:lsdException w:name="Table List 3" w:semiHidden="1" w:unhideWhenUsed="1"/>
-    <w:lsdException w:name="Table List 4" w:semiHidden="1" w:unhideWhenUsed="1"/>
-    <w:lsdException w:name="Table List 5" w:semiHidden="1" w:unhideWhenUsed="1"/>
-    <w:lsdException w:name="Table List 6" w:semiHidden="1" w:unhideWhenUsed="1"/>
-    <w:lsdException w:name="Table List 7" w:semiHidden="1" w:unhideWhenUsed="1"/>
-    <w:lsdException w:name="Table List 8" w:semiHidden="1" w:unhideWhenUsed="1"/>
-    <w:lsdException w:name="Table 3D effects 1" w:semiHidden="1" w:unhideWhenUsed="1"/>
-    <w:lsdException w:name="Table 3D effects 2" w:semiHidden="1" w:unhideWhenUsed="1"/>
-    <w:lsdException w:name="Table 3D effects 3" w:semiHidden="1" w:unhideWhenUsed="1"/>
-    <w:lsdException w:name="Table Contemporary" w:semiHidden="1" w:unhideWhenUsed="1"/>
-    <w:lsdException w:name="Table Elegant" w:semiHidden="1" w:unhideWhenUsed="1"/>
-    <w:lsdException w:name="Table Professional" w:semiHidden="1" w:unhideWhenUsed="1"/>
-    <w:lsdException w:name="Table Subtle 1" w:semiHidden="1" w:unhideWhenUsed="1"/>
-    <w:lsdException w:name="Table Subtle 2" w:semiHidden="1" w:unhideWhenUsed="1"/>
-    <w:lsdException w:name="Table Web 1" w:semiHidden="1" w:unhideWhenUsed="1"/>
-    <w:lsdException w:name="Table Web 2" w:semiHidden="1" w:unhideWhenUsed="1"/>
-    <w:lsdException w:name="Table Web 3" w:semiHidden="1" w:unhideWhenUsed="1"/>
-    <w:lsdException w:name="Balloon Text" w:semiHidden="1" w:unhideWhenUsed="1"/>
-    <w:lsdException w:name="Table Grid" w:uiPriority="39"/>
-    <w:lsdException w:name="Table Theme" w:semiHidden="1" w:unhideWhenUsed="1"/>
-    <w:lsdException w:name="Placeholder Text" w:semiHidden="1"/>
-    <w:lsdException w:name="No Spacing" w:uiPriority="1" w:qFormat="1"/>
-    <w:lsdException w:name="Light Shading" w:uiPriority="60"/>
-    <w:lsdException w:name="Light List" w:uiPriority="61"/>
-    <w:lsdException w:name="Light Grid" w:uiPriority="62"/>
-    <w:lsdException w:name="Medium Shading 1" w:uiPriority="63"/>
-    <w:lsdException w:name="Medium Shading 2" w:uiPriority="64"/>
-    <w:lsdException w:name="Medium List 1" w:uiPriority="65"/>
-    <w:lsdException w:name="Medium List 2" w:uiPriority="66"/>
-    <w:lsdException w:name="Medium Grid 1" w:uiPriority="67"/>
-    <w:lsdException w:name="Medium Grid 2" w:uiPriority="68"/>
-    <w:lsdException w:name="Medium Grid 3" w:uiPriority="69"/>
-    <w:lsdException w:name="Dark List" w:uiPriority="70"/>
-    <w:lsdException w:name="Colorful Shading" w:uiPriority="71"/>
-    <w:lsdException w:name="Colorful List" w:uiPriority="72"/>
-    <w:lsdException w:name="Colorful Grid" w:uiPriority="73"/>
-    <w:lsdException w:name="Light Shading Accent 1" w:uiPriority="60"/>
-    <w:lsdException w:name="Light List Accent 1" w:uiPriority="61"/>
-    <w:lsdException w:name="Light Grid Accent 1" w:uiPriority="62"/>
-    <w:lsdException w:name="Medium Shading 1 Accent 1" w:uiPriority="63"/>
-    <w:lsdException w:name="Medium Shading 2 Accent 1" w:uiPriority="64"/>
-    <w:lsdException w:name="Medium List 1 Accent 1" w:uiPriority="65"/>
-    <w:lsdException w:name="Revision" w:semiHidden="1"/>
-    <w:lsdException w:name="List Paragraph" w:uiPriority="34" w:qFormat="1"/>
-    <w:lsdException w:name="Quote" w:uiPriority="29" w:qFormat="1"/>
-    <w:lsdException w:name="Intense Quote" w:uiPriority="30" w:qFormat="1"/>
-    <w:lsdException w:name="Medium List 2 Accent 1" w:uiPriority="66"/>
-    <w:lsdException w:name="Medium Grid 1 Accent 1" w:uiPriority="67"/>
-    <w:lsdException w:name="Medium Grid 2 Accent 1" w:uiPriority="68"/>
-    <w:lsdException w:name="Medium Grid 3 Accent 1" w:uiPriority="69"/>
-    <w:lsdException w:name="Dark List Accent 1" w:uiPriority="70"/>
-    <w:lsdException w:name="Colorful Shading Accent 1" w:uiPriority="71"/>
-    <w:lsdException w:name="Colorful List Accent 1" w:uiPriority="72"/>
-    <w:lsdException w:name="Colorful Grid Accent 1" w:uiPriority="73"/>
-    <w:lsdException w:name="Light Shading Accent 2" w:uiPriority="60"/>
-    <w:lsdException w:name="Light List Accent 2" w:uiPriority="61"/>
-    <w:lsdException w:name="Light Grid Accent 2" w:uiPriority="62"/>
-    <w:lsdException w:name="Medium Shading 1 Accent 2" w:uiPriority="63"/>
-    <w:lsdException w:name="Medium Shading 2 Accent 2" w:uiPriority="64"/>
-    <w:lsdException w:name="Medium List 1 Accent 2" w:uiPriority="65"/>
-    <w:lsdException w:name="Medium List 2 Accent 2" w:uiPriority="66"/>
-    <w:lsdException w:name="Medium Grid 1 Accent 2" w:uiPriority="67"/>
-    <w:lsdException w:name="Medium Grid 2 Accent 2" w:uiPriority="68"/>
-    <w:lsdException w:name="Medium Grid 3 Accent 2" w:uiPriority="69"/>
-    <w:lsdException w:name="Dark List Accent 2" w:uiPriority="70"/>
-    <w:lsdException w:name="Colorful Shading Accent 2" w:uiPriority="71"/>
-    <w:lsdException w:name="Colorful List Accent 2" w:uiPriority="72"/>
-    <w:lsdException w:name="Colorful Grid Accent 2" w:uiPriority="73"/>
-    <w:lsdException w:name="Light Shading Accent 3" w:uiPriority="60"/>
-    <w:lsdException w:name="Light List Accent 3" w:uiPriority="61"/>
-    <w:lsdException w:name="Light Grid Accent 3" w:uiPriority="62"/>
-    <w:lsdException w:name="Medium Shading 1 Accent 3" w:uiPriority="63"/>
-    <w:lsdException w:name="Medium Shading 2 Accent 3" w:uiPriority="64"/>
-    <w:lsdException w:name="Medium List 1 Accent 3" w:uiPriority="65"/>
-    <w:lsdException w:name="Medium List 2 Accent 3" w:uiPriority="66"/>
-    <w:lsdException w:name="Medium Grid 1 Accent 3" w:uiPriority="67"/>
-    <w:lsdException w:name="Medium Grid 2 Accent 3" w:uiPriority="68"/>
-    <w:lsdException w:name="Medium Grid 3 Accent 3" w:uiPriority="69"/>
-    <w:lsdException w:name="Dark List Accent 3" w:uiPriority="70"/>
-    <w:lsdException w:name="Colorful Shading Accent 3" w:uiPriority="71"/>
-    <w:lsdException w:name="Colorful List Accent 3" w:uiPriority="72"/>
-    <w:lsdException w:name="Colorful Grid Accent 3" w:uiPriority="73"/>
-    <w:lsdException w:name="Light Shading Accent 4" w:uiPriority="60"/>
-    <w:lsdException w:name="Light List Accent 4" w:uiPriority="61"/>
-    <w:lsdException w:name="Light Grid Accent 4" w:uiPriority="62"/>
-    <w:lsdException w:name="Medium Shading 1 Accent 4" w:uiPriority="63"/>
-    <w:lsdException w:name="Medium Shading 2 Accent 4" w:uiPriority="64"/>
-    <w:lsdException w:name="Medium List 1 Accent 4" w:uiPriority="65"/>
-    <w:lsdException w:name="Medium List 2 Accent 4" w:uiPriority="66"/>
-    <w:lsdException w:name="Medium Grid 1 Accent 4" w:uiPriority="67"/>
-    <w:lsdException w:name="Medium Grid 2 Accent 4" w:uiPriority="68"/>
-    <w:lsdException w:name="Medium Grid 3 Accent 4" w:uiPriority="69"/>
-    <w:lsdException w:name="Dark List Accent 4" w:uiPriority="70"/>
-    <w:lsdException w:name="Colorful Shading Accent 4" w:uiPriority="71"/>
-    <w:lsdException w:name="Colorful List Accent 4" w:uiPriority="72"/>
-    <w:lsdException w:name="Colorful Grid Accent 4" w:uiPriority="73"/>
-    <w:lsdException w:name="Light Shading Accent 5" w:uiPriority="60"/>
-    <w:lsdException w:name="Light List Accent 5" w:uiPriority="61"/>
-    <w:lsdException w:name="Light Grid Accent 5" w:uiPriority="62"/>
-    <w:lsdException w:name="Medium Shading 1 Accent 5" w:uiPriority="63"/>
-    <w:lsdException w:name="Medium Shading 2 Accent 5" w:uiPriority="64"/>
-    <w:lsdException w:name="Medium List 1 Accent 5" w:uiPriority="65"/>
-    <w:lsdException w:name="Medium List 2 Accent 5" w:uiPriority="66"/>
-    <w:lsdException w:name="Medium Grid 1 Accent 5" w:uiPriority="67"/>
-    <w:lsdException w:name="Medium Grid 2 Accent 5" w:uiPriority="68"/>
-    <w:lsdException w:name="Medium Grid 3 Accent 5" w:uiPriority="69"/>
-    <w:lsdException w:name="Dark List Accent 5" w:uiPriority="70"/>
-    <w:lsdException w:name="Colorful Shading Accent 5" w:uiPriority="71"/>
-    <w:lsdException w:name="Colorful List Accent 5" w:uiPriority="72"/>
-    <w:lsdException w:name="Colorful Grid Accent 5" w:uiPriority="73"/>
-    <w:lsdException w:name="Light Shading Accent 6" w:uiPriority="60"/>
-    <w:lsdException w:name="Light List Accent 6" w:uiPriority="61"/>
-    <w:lsdException w:name="Light Grid Accent 6" w:uiPriority="62"/>
-    <w:lsdException w:name="Medium Shading 1 Accent 6" w:uiPriority="63"/>
-    <w:lsdException w:name="Medium Shading 2 Accent 6" w:uiPriority="64"/>
-    <w:lsdException w:name="Medium List 1 Accent 6" w:uiPriority="65"/>
-    <w:lsdException w:name="Medium List 2 Accent 6" w:uiPriority="66"/>
-    <w:lsdException w:name="Medium Grid 1 Accent 6" w:uiPriority="67"/>
-    <w:lsdException w:name="Medium Grid 2 Accent 6" w:uiPriority="68"/>
-    <w:lsdException w:name="Medium Grid 3 Accent 6" w:uiPriority="69"/>
-    <w:lsdException w:name="Dark List Accent 6" w:uiPriority="70"/>
-    <w:lsdException w:name="Colorful Shading Accent 6" w:uiPriority="71"/>
-    <w:lsdException w:name="Colorful List Accent 6" w:uiPriority="72"/>
-    <w:lsdException w:name="Colorful Grid Accent 6" w:uiPriority="73"/>
-    <w:lsdException w:name="Subtle Emphasis" w:uiPriority="19" w:qFormat="1"/>
-    <w:lsdException w:name="Intense Emphasis" w:uiPriority="21" w:qFormat="1"/>
-    <w:lsdException w:name="Subtle Reference" w:uiPriority="31" w:qFormat="1"/>
-    <w:lsdException w:name="Intense Reference" w:uiPriority="32" w:qFormat="1"/>
-    <w:lsdException w:name="Book Title" w:uiPriority="33" w:qFormat="1"/>
-    <w:lsdException w:name="Bibliography" w:semiHidden="1" w:uiPriority="37" w:unhideWhenUsed="1"/>
-    <w:lsdException w:name="TOC Heading" w:semiHidden="1" w:uiPriority="39" w:unhideWhenUsed="1" w:qFormat="1"/>
-    <w:lsdException w:name="Plain Table 1" w:uiPriority="41"/>
-    <w:lsdException w:name="Plain Table 2" w:uiPriority="42"/>
-    <w:lsdException w:name="Plain Table 3" w:uiPriority="43"/>
-    <w:lsdException w:name="Plain Table 4" w:uiPriority="44"/>
-    <w:lsdException w:name="Plain Table 5" w:uiPriority="45"/>
-    <w:lsdException w:name="Grid Table Light" w:uiPriority="40"/>
-    <w:lsdException w:name="Grid Table 1 Light" w:uiPriority="46"/>
-    <w:lsdException w:name="Grid Table 2" w:uiPriority="47"/>
-    <w:lsdException w:name="Grid Table 3" w:uiPriority="48"/>
-    <w:lsdException w:name="Grid Table 4" w:uiPriority="49"/>
-    <w:lsdException w:name="Grid Table 5 Dark" w:uiPriority="50"/>
-    <w:lsdException w:name="Grid Table 6 Colorful" w:uiPriority="51"/>
-    <w:lsdException w:name="Grid Table 7 Colorful" w:uiPriority="52"/>
-    <w:lsdException w:name="Grid Table 1 Light Accent 1" w:uiPriority="46"/>
-    <w:lsdException w:name="Grid Table 2 Accent 1" w:uiPriority="47"/>
-    <w:lsdException w:name="Grid Table 3 Accent 1" w:uiPriority="48"/>
-    <w:lsdException w:name="Grid Table 4 Accent 1" w:uiPriority="49"/>
-    <w:lsdException w:name="Grid Table 5 Dark Accent 1" w:uiPriority="50"/>
-    <w:lsdException w:name="Grid Table 6 Colorful Accent 1" w:uiPriority="51"/>
-    <w:lsdException w:name="Grid Table 7 Colorful Accent 1" w:uiPriority="52"/>
-    <w:lsdException w:name="Grid Table 1 Light Accent 2" w:uiPriority="46"/>
-    <w:lsdException w:name="Grid Table 2 Accent 2" w:uiPriority="47"/>
-    <w:lsdException w:name="Grid Table 3 Accent 2" w:uiPriority="48"/>
-    <w:lsdException w:name="Grid Table 4 Accent 2" w:uiPriority="49"/>
-    <w:lsdException w:name="Grid Table 5 Dark Accent 2" w:uiPriority="50"/>
-    <w:lsdException w:name="Grid Table 6 Colorful Accent 2" w:uiPriority="51"/>
-    <w:lsdException w:name="Grid Table 7 Colorful Accent 2" w:uiPriority="52"/>
-    <w:lsdException w:name="Grid Table 1 Light Accent 3" w:uiPriority="46"/>
-    <w:lsdException w:name="Grid Table 2 Accent 3" w:uiPriority="47"/>
-    <w:lsdException w:name="Grid Table 3 Accent 3" w:uiPriority="48"/>
-    <w:lsdException w:name="Grid Table 4 Accent 3" w:uiPriority="49"/>
-    <w:lsdException w:name="Grid Table 5 Dark Accent 3" w:uiPriority="50"/>
-    <w:lsdException w:name="Grid Table 6 Colorful Accent 3" w:uiPriority="51"/>
-    <w:lsdException w:name="Grid Table 7 Colorful Accent 3" w:uiPriority="52"/>
-    <w:lsdException w:name="Grid Table 1 Light Accent 4" w:uiPriority="46"/>
-    <w:lsdException w:name="Grid Table 2 Accent 4" w:uiPriority="47"/>
-    <w:lsdException w:name="Grid Table 3 Accent 4" w:uiPriority="48"/>
-    <w:lsdException w:name="Grid Table 4 Accent 4" w:uiPriority="49"/>
-    <w:lsdException w:name="Grid Table 5 Dark Accent 4" w:uiPriority="50"/>
-    <w:lsdException w:name="Grid Table 6 Colorful Accent 4" w:uiPriority="51"/>
-    <w:lsdException w:name="Grid Table 7 Colorful Accent 4" w:uiPriority="52"/>
-    <w:lsdException w:name="Grid Table 1 Light Accent 5" w:uiPriority="46"/>
-    <w:lsdException w:name="Grid Table 2 Accent 5" w:uiPriority="47"/>
-    <w:lsdException w:name="Grid Table 3 Accent 5" w:uiPriority="48"/>
-    <w:lsdException w:name="Grid Table 4 Accent 5" w:uiPriority="49"/>
-    <w:lsdException w:name="Grid Table 5 Dark Accent 5" w:uiPriority="50"/>
-    <w:lsdException w:name="Grid Table 6 Colorful Accent 5" w:uiPriority="51"/>
-    <w:lsdException w:name="Grid Table 7 Colorful Accent 5" w:uiPriority="52"/>
-    <w:lsdException w:name="Grid Table 1 Light Accent 6" w:uiPriority="46"/>
-    <w:lsdException w:name="Grid Table 2 Accent 6" w:uiPriority="47"/>
-    <w:lsdException w:name="Grid Table 3 Accent 6" w:uiPriority="48"/>
-    <w:lsdException w:name="Grid Table 4 Accent 6" w:uiPriority="49"/>
-    <w:lsdException w:name="Grid Table 5 Dark Accent 6" w:uiPriority="50"/>
-    <w:lsdException w:name="Grid Table 6 Colorful Accent 6" w:uiPriority="51"/>
-    <w:lsdException w:name="Grid Table 7 Colorful Accent 6" w:uiPriority="52"/>
-    <w:lsdException w:name="List Table 1 Light" w:uiPriority="46"/>
-    <w:lsdException w:name="List Table 2" w:uiPriority="47"/>
-    <w:lsdException w:name="List Table 3" w:uiPriority="48"/>
-    <w:lsdException w:name="List Table 4" w:uiPriority="49"/>
-    <w:lsdException w:name="List Table 5 Dark" w:uiPriority="50"/>
-    <w:lsdException w:name="List Table 6 Colorful" w:uiPriority="51"/>
-    <w:lsdException w:name="List Table 7 Colorful" w:uiPriority="52"/>
-    <w:lsdException w:name="List Table 1 Light Accent 1" w:uiPriority="46"/>
-    <w:lsdException w:name="List Table 2 Accent 1" w:uiPriority="47"/>
-    <w:lsdException w:name="List Table 3 Accent 1" w:uiPriority="48"/>
-    <w:lsdException w:name="List Table 4 Accent 1" w:uiPriority="49"/>
-    <w:lsdException w:name="List Table 5 Dark Accent 1" w:uiPriority="50"/>
-    <w:lsdException w:name="List Table 6 Colorful Accent 1" w:uiPriority="51"/>
-    <w:lsdException w:name="List Table 7 Colorful Accent 1" w:uiPriority="52"/>
-    <w:lsdException w:name="List Table 1 Light Accent 2" w:uiPriority="46"/>
-    <w:lsdException w:name="List Table 2 Accent 2" w:uiPriority="47"/>
-    <w:lsdException w:name="List Table 3 Accent 2" w:uiPriority="48"/>
-    <w:lsdException w:name="List Table 4 Accent 2" w:uiPriority="49"/>
-    <w:lsdException w:name="List Table 5 Dark Accent 2" w:uiPriority="50"/>
-    <w:lsdException w:name="List Table 6 Colorful Accent 2" w:uiPriority="51"/>
-    <w:lsdException w:name="List Table 7 Colorful Accent 2" w:uiPriority="52"/>
-    <w:lsdException w:name="List Table 1 Light Accent 3" w:uiPriority="46"/>
-    <w:lsdException w:name="List Table 2 Accent 3" w:uiPriority="47"/>
-    <w:lsdException w:name="List Table 3 Accent 3" w:uiPriority="48"/>
-    <w:lsdException w:name="List Table 4 Accent 3" w:uiPriority="49"/>
-    <w:lsdException w:name="List Table 5 Dark Accent 3" w:uiPriority="50"/>
-    <w:lsdException w:name="List Table 6 Colorful Accent 3" w:uiPriority="51"/>
-    <w:lsdException w:name="List Table 7 Colorful Accent 3" w:uiPriority="52"/>
-    <w:lsdException w:name="List Table 1 Light Accent 4" w:uiPriority="46"/>
-    <w:lsdException w:name="List Table 2 Accent 4" w:uiPriority="47"/>
-    <w:lsdException w:name="List Table 3 Accent 4" w:uiPriority="48"/>
-    <w:lsdException w:name="List Table 4 Accent 4" w:uiPriority="49"/>
-    <w:lsdException w:name="List Table 5 Dark Accent 4" w:uiPriority="50"/>
-    <w:lsdException w:name="List Table 6 Colorful Accent 4" w:uiPriority="51"/>
-    <w:lsdException w:name="List Table 7 Colorful Accent 4" w:uiPriority="52"/>
-    <w:lsdException w:name="List Table 1 Light Accent 5" w:uiPriority="46"/>
-    <w:lsdException w:name="List Table 2 Accent 5" w:uiPriority="47"/>
-    <w:lsdException w:name="List Table 3 Accent 5" w:uiPriority="48"/>
-    <w:lsdException w:name="List Table 4 Accent 5" w:uiPriority="49"/>
-    <w:lsdException w:name="List Table 5 Dark Accent 5" w:uiPriority="50"/>
-    <w:lsdException w:name="List Table 6 Colorful Accent 5" w:uiPriority="51"/>
-    <w:lsdException w:name="List Table 7 Colorful Accent 5" w:uiPriority="52"/>
-    <w:lsdException w:name="List Table 1 Light Accent 6" w:uiPriority="46"/>
-    <w:lsdException w:name="List Table 2 Accent 6" w:uiPriority="47"/>
-    <w:lsdException w:name="List Table 3 Accent 6" w:uiPriority="48"/>
-    <w:lsdException w:name="List Table 4 Accent 6" w:uiPriority="49"/>
-    <w:lsdException w:name="List Table 5 Dark Accent 6" w:uiPriority="50"/>
-    <w:lsdException w:name="List Table 6 Colorful Accent 6" w:uiPriority="51"/>
-    <w:lsdException w:name="List Table 7 Colorful Accent 6" w:uiPriority="52"/>
-    <w:lsdException w:name="Mention" w:semiHidden="1" w:unhideWhenUsed="1"/>
-    <w:lsdException w:name="Smart Hyperlink" w:semiHidden="1" w:unhideWhenUsed="1"/>
-    <w:lsdException w:name="Hashtag" w:semiHidden="1" w:unhideWhenUsed="1"/>
-    <w:lsdException w:name="Unresolved Mention" w:semiHidden="1" w:unhideWhenUsed="1"/>
-    <w:lsdException w:name="Smart Link" w:semiHidden="1" w:unhideWhenUsed="1"/>
-  </w:latentStyles>
-  <w:style w:type="paragraph" w:default="1" w:styleId="Normal">
-    <w:name w:val="Normal"/>
-    <w:qFormat/>
-  </w:style>
-  <w:style w:type="character" w:default="1" w:styleId="DefaultParagraphFont">
-    <w:name w:val="Default Paragraph Font"/>
-    <w:uiPriority w:val="1"/>
-    <w:semiHidden/>
-    <w:unhideWhenUsed/>
-  </w:style>
-  <w:style w:type="table" w:default="1" w:styleId="TableNormal">
-    <w:name w:val="Normal Table"/>
-    <w:uiPriority w:val="99"/>
-    <w:semiHidden/>
-    <w:unhideWhenUsed/>
-    <w:tblPr>
-      <w:tblInd w:w="0" w:type="dxa"/>
-      <w:tblCellMar>
-        <w:top w:w="0" w:type="dxa"/>
-        <w:left w:w="108" w:type="dxa"/>
-        <w:bottom w:w="0" w:type="dxa"/>
-        <w:right w:w="108" w:type="dxa"/>
-      </w:tblCellMar>
-    </w:tblPr>
-  </w:style>
-  <w:style w:type="numbering" w:default="1" w:styleId="NoList">
-    <w:name w:val="No List"/>
-    <w:uiPriority w:val="99"/>
-    <w:semiHidden/>
-    <w:unhideWhenUsed/>
-  </w:style>
-  <w:style w:type="paragraph" w:customStyle="1" w:styleId="6BFC0E5D3F784EA7A0AEE6F14093CB6A">
-    <w:name w:val="6BFC0E5D3F784EA7A0AEE6F14093CB6A"/>
-  </w:style>
-  <w:style w:type="character" w:styleId="PlaceholderText">
-    <w:name w:val="Placeholder Text"/>
-    <w:basedOn w:val="DefaultParagraphFont"/>
-    <w:uiPriority w:val="99"/>
-    <w:semiHidden/>
-    <w:rsid w:val="00F83112"/>
-    <w:rPr>
-      <w:color w:val="666666"/>
-    </w:rPr>
-  </w:style>
-  <w:style w:type="paragraph" w:customStyle="1" w:styleId="97A83DCF22534C25925D96CDE71E90CD">
-    <w:name w:val="97A83DCF22534C25925D96CDE71E90CD"/>
-  </w:style>
-  <w:style w:type="paragraph" w:customStyle="1" w:styleId="0C12B501ADC84B2CBE729D1B03AD6886">
-    <w:name w:val="0C12B501ADC84B2CBE729D1B03AD6886"/>
-  </w:style>
-  <w:style w:type="paragraph" w:customStyle="1" w:styleId="15923EC6DCF3425CBAFEECD4B0109C8F">
-    <w:name w:val="15923EC6DCF3425CBAFEECD4B0109C8F"/>
-  </w:style>
-  <w:style w:type="paragraph" w:customStyle="1" w:styleId="9F57DC5BA44F424E9202C8CE0D2AD4AE">
-    <w:name w:val="9F57DC5BA44F424E9202C8CE0D2AD4AE"/>
-  </w:style>
-  <w:style w:type="paragraph" w:customStyle="1" w:styleId="70E66792999E48A18806376CFCDEB583">
-    <w:name w:val="70E66792999E48A18806376CFCDEB583"/>
-  </w:style>
-  <w:style w:type="paragraph" w:customStyle="1" w:styleId="56AD82DAA61D4EE0B43CD6916F613CBE">
-    <w:name w:val="56AD82DAA61D4EE0B43CD6916F613CBE"/>
-  </w:style>
-  <w:style w:type="paragraph" w:customStyle="1" w:styleId="9B92549DB46843D99BBCC96D6B9F5D71">
-    <w:name w:val="9B92549DB46843D99BBCC96D6B9F5D71"/>
-  </w:style>
-  <w:style w:type="paragraph" w:customStyle="1" w:styleId="73BACE7A1C7A499B9E1C1AD064AA36A6">
-    <w:name w:val="73BACE7A1C7A499B9E1C1AD064AA36A6"/>
-  </w:style>
-  <w:style w:type="paragraph" w:customStyle="1" w:styleId="3D2228EF81D84CE9860BB60DABF3FC82">
-    <w:name w:val="3D2228EF81D84CE9860BB60DABF3FC82"/>
-  </w:style>
-  <w:style w:type="paragraph" w:customStyle="1" w:styleId="EB0B366037B648F78544F3D4CEBA5078">
-    <w:name w:val="EB0B366037B648F78544F3D4CEBA5078"/>
-  </w:style>
-  <w:style w:type="paragraph" w:customStyle="1" w:styleId="E98AFC9D76094B639D1832E5DC066B4E">
-    <w:name w:val="E98AFC9D76094B639D1832E5DC066B4E"/>
-  </w:style>
-  <w:style w:type="paragraph" w:customStyle="1" w:styleId="39FDE21B46AC479E9AF9FA228A7F7671">
-    <w:name w:val="39FDE21B46AC479E9AF9FA228A7F7671"/>
-  </w:style>
-  <w:style w:type="paragraph" w:customStyle="1" w:styleId="168D62FA5824443EA8D858C71DFF656E">
-    <w:name w:val="168D62FA5824443EA8D858C71DFF656E"/>
-  </w:style>
-  <w:style w:type="paragraph" w:customStyle="1" w:styleId="6CCBDECDE4AA43DE993C927AE12D6930">
-    <w:name w:val="6CCBDECDE4AA43DE993C927AE12D6930"/>
-  </w:style>
-  <w:style w:type="paragraph" w:customStyle="1" w:styleId="64CBF9C822FE4FB09607C7B94A2C87AC">
-    <w:name w:val="64CBF9C822FE4FB09607C7B94A2C87AC"/>
-  </w:style>
-  <w:style w:type="paragraph" w:customStyle="1" w:styleId="A5A8F5D2E17A4024805CB879719DF18E">
-    <w:name w:val="A5A8F5D2E17A4024805CB879719DF18E"/>
-  </w:style>
-  <w:style w:type="paragraph" w:customStyle="1" w:styleId="AFCE277D126A43699B4DCA896AE90BE4">
-    <w:name w:val="AFCE277D126A43699B4DCA896AE90BE4"/>
-  </w:style>
-  <w:style w:type="paragraph" w:customStyle="1" w:styleId="A526C17CCD204E03AD3492B139ED0E58">
-    <w:name w:val="A526C17CCD204E03AD3492B139ED0E58"/>
-  </w:style>
-  <w:style w:type="paragraph" w:customStyle="1" w:styleId="DEC0063215F64A2A947C2EE0BCD27395">
-    <w:name w:val="DEC0063215F64A2A947C2EE0BCD27395"/>
-  </w:style>
-  <w:style w:type="paragraph" w:customStyle="1" w:styleId="A8A84F1DD1054D7CB17FD0549BB10B22">
-    <w:name w:val="A8A84F1DD1054D7CB17FD0549BB10B22"/>
-    <w:rsid w:val="00AA277A"/>
-  </w:style>
-  <w:style w:type="paragraph" w:customStyle="1" w:styleId="CED8BCD108DD400AB3CC48170E5B2C22">
-    <w:name w:val="CED8BCD108DD400AB3CC48170E5B2C22"/>
-    <w:rsid w:val="00AA277A"/>
-  </w:style>
-  <w:style w:type="paragraph" w:customStyle="1" w:styleId="7093B0C3292A4C268AB6180755301547">
-    <w:name w:val="7093B0C3292A4C268AB6180755301547"/>
-    <w:rsid w:val="00AA277A"/>
-  </w:style>
-  <w:style w:type="paragraph" w:customStyle="1" w:styleId="5ABF7DB96A41425AB00C7D74E9E7F523">
-    <w:name w:val="5ABF7DB96A41425AB00C7D74E9E7F523"/>
-    <w:rsid w:val="00AA277A"/>
-  </w:style>
-  <w:style w:type="paragraph" w:customStyle="1" w:styleId="A08C21E212D24DFBA5A5CD5A98B27E8F">
-    <w:name w:val="A08C21E212D24DFBA5A5CD5A98B27E8F"/>
-    <w:rsid w:val="00AA277A"/>
-  </w:style>
-  <w:style w:type="paragraph" w:customStyle="1" w:styleId="3217433250DA4D0B9A1B5F4B40692D47">
-    <w:name w:val="3217433250DA4D0B9A1B5F4B40692D47"/>
-    <w:rsid w:val="00AA277A"/>
-  </w:style>
-  <w:style w:type="paragraph" w:customStyle="1" w:styleId="C6C31ABA008440A7B58F20F7A7FC4919">
-    <w:name w:val="C6C31ABA008440A7B58F20F7A7FC4919"/>
-    <w:rsid w:val="00AA277A"/>
-  </w:style>
-  <w:style w:type="paragraph" w:customStyle="1" w:styleId="5CDCC436BBAF400CA921FA0C680B3CF1">
-    <w:name w:val="5CDCC436BBAF400CA921FA0C680B3CF1"/>
-    <w:rsid w:val="00AA277A"/>
-  </w:style>
-  <w:style w:type="paragraph" w:customStyle="1" w:styleId="Titulektabulky">
-    <w:name w:val="Titulek tabulky"/>
-    <w:basedOn w:val="Caption"/>
-    <w:next w:val="Normal"/>
-    <w:qFormat/>
-    <w:rsid w:val="00AA277A"/>
-    <w:pPr>
-      <w:keepNext/>
-      <w:spacing w:before="240" w:after="120"/>
-    </w:pPr>
-    <w:rPr>
-      <w:b w:val="0"/>
-      <w:bCs w:val="0"/>
-      <w:i/>
-      <w:iCs/>
-    </w:rPr>
-  </w:style>
-  <w:style w:type="paragraph" w:styleId="Caption">
-    <w:name w:val="caption"/>
-    <w:basedOn w:val="Normal"/>
-    <w:next w:val="Normal"/>
-    <w:uiPriority w:val="35"/>
-    <w:qFormat/>
-    <w:rsid w:val="00AA277A"/>
-    <w:pPr>
-      <w:suppressLineNumbers/>
-      <w:spacing w:before="120" w:after="240" w:line="260" w:lineRule="atLeast"/>
-    </w:pPr>
-    <w:rPr>
-      <w:rFonts w:ascii="Arial" w:eastAsia="Times New Roman" w:hAnsi="Arial" w:cs="Times New Roman"/>
-      <w:b/>
-      <w:bCs/>
-      <w:kern w:val="0"/>
-      <w:sz w:val="18"/>
-      <w:szCs w:val="20"/>
-      <w:lang w:eastAsia="sk-SK"/>
-      <w14:ligatures w14:val="none"/>
-    </w:rPr>
-  </w:style>
-  <w:style w:type="paragraph" w:customStyle="1" w:styleId="Rovnice">
-    <w:name w:val="Rovnice"/>
-    <w:basedOn w:val="Normal"/>
-    <w:next w:val="Normal"/>
-    <w:qFormat/>
-    <w:rsid w:val="00F83112"/>
-    <w:pPr>
-      <w:framePr w:hSpace="11340" w:vSpace="240" w:wrap="around" w:vAnchor="text" w:hAnchor="text" w:xAlign="center" w:y="1"/>
-      <w:suppressLineNumbers/>
-      <w:suppressAutoHyphens/>
-      <w:spacing w:after="0" w:line="240" w:lineRule="auto"/>
-      <w:suppressOverlap/>
-    </w:pPr>
-    <w:rPr>
-      <w:rFonts w:ascii="Cambria Math" w:eastAsiaTheme="minorHAnsi" w:hAnsi="Cambria Math"/>
-      <w:i/>
-      <w:szCs w:val="22"/>
-      <w:lang w:eastAsia="en-US"/>
-    </w:rPr>
-  </w:style>
-  <w:style w:type="paragraph" w:customStyle="1" w:styleId="Rovnicetitulek">
-    <w:name w:val="Rovnice titulek"/>
-    <w:basedOn w:val="Caption"/>
-    <w:qFormat/>
-    <w:rsid w:val="00F83112"/>
-    <w:pPr>
-      <w:framePr w:hSpace="11340" w:vSpace="240" w:wrap="around" w:vAnchor="text" w:hAnchor="text" w:xAlign="center" w:y="1"/>
-      <w:suppressOverlap/>
-      <w:jc w:val="right"/>
-    </w:pPr>
-    <w:rPr>
-      <w:b w:val="0"/>
-    </w:rPr>
-  </w:style>
-  <w:style w:type="table" w:customStyle="1" w:styleId="Tabulkarovnice">
-    <w:name w:val="Tabulka rovnice"/>
-    <w:basedOn w:val="TableNormal"/>
-    <w:uiPriority w:val="99"/>
-    <w:rsid w:val="00F83112"/>
-    <w:pPr>
-      <w:spacing w:after="0" w:line="240" w:lineRule="auto"/>
-    </w:pPr>
-    <w:rPr>
-      <w:rFonts w:ascii="Cambria Math" w:eastAsiaTheme="minorHAnsi" w:hAnsi="Cambria Math"/>
-      <w:szCs w:val="22"/>
-      <w:lang w:eastAsia="en-US"/>
-    </w:rPr>
-    <w:tblPr/>
-  </w:style>
-  <w:style w:type="paragraph" w:customStyle="1" w:styleId="Obrzek">
-    <w:name w:val="Obrázek"/>
-    <w:basedOn w:val="Normal"/>
-    <w:qFormat/>
-    <w:rsid w:val="00F83112"/>
-    <w:pPr>
-      <w:keepNext/>
-      <w:suppressLineNumbers/>
-      <w:spacing w:before="240" w:after="0" w:line="300" w:lineRule="atLeast"/>
-      <w:jc w:val="center"/>
-    </w:pPr>
-    <w:rPr>
-      <w:rFonts w:ascii="Times New Roman" w:eastAsia="Times New Roman" w:hAnsi="Times New Roman" w:cs="Times New Roman"/>
-      <w:kern w:val="0"/>
-      <w14:ligatures w14:val="none"/>
-    </w:rPr>
-  </w:style>
-  <w:style w:type="paragraph" w:customStyle="1" w:styleId="Zdrojobrzkutabulky">
-    <w:name w:val="Zdroj obrázku/tabulky"/>
-    <w:basedOn w:val="Normal"/>
-    <w:next w:val="Normal"/>
-    <w:qFormat/>
-    <w:rsid w:val="00F83112"/>
-    <w:pPr>
-      <w:keepLines/>
-      <w:suppressLineNumbers/>
-      <w:suppressAutoHyphens/>
-      <w:spacing w:after="240" w:line="260" w:lineRule="atLeast"/>
-    </w:pPr>
-    <w:rPr>
-      <w:rFonts w:ascii="Arial" w:eastAsia="Times New Roman" w:hAnsi="Arial" w:cs="Times New Roman"/>
-      <w:i/>
-      <w:kern w:val="0"/>
-      <w:sz w:val="18"/>
-      <w:szCs w:val="20"/>
-      <w:lang w:eastAsia="sk-SK"/>
-      <w14:ligatures w14:val="none"/>
-    </w:rPr>
-  </w:style>
-  <w:style w:type="paragraph" w:customStyle="1" w:styleId="Titulekobrzkusezdrojem">
-    <w:name w:val="Titulek obrázku (se zdrojem)"/>
-    <w:basedOn w:val="Caption"/>
-    <w:next w:val="Zdrojobrzkutabulky"/>
-    <w:qFormat/>
-    <w:rsid w:val="00F83112"/>
-    <w:pPr>
-      <w:keepNext/>
-      <w:suppressAutoHyphens/>
-      <w:spacing w:after="0"/>
-    </w:pPr>
-  </w:style>
-</w:styles>
-</file>
-
-<file path=word/glossary/webSettings.xml><?xml version="1.0" encoding="utf-8"?>
-<w:webSettings xmlns:mc="http://schemas.openxmlformats.org/markup-compatibility/2006" xmlns:r="http://schemas.openxmlformats.org/officeDocument/2006/relationships" xmlns:w="http://schemas.openxmlformats.org/wordprocessingml/2006/main" xmlns:w14="http://schemas.microsoft.com/office/word/2010/wordml" xmlns:w15="http://schemas.microsoft.com/office/word/2012/wordml" xmlns:w16cex="http://schemas.microsoft.com/office/word/2018/wordml/cex" xmlns:w16cid="http://schemas.microsoft.com/office/word/2016/wordml/cid" xmlns:w16="http://schemas.microsoft.com/office/word/2018/wordml" xmlns:w16du="http://schemas.microsoft.com/office/word/2023/wordml/word16du" xmlns:w16sdtdh="http://schemas.microsoft.com/office/word/2020/wordml/sdtdatahash" xmlns:w16sdtfl="http://schemas.microsoft.com/office/word/2024/wordml/sdtformatlock" xmlns:w16se="http://schemas.microsoft.com/office/word/2015/wordml/symex" mc:Ignorable="w14 w15 w16se w16cid w16 w16cex w16sdtdh w16sdtfl w16du">
-  <w:optimizeForBrowser/>
-  <w:allowPNG/>
-</w:webSettings>
-</file>
-
 <file path=word/theme/theme1.xml><?xml version="1.0" encoding="utf-8"?>
 <a:theme xmlns:a="http://schemas.openxmlformats.org/drawingml/2006/main" name="Motiv Office">
   <a:themeElements>

</xml_diff>